<commit_message>
Paper: write the Methodology section
Eight subsections (source data and independence audit, corpus
construction, quality gates, evaluation conditions, fine-tuning and
zero-shot evaluation, failure diagnostics, aggregation, reproducibility),
two tables and four equations, every figure taken from the repo's
reports and configs. Adds references [21] IndicTrans2 and [22] LaBSE.
</commit_message>
<xml_diff>
--- a/docs/Cross-Linguistic Transfer Diagnostics for Low-Resource Financial NLP in Indic Languages.docx
+++ b/docs/Cross-Linguistic Transfer Diagnostics for Low-Resource Financial NLP in Indic Languages.docx
@@ -2289,16 +2289,3148 @@
     </w:p>
     <w:p>
       <w:pPr>
+        <w:pStyle w:val="676"/>
+        <w:pBdr/>
+        <w:spacing/>
+        <w:ind w:left="0" w:firstLine="288"/>
+        <w:jc w:val="both"/>
+        <w:rPr/>
+      </w:pPr>
+      <w:r>
+        <w:rPr>
+          <w:rFonts w:ascii="Times New Roman" w:hAnsi="Times New Roman" w:eastAsia="Times New Roman" w:cs="Times New Roman"/>
+          <w:sz w:val="24"/>
+          <w:szCs w:val="24"/>
+        </w:rPr>
+        <w:t xml:space="preserve">The method has three parts, each feeding the next: construction of a four-way parallel corpus whose translation quality is measured rather than assumed; zero-shot transfer evaluation under a condition matrix fixed in advance; and attribution of every transfer failure to a single cause, followed by aggregation of those causes. Two rules hold throughout. No row is ever removed: low similarity, empty output and detected corruption are recorded as flags on the row, so translation failure remains a reported quantity rather than a silent filter. And every translation, training and scoring step takes an explicit seed and logs a hash of the configuration that produced it.</w:t>
+      </w:r>
+    </w:p>
+    <w:p>
+      <w:pPr>
         <w:pStyle w:val="681"/>
-        <w:pBdr/>
-        <w:spacing/>
-        <w:ind w:left="720"/>
+        <w:numPr>
+          <w:ilvl w:val="0"/>
+          <w:numId w:val="7"/>
+        </w:numPr>
+        <w:pBdr/>
+        <w:spacing/>
+        <w:ind/>
         <w:jc w:val="left"/>
         <w:rPr/>
       </w:pPr>
-      <w:r/>
-      <w:r/>
-      <w:r/>
+      <w:r>
+        <w:rPr>
+          <w:rFonts w:ascii="Times New Roman" w:hAnsi="Times New Roman" w:eastAsia="Times New Roman" w:cs="Times New Roman"/>
+          <w:sz w:val="24"/>
+          <w:szCs w:val="24"/>
+        </w:rPr>
+        <w:t xml:space="preserve">Source Data and Independence Audit</w:t>
+      </w:r>
+    </w:p>
+    <w:p>
+      <w:pPr>
+        <w:pStyle w:val="676"/>
+        <w:pBdr/>
+        <w:spacing/>
+        <w:ind w:left="0" w:firstLine="288"/>
+        <w:jc w:val="both"/>
+        <w:rPr/>
+      </w:pPr>
+      <w:r>
+        <w:rPr>
+          <w:rFonts w:ascii="Times New Roman" w:hAnsi="Times New Roman" w:eastAsia="Times New Roman" w:cs="Times New Roman"/>
+          <w:sz w:val="24"/>
+          <w:szCs w:val="24"/>
+        </w:rPr>
+        <w:t xml:space="preserve">We start from IndicFinNLP [1], which supplies three tasks natively in Hindi, Bengali and Telugu: numeral-span annotation in financial text (task 1), binary sustainability classification (task 2) and 10-class ESG-theme classification of news headlines (task 3). Row counts are given in Table I. The upstream files are kept byte-for-byte with SHA-256 checksums and are read once into Parquet.</w:t>
+      </w:r>
+    </w:p>
+    <w:p>
+      <w:pPr>
+        <w:pStyle w:val="676"/>
+        <w:pBdr/>
+        <w:spacing/>
+        <w:ind w:left="0" w:firstLine="288"/>
+        <w:jc w:val="both"/>
+        <w:rPr/>
+      </w:pPr>
+      <w:r>
+        <w:rPr>
+          <w:rFonts w:ascii="Times New Roman" w:hAnsi="Times New Roman" w:eastAsia="Times New Roman" w:cs="Times New Roman"/>
+          <w:sz w:val="24"/>
+          <w:szCs w:val="24"/>
+        </w:rPr>
+        <w:t xml:space="preserve">A controlled comparison requires knowing whether the three language splits hold different content or the same content. We test this before translating anything, using LaBSE [22] sentence embeddings and three tests: a structural comparison of row counts and class proportions; the cosine similarity of row-aligned pairs against an index-shuffled control, which detects parallel data that kept its row order; and, for 200 sampled source sentences, the maximum cosine over the entire target split, which still detects parallel data after shuffling or partial row loss. Because the last score is hard to interpret within one narrow domain, it is calibrated against a positive control (a split known to be parallel) and negative controls (different content in the same domain and language pair).</w:t>
+      </w:r>
+    </w:p>
+    <w:p>
+      <w:pPr>
+        <w:pStyle w:val="676"/>
+        <w:pBdr/>
+        <w:spacing/>
+        <w:ind w:left="0" w:firstLine="288"/>
+        <w:jc w:val="both"/>
+        <w:rPr/>
+      </w:pPr>
+      <w:r>
+        <w:rPr>
+          <w:rFonts w:ascii="Times New Roman" w:hAnsi="Times New Roman" w:eastAsia="Times New Roman" w:cs="Times New Roman"/>
+          <w:sz w:val="24"/>
+          <w:szCs w:val="24"/>
+        </w:rPr>
+        <w:t xml:space="preserve">The audit divides the tasks in two. Task 1's splits are independently sourced: their median nearest-neighbour similarity is 0.58–0.64, inside the negative-control band. Tasks 2 and 3 contain the same items in every language. For task 2, 88.5–93.5% of sampled sentences have a cross-language match at or above τ = 0.82, and for task 3 a shared URL column proves it outright. For these two tasks we therefore recover the item correspondence explicitly: task 3 by an exact URL join (532 of 532 items in all three languages), and task 2 by mutual nearest-neighbour matching on LaBSE above τ, kept only when the match is consistent across all three language pairs (1,769 items). Every aligned item carries the same gold label in all three languages. Task-2 rows that do not align stay in their splits with an </w:t>
+      </w:r>
+      <w:r>
+        <w:rPr>
+          <w:rFonts w:ascii="Times New Roman" w:hAnsi="Times New Roman" w:eastAsia="Times New Roman" w:cs="Times New Roman"/>
+          <w:i/>
+          <w:sz w:val="24"/>
+          <w:szCs w:val="24"/>
+        </w:rPr>
+        <w:t xml:space="preserve">unaligned</w:t>
+      </w:r>
+      <w:r>
+        <w:rPr>
+          <w:rFonts w:ascii="Times New Roman" w:hAnsi="Times New Roman" w:eastAsia="Times New Roman" w:cs="Times New Roman"/>
+          <w:sz w:val="24"/>
+          <w:szCs w:val="24"/>
+        </w:rPr>
+        <w:t xml:space="preserve"> flag. Item identifiers are derived from content rather than row position, so a reordering upstream cannot silently re-point an identifier at a different item; in task 1 an item is a (sentence, numeral span) pair.</w:t>
+      </w:r>
+    </w:p>
+    <w:p>
+      <w:pPr>
+        <w:pStyle w:val="681"/>
+        <w:numPr>
+          <w:ilvl w:val="0"/>
+          <w:numId w:val="7"/>
+        </w:numPr>
+        <w:pBdr/>
+        <w:spacing/>
+        <w:ind/>
+        <w:jc w:val="left"/>
+        <w:rPr/>
+      </w:pPr>
+      <w:r>
+        <w:rPr>
+          <w:rFonts w:ascii="Times New Roman" w:hAnsi="Times New Roman" w:eastAsia="Times New Roman" w:cs="Times New Roman"/>
+          <w:sz w:val="24"/>
+          <w:szCs w:val="24"/>
+        </w:rPr>
+        <w:t xml:space="preserve">Parallel Corpus Construction</w:t>
+      </w:r>
+    </w:p>
+    <w:p>
+      <w:pPr>
+        <w:pStyle w:val="676"/>
+        <w:pBdr/>
+        <w:spacing/>
+        <w:ind w:left="0" w:firstLine="288"/>
+        <w:jc w:val="both"/>
+        <w:rPr/>
+      </w:pPr>
+      <w:r>
+        <w:rPr>
+          <w:rFonts w:ascii="Times New Roman" w:hAnsi="Times New Roman" w:eastAsia="Times New Roman" w:cs="Times New Roman"/>
+          <w:sz w:val="24"/>
+          <w:szCs w:val="24"/>
+        </w:rPr>
+        <w:t xml:space="preserve">Each task is built as three blocks, one per native language. Within a block, the native split is translated into the other three of Hindi, Bengali, Telugu and Malayalam, giving nine translation directions and twelve splits per task that share item identifiers and gold labels (Table I). IndicFinNLP has no Malayalam data, so Malayalam exists only as machine translation, once per block.</w:t>
+      </w:r>
+    </w:p>
+    <w:p>
+      <w:pPr>
+        <w:pStyle w:val="676"/>
+        <w:keepNext/>
+        <w:spacing w:before="120" w:after="60"/>
+        <w:ind w:left="0"/>
+        <w:jc w:val="center"/>
+      </w:pPr>
+      <w:r>
+        <w:rPr>
+          <w:rFonts w:ascii="Times New Roman" w:hAnsi="Times New Roman" w:eastAsia="Times New Roman" w:cs="Times New Roman"/>
+          <w:sz w:val="20"/>
+          <w:szCs w:val="20"/>
+        </w:rPr>
+        <w:t xml:space="preserve">TABLE I. TRANSLATION BLOCKS AND ROW COUNTS</w:t>
+      </w:r>
+    </w:p>
+    <w:tbl>
+      <w:tblPr>
+        <w:tblW w:w="9360" w:type="dxa"/>
+        <w:jc w:val="center"/>
+        <w:tblBorders>
+          <w:top w:val="single" w:sz="8" w:space="0" w:color="000000"/>
+          <w:bottom w:val="single" w:sz="8" w:space="0" w:color="000000"/>
+        </w:tblBorders>
+        <w:tblLayout w:type="fixed"/>
+        <w:tblCellMar>
+          <w:left w:w="80" w:type="dxa"/>
+          <w:right w:w="80" w:type="dxa"/>
+        </w:tblCellMar>
+        <w:tblLook w:val="0000"/>
+      </w:tblPr>
+      <w:tblGrid>
+        <w:gridCol w:w="900"/>
+        <w:gridCol w:w="1500"/>
+        <w:gridCol w:w="2760"/>
+        <w:gridCol w:w="1400"/>
+        <w:gridCol w:w="1400"/>
+        <w:gridCol w:w="1400"/>
+      </w:tblGrid>
+      <w:tr>
+        <w:trPr>
+          <w:tblHeader/>
+        </w:trPr>
+        <w:tc>
+          <w:tcPr>
+            <w:tcW w:w="900" w:type="dxa"/>
+            <w:tcBorders>
+              <w:bottom w:val="single" w:sz="8" w:space="0" w:color="000000"/>
+            </w:tcBorders>
+          </w:tcPr>
+          <w:p>
+            <w:pPr>
+              <w:pStyle w:val="676"/>
+              <w:spacing w:before="20" w:after="20"/>
+              <w:ind w:left="0"/>
+              <w:jc w:val="left"/>
+            </w:pPr>
+            <w:r>
+              <w:rPr>
+                <w:rFonts w:ascii="Times New Roman" w:hAnsi="Times New Roman" w:eastAsia="Times New Roman" w:cs="Times New Roman"/>
+                <w:b/>
+                <w:sz w:val="20"/>
+                <w:szCs w:val="20"/>
+              </w:rPr>
+              <w:t xml:space="preserve">Block</w:t>
+            </w:r>
+          </w:p>
+        </w:tc>
+        <w:tc>
+          <w:tcPr>
+            <w:tcW w:w="1500" w:type="dxa"/>
+            <w:tcBorders>
+              <w:bottom w:val="single" w:sz="8" w:space="0" w:color="000000"/>
+            </w:tcBorders>
+          </w:tcPr>
+          <w:p>
+            <w:pPr>
+              <w:pStyle w:val="676"/>
+              <w:spacing w:before="20" w:after="20"/>
+              <w:ind w:left="0"/>
+              <w:jc w:val="center"/>
+            </w:pPr>
+            <w:r>
+              <w:rPr>
+                <w:rFonts w:ascii="Times New Roman" w:hAnsi="Times New Roman" w:eastAsia="Times New Roman" w:cs="Times New Roman"/>
+                <w:b/>
+                <w:sz w:val="20"/>
+                <w:szCs w:val="20"/>
+              </w:rPr>
+              <w:t xml:space="preserve">Native source</w:t>
+            </w:r>
+          </w:p>
+        </w:tc>
+        <w:tc>
+          <w:tcPr>
+            <w:tcW w:w="2760" w:type="dxa"/>
+            <w:tcBorders>
+              <w:bottom w:val="single" w:sz="8" w:space="0" w:color="000000"/>
+            </w:tcBorders>
+          </w:tcPr>
+          <w:p>
+            <w:pPr>
+              <w:pStyle w:val="676"/>
+              <w:spacing w:before="20" w:after="20"/>
+              <w:ind w:left="0"/>
+              <w:jc w:val="center"/>
+            </w:pPr>
+            <w:r>
+              <w:rPr>
+                <w:rFonts w:ascii="Times New Roman" w:hAnsi="Times New Roman" w:eastAsia="Times New Roman" w:cs="Times New Roman"/>
+                <w:b/>
+                <w:sz w:val="20"/>
+                <w:szCs w:val="20"/>
+              </w:rPr>
+              <w:t xml:space="preserve">MT targets</w:t>
+            </w:r>
+          </w:p>
+        </w:tc>
+        <w:tc>
+          <w:tcPr>
+            <w:tcW w:w="1400" w:type="dxa"/>
+            <w:tcBorders>
+              <w:bottom w:val="single" w:sz="8" w:space="0" w:color="000000"/>
+            </w:tcBorders>
+          </w:tcPr>
+          <w:p>
+            <w:pPr>
+              <w:pStyle w:val="676"/>
+              <w:spacing w:before="20" w:after="20"/>
+              <w:ind w:left="0"/>
+              <w:jc w:val="center"/>
+            </w:pPr>
+            <w:r>
+              <w:rPr>
+                <w:rFonts w:ascii="Times New Roman" w:hAnsi="Times New Roman" w:eastAsia="Times New Roman" w:cs="Times New Roman"/>
+                <w:b/>
+                <w:sz w:val="20"/>
+                <w:szCs w:val="20"/>
+              </w:rPr>
+              <w:t xml:space="preserve">Task 1</w:t>
+            </w:r>
+          </w:p>
+        </w:tc>
+        <w:tc>
+          <w:tcPr>
+            <w:tcW w:w="1400" w:type="dxa"/>
+            <w:tcBorders>
+              <w:bottom w:val="single" w:sz="8" w:space="0" w:color="000000"/>
+            </w:tcBorders>
+          </w:tcPr>
+          <w:p>
+            <w:pPr>
+              <w:pStyle w:val="676"/>
+              <w:spacing w:before="20" w:after="20"/>
+              <w:ind w:left="0"/>
+              <w:jc w:val="center"/>
+            </w:pPr>
+            <w:r>
+              <w:rPr>
+                <w:rFonts w:ascii="Times New Roman" w:hAnsi="Times New Roman" w:eastAsia="Times New Roman" w:cs="Times New Roman"/>
+                <w:b/>
+                <w:sz w:val="20"/>
+                <w:szCs w:val="20"/>
+              </w:rPr>
+              <w:t xml:space="preserve">Task 2</w:t>
+            </w:r>
+          </w:p>
+        </w:tc>
+        <w:tc>
+          <w:tcPr>
+            <w:tcW w:w="1400" w:type="dxa"/>
+            <w:tcBorders>
+              <w:bottom w:val="single" w:sz="8" w:space="0" w:color="000000"/>
+            </w:tcBorders>
+          </w:tcPr>
+          <w:p>
+            <w:pPr>
+              <w:pStyle w:val="676"/>
+              <w:spacing w:before="20" w:after="20"/>
+              <w:ind w:left="0"/>
+              <w:jc w:val="center"/>
+            </w:pPr>
+            <w:r>
+              <w:rPr>
+                <w:rFonts w:ascii="Times New Roman" w:hAnsi="Times New Roman" w:eastAsia="Times New Roman" w:cs="Times New Roman"/>
+                <w:b/>
+                <w:sz w:val="20"/>
+                <w:szCs w:val="20"/>
+              </w:rPr>
+              <w:t xml:space="preserve">Task 3</w:t>
+            </w:r>
+          </w:p>
+        </w:tc>
+      </w:tr>
+      <w:tr>
+        <w:tc>
+          <w:tcPr>
+            <w:tcW w:w="900" w:type="dxa"/>
+          </w:tcPr>
+          <w:p>
+            <w:pPr>
+              <w:pStyle w:val="676"/>
+              <w:spacing w:before="20" w:after="20"/>
+              <w:ind w:left="0"/>
+              <w:jc w:val="left"/>
+            </w:pPr>
+            <w:r>
+              <w:rPr>
+                <w:rFonts w:ascii="Times New Roman" w:hAnsi="Times New Roman" w:eastAsia="Times New Roman" w:cs="Times New Roman"/>
+                <w:sz w:val="20"/>
+                <w:szCs w:val="20"/>
+              </w:rPr>
+              <w:t xml:space="preserve">H</w:t>
+            </w:r>
+          </w:p>
+        </w:tc>
+        <w:tc>
+          <w:tcPr>
+            <w:tcW w:w="1500" w:type="dxa"/>
+          </w:tcPr>
+          <w:p>
+            <w:pPr>
+              <w:pStyle w:val="676"/>
+              <w:spacing w:before="20" w:after="20"/>
+              <w:ind w:left="0"/>
+              <w:jc w:val="center"/>
+            </w:pPr>
+            <w:r>
+              <w:rPr>
+                <w:rFonts w:ascii="Times New Roman" w:hAnsi="Times New Roman" w:eastAsia="Times New Roman" w:cs="Times New Roman"/>
+                <w:sz w:val="20"/>
+                <w:szCs w:val="20"/>
+              </w:rPr>
+              <w:t xml:space="preserve">Hindi</w:t>
+            </w:r>
+          </w:p>
+        </w:tc>
+        <w:tc>
+          <w:tcPr>
+            <w:tcW w:w="2760" w:type="dxa"/>
+          </w:tcPr>
+          <w:p>
+            <w:pPr>
+              <w:pStyle w:val="676"/>
+              <w:spacing w:before="20" w:after="20"/>
+              <w:ind w:left="0"/>
+              <w:jc w:val="center"/>
+            </w:pPr>
+            <w:r>
+              <w:rPr>
+                <w:rFonts w:ascii="Times New Roman" w:hAnsi="Times New Roman" w:eastAsia="Times New Roman" w:cs="Times New Roman"/>
+                <w:sz w:val="20"/>
+                <w:szCs w:val="20"/>
+              </w:rPr>
+              <w:t xml:space="preserve">Bengali, Malayalam, Telugu</w:t>
+            </w:r>
+          </w:p>
+        </w:tc>
+        <w:tc>
+          <w:tcPr>
+            <w:tcW w:w="1400" w:type="dxa"/>
+          </w:tcPr>
+          <w:p>
+            <w:pPr>
+              <w:pStyle w:val="676"/>
+              <w:spacing w:before="20" w:after="20"/>
+              <w:ind w:left="0"/>
+              <w:jc w:val="center"/>
+            </w:pPr>
+            <w:r>
+              <w:rPr>
+                <w:rFonts w:ascii="Times New Roman" w:hAnsi="Times New Roman" w:eastAsia="Times New Roman" w:cs="Times New Roman"/>
+                <w:sz w:val="20"/>
+                <w:szCs w:val="20"/>
+              </w:rPr>
+              <w:t xml:space="preserve">10,640</w:t>
+            </w:r>
+          </w:p>
+        </w:tc>
+        <w:tc>
+          <w:tcPr>
+            <w:tcW w:w="1400" w:type="dxa"/>
+          </w:tcPr>
+          <w:p>
+            <w:pPr>
+              <w:pStyle w:val="676"/>
+              <w:spacing w:before="20" w:after="20"/>
+              <w:ind w:left="0"/>
+              <w:jc w:val="center"/>
+            </w:pPr>
+            <w:r>
+              <w:rPr>
+                <w:rFonts w:ascii="Times New Roman" w:hAnsi="Times New Roman" w:eastAsia="Times New Roman" w:cs="Times New Roman"/>
+                <w:sz w:val="20"/>
+                <w:szCs w:val="20"/>
+              </w:rPr>
+              <w:t xml:space="preserve">2,238</w:t>
+            </w:r>
+          </w:p>
+        </w:tc>
+        <w:tc>
+          <w:tcPr>
+            <w:tcW w:w="1400" w:type="dxa"/>
+          </w:tcPr>
+          <w:p>
+            <w:pPr>
+              <w:pStyle w:val="676"/>
+              <w:spacing w:before="20" w:after="20"/>
+              <w:ind w:left="0"/>
+              <w:jc w:val="center"/>
+            </w:pPr>
+            <w:r>
+              <w:rPr>
+                <w:rFonts w:ascii="Times New Roman" w:hAnsi="Times New Roman" w:eastAsia="Times New Roman" w:cs="Times New Roman"/>
+                <w:sz w:val="20"/>
+                <w:szCs w:val="20"/>
+              </w:rPr>
+              <w:t xml:space="preserve">532</w:t>
+            </w:r>
+          </w:p>
+        </w:tc>
+      </w:tr>
+      <w:tr>
+        <w:tc>
+          <w:tcPr>
+            <w:tcW w:w="900" w:type="dxa"/>
+          </w:tcPr>
+          <w:p>
+            <w:pPr>
+              <w:pStyle w:val="676"/>
+              <w:spacing w:before="20" w:after="20"/>
+              <w:ind w:left="0"/>
+              <w:jc w:val="left"/>
+            </w:pPr>
+            <w:r>
+              <w:rPr>
+                <w:rFonts w:ascii="Times New Roman" w:hAnsi="Times New Roman" w:eastAsia="Times New Roman" w:cs="Times New Roman"/>
+                <w:sz w:val="20"/>
+                <w:szCs w:val="20"/>
+              </w:rPr>
+              <w:t xml:space="preserve">B</w:t>
+            </w:r>
+          </w:p>
+        </w:tc>
+        <w:tc>
+          <w:tcPr>
+            <w:tcW w:w="1500" w:type="dxa"/>
+          </w:tcPr>
+          <w:p>
+            <w:pPr>
+              <w:pStyle w:val="676"/>
+              <w:spacing w:before="20" w:after="20"/>
+              <w:ind w:left="0"/>
+              <w:jc w:val="center"/>
+            </w:pPr>
+            <w:r>
+              <w:rPr>
+                <w:rFonts w:ascii="Times New Roman" w:hAnsi="Times New Roman" w:eastAsia="Times New Roman" w:cs="Times New Roman"/>
+                <w:sz w:val="20"/>
+                <w:szCs w:val="20"/>
+              </w:rPr>
+              <w:t xml:space="preserve">Bengali</w:t>
+            </w:r>
+          </w:p>
+        </w:tc>
+        <w:tc>
+          <w:tcPr>
+            <w:tcW w:w="2760" w:type="dxa"/>
+          </w:tcPr>
+          <w:p>
+            <w:pPr>
+              <w:pStyle w:val="676"/>
+              <w:spacing w:before="20" w:after="20"/>
+              <w:ind w:left="0"/>
+              <w:jc w:val="center"/>
+            </w:pPr>
+            <w:r>
+              <w:rPr>
+                <w:rFonts w:ascii="Times New Roman" w:hAnsi="Times New Roman" w:eastAsia="Times New Roman" w:cs="Times New Roman"/>
+                <w:sz w:val="20"/>
+                <w:szCs w:val="20"/>
+              </w:rPr>
+              <w:t xml:space="preserve">Hindi, Malayalam, Telugu</w:t>
+            </w:r>
+          </w:p>
+        </w:tc>
+        <w:tc>
+          <w:tcPr>
+            <w:tcW w:w="1400" w:type="dxa"/>
+          </w:tcPr>
+          <w:p>
+            <w:pPr>
+              <w:pStyle w:val="676"/>
+              <w:spacing w:before="20" w:after="20"/>
+              <w:ind w:left="0"/>
+              <w:jc w:val="center"/>
+            </w:pPr>
+            <w:r>
+              <w:rPr>
+                <w:rFonts w:ascii="Times New Roman" w:hAnsi="Times New Roman" w:eastAsia="Times New Roman" w:cs="Times New Roman"/>
+                <w:sz w:val="20"/>
+                <w:szCs w:val="20"/>
+              </w:rPr>
+              <w:t xml:space="preserve">6,130</w:t>
+            </w:r>
+          </w:p>
+        </w:tc>
+        <w:tc>
+          <w:tcPr>
+            <w:tcW w:w="1400" w:type="dxa"/>
+          </w:tcPr>
+          <w:p>
+            <w:pPr>
+              <w:pStyle w:val="676"/>
+              <w:spacing w:before="20" w:after="20"/>
+              <w:ind w:left="0"/>
+              <w:jc w:val="center"/>
+            </w:pPr>
+            <w:r>
+              <w:rPr>
+                <w:rFonts w:ascii="Times New Roman" w:hAnsi="Times New Roman" w:eastAsia="Times New Roman" w:cs="Times New Roman"/>
+                <w:sz w:val="20"/>
+                <w:szCs w:val="20"/>
+              </w:rPr>
+              <w:t xml:space="preserve">2,228</w:t>
+            </w:r>
+          </w:p>
+        </w:tc>
+        <w:tc>
+          <w:tcPr>
+            <w:tcW w:w="1400" w:type="dxa"/>
+          </w:tcPr>
+          <w:p>
+            <w:pPr>
+              <w:pStyle w:val="676"/>
+              <w:spacing w:before="20" w:after="20"/>
+              <w:ind w:left="0"/>
+              <w:jc w:val="center"/>
+            </w:pPr>
+            <w:r>
+              <w:rPr>
+                <w:rFonts w:ascii="Times New Roman" w:hAnsi="Times New Roman" w:eastAsia="Times New Roman" w:cs="Times New Roman"/>
+                <w:sz w:val="20"/>
+                <w:szCs w:val="20"/>
+              </w:rPr>
+              <w:t xml:space="preserve">532</w:t>
+            </w:r>
+          </w:p>
+        </w:tc>
+      </w:tr>
+      <w:tr>
+        <w:tc>
+          <w:tcPr>
+            <w:tcW w:w="900" w:type="dxa"/>
+          </w:tcPr>
+          <w:p>
+            <w:pPr>
+              <w:pStyle w:val="676"/>
+              <w:spacing w:before="20" w:after="20"/>
+              <w:ind w:left="0"/>
+              <w:jc w:val="left"/>
+            </w:pPr>
+            <w:r>
+              <w:rPr>
+                <w:rFonts w:ascii="Times New Roman" w:hAnsi="Times New Roman" w:eastAsia="Times New Roman" w:cs="Times New Roman"/>
+                <w:sz w:val="20"/>
+                <w:szCs w:val="20"/>
+              </w:rPr>
+              <w:t xml:space="preserve">T</w:t>
+            </w:r>
+          </w:p>
+        </w:tc>
+        <w:tc>
+          <w:tcPr>
+            <w:tcW w:w="1500" w:type="dxa"/>
+          </w:tcPr>
+          <w:p>
+            <w:pPr>
+              <w:pStyle w:val="676"/>
+              <w:spacing w:before="20" w:after="20"/>
+              <w:ind w:left="0"/>
+              <w:jc w:val="center"/>
+            </w:pPr>
+            <w:r>
+              <w:rPr>
+                <w:rFonts w:ascii="Times New Roman" w:hAnsi="Times New Roman" w:eastAsia="Times New Roman" w:cs="Times New Roman"/>
+                <w:sz w:val="20"/>
+                <w:szCs w:val="20"/>
+              </w:rPr>
+              <w:t xml:space="preserve">Telugu</w:t>
+            </w:r>
+          </w:p>
+        </w:tc>
+        <w:tc>
+          <w:tcPr>
+            <w:tcW w:w="2760" w:type="dxa"/>
+          </w:tcPr>
+          <w:p>
+            <w:pPr>
+              <w:pStyle w:val="676"/>
+              <w:spacing w:before="20" w:after="20"/>
+              <w:ind w:left="0"/>
+              <w:jc w:val="center"/>
+            </w:pPr>
+            <w:r>
+              <w:rPr>
+                <w:rFonts w:ascii="Times New Roman" w:hAnsi="Times New Roman" w:eastAsia="Times New Roman" w:cs="Times New Roman"/>
+                <w:sz w:val="20"/>
+                <w:szCs w:val="20"/>
+              </w:rPr>
+              <w:t xml:space="preserve">Hindi, Bengali, Malayalam</w:t>
+            </w:r>
+          </w:p>
+        </w:tc>
+        <w:tc>
+          <w:tcPr>
+            <w:tcW w:w="1400" w:type="dxa"/>
+          </w:tcPr>
+          <w:p>
+            <w:pPr>
+              <w:pStyle w:val="676"/>
+              <w:spacing w:before="20" w:after="20"/>
+              <w:ind w:left="0"/>
+              <w:jc w:val="center"/>
+            </w:pPr>
+            <w:r>
+              <w:rPr>
+                <w:rFonts w:ascii="Times New Roman" w:hAnsi="Times New Roman" w:eastAsia="Times New Roman" w:cs="Times New Roman"/>
+                <w:sz w:val="20"/>
+                <w:szCs w:val="20"/>
+              </w:rPr>
+              <w:t xml:space="preserve">6,016</w:t>
+            </w:r>
+          </w:p>
+        </w:tc>
+        <w:tc>
+          <w:tcPr>
+            <w:tcW w:w="1400" w:type="dxa"/>
+          </w:tcPr>
+          <w:p>
+            <w:pPr>
+              <w:pStyle w:val="676"/>
+              <w:spacing w:before="20" w:after="20"/>
+              <w:ind w:left="0"/>
+              <w:jc w:val="center"/>
+            </w:pPr>
+            <w:r>
+              <w:rPr>
+                <w:rFonts w:ascii="Times New Roman" w:hAnsi="Times New Roman" w:eastAsia="Times New Roman" w:cs="Times New Roman"/>
+                <w:sz w:val="20"/>
+                <w:szCs w:val="20"/>
+              </w:rPr>
+              <w:t xml:space="preserve">2,072</w:t>
+            </w:r>
+          </w:p>
+        </w:tc>
+        <w:tc>
+          <w:tcPr>
+            <w:tcW w:w="1400" w:type="dxa"/>
+          </w:tcPr>
+          <w:p>
+            <w:pPr>
+              <w:pStyle w:val="676"/>
+              <w:spacing w:before="20" w:after="20"/>
+              <w:ind w:left="0"/>
+              <w:jc w:val="center"/>
+            </w:pPr>
+            <w:r>
+              <w:rPr>
+                <w:rFonts w:ascii="Times New Roman" w:hAnsi="Times New Roman" w:eastAsia="Times New Roman" w:cs="Times New Roman"/>
+                <w:sz w:val="20"/>
+                <w:szCs w:val="20"/>
+              </w:rPr>
+              <w:t xml:space="preserve">532</w:t>
+            </w:r>
+          </w:p>
+        </w:tc>
+      </w:tr>
+      <w:tr>
+        <w:tc>
+          <w:tcPr>
+            <w:tcW w:w="900" w:type="dxa"/>
+            <w:tcBorders>
+              <w:top w:val="single" w:sz="8" w:space="0" w:color="000000"/>
+            </w:tcBorders>
+          </w:tcPr>
+          <w:p>
+            <w:pPr>
+              <w:pStyle w:val="676"/>
+              <w:spacing w:before="20" w:after="20"/>
+              <w:ind w:left="0"/>
+              <w:jc w:val="left"/>
+            </w:pPr>
+            <w:r>
+              <w:rPr>
+                <w:rFonts w:ascii="Times New Roman" w:hAnsi="Times New Roman" w:eastAsia="Times New Roman" w:cs="Times New Roman"/>
+                <w:sz w:val="20"/>
+                <w:szCs w:val="20"/>
+              </w:rPr>
+              <w:t xml:space="preserve">MT rows</w:t>
+            </w:r>
+          </w:p>
+        </w:tc>
+        <w:tc>
+          <w:tcPr>
+            <w:tcW w:w="1500" w:type="dxa"/>
+            <w:tcBorders>
+              <w:top w:val="single" w:sz="8" w:space="0" w:color="000000"/>
+            </w:tcBorders>
+          </w:tcPr>
+          <w:p>
+            <w:pPr>
+              <w:pStyle w:val="676"/>
+              <w:spacing w:before="20" w:after="20"/>
+              <w:ind w:left="0"/>
+              <w:jc w:val="center"/>
+            </w:pPr>
+            <w:r>
+              <w:rPr>
+                <w:rFonts w:ascii="Times New Roman" w:hAnsi="Times New Roman" w:eastAsia="Times New Roman" w:cs="Times New Roman"/>
+                <w:sz w:val="20"/>
+                <w:szCs w:val="20"/>
+              </w:rPr>
+              <w:t xml:space="preserve"/>
+            </w:r>
+          </w:p>
+        </w:tc>
+        <w:tc>
+          <w:tcPr>
+            <w:tcW w:w="2760" w:type="dxa"/>
+            <w:tcBorders>
+              <w:top w:val="single" w:sz="8" w:space="0" w:color="000000"/>
+            </w:tcBorders>
+          </w:tcPr>
+          <w:p>
+            <w:pPr>
+              <w:pStyle w:val="676"/>
+              <w:spacing w:before="20" w:after="20"/>
+              <w:ind w:left="0"/>
+              <w:jc w:val="center"/>
+            </w:pPr>
+            <w:r>
+              <w:rPr>
+                <w:rFonts w:ascii="Times New Roman" w:hAnsi="Times New Roman" w:eastAsia="Times New Roman" w:cs="Times New Roman"/>
+                <w:sz w:val="20"/>
+                <w:szCs w:val="20"/>
+              </w:rPr>
+              <w:t xml:space="preserve"/>
+            </w:r>
+          </w:p>
+        </w:tc>
+        <w:tc>
+          <w:tcPr>
+            <w:tcW w:w="1400" w:type="dxa"/>
+            <w:tcBorders>
+              <w:top w:val="single" w:sz="8" w:space="0" w:color="000000"/>
+            </w:tcBorders>
+          </w:tcPr>
+          <w:p>
+            <w:pPr>
+              <w:pStyle w:val="676"/>
+              <w:spacing w:before="20" w:after="20"/>
+              <w:ind w:left="0"/>
+              <w:jc w:val="center"/>
+            </w:pPr>
+            <w:r>
+              <w:rPr>
+                <w:rFonts w:ascii="Times New Roman" w:hAnsi="Times New Roman" w:eastAsia="Times New Roman" w:cs="Times New Roman"/>
+                <w:sz w:val="20"/>
+                <w:szCs w:val="20"/>
+              </w:rPr>
+              <w:t xml:space="preserve">68,358</w:t>
+            </w:r>
+          </w:p>
+        </w:tc>
+        <w:tc>
+          <w:tcPr>
+            <w:tcW w:w="1400" w:type="dxa"/>
+            <w:tcBorders>
+              <w:top w:val="single" w:sz="8" w:space="0" w:color="000000"/>
+            </w:tcBorders>
+          </w:tcPr>
+          <w:p>
+            <w:pPr>
+              <w:pStyle w:val="676"/>
+              <w:spacing w:before="20" w:after="20"/>
+              <w:ind w:left="0"/>
+              <w:jc w:val="center"/>
+            </w:pPr>
+            <w:r>
+              <w:rPr>
+                <w:rFonts w:ascii="Times New Roman" w:hAnsi="Times New Roman" w:eastAsia="Times New Roman" w:cs="Times New Roman"/>
+                <w:sz w:val="20"/>
+                <w:szCs w:val="20"/>
+              </w:rPr>
+              <w:t xml:space="preserve">19,614</w:t>
+            </w:r>
+          </w:p>
+        </w:tc>
+        <w:tc>
+          <w:tcPr>
+            <w:tcW w:w="1400" w:type="dxa"/>
+            <w:tcBorders>
+              <w:top w:val="single" w:sz="8" w:space="0" w:color="000000"/>
+            </w:tcBorders>
+          </w:tcPr>
+          <w:p>
+            <w:pPr>
+              <w:pStyle w:val="676"/>
+              <w:spacing w:before="20" w:after="20"/>
+              <w:ind w:left="0"/>
+              <w:jc w:val="center"/>
+            </w:pPr>
+            <w:r>
+              <w:rPr>
+                <w:rFonts w:ascii="Times New Roman" w:hAnsi="Times New Roman" w:eastAsia="Times New Roman" w:cs="Times New Roman"/>
+                <w:sz w:val="20"/>
+                <w:szCs w:val="20"/>
+              </w:rPr>
+              <w:t xml:space="preserve">4,788</w:t>
+            </w:r>
+          </w:p>
+        </w:tc>
+      </w:tr>
+    </w:tbl>
+    <w:p>
+      <w:pPr>
+        <w:pStyle w:val="676"/>
+        <w:spacing w:after="0"/>
+        <w:ind w:left="0"/>
+      </w:pPr>
+    </w:p>
+    <w:p>
+      <w:pPr>
+        <w:pStyle w:val="676"/>
+        <w:pBdr/>
+        <w:spacing/>
+        <w:ind w:left="0" w:firstLine="288"/>
+        <w:jc w:val="both"/>
+        <w:rPr/>
+      </w:pPr>
+      <w:r>
+        <w:rPr>
+          <w:rFonts w:ascii="Times New Roman" w:hAnsi="Times New Roman" w:eastAsia="Times New Roman" w:cs="Times New Roman"/>
+          <w:sz w:val="24"/>
+          <w:szCs w:val="24"/>
+        </w:rPr>
+        <w:t xml:space="preserve">Translation uses IndicTrans2 [21] (the indic-indic 1B model) directly between Indic languages, with no English pivot: a pivot would add a second error source and make drift impossible to attribute. One decoding configuration, beam search with five beams, a maximum length of 256 and no sampling, is applied unchanged to all nine directions so their quality figures are comparable. We chose the 1B model over its 320M distilled variant after measuring output corruption on a 180-row task-1 sample: the smaller model was eight times faster but corrupted 10.0% of rows against 4.4%. Identical source sentences are translated once and the output shared. In task 1, where a sentence containing three numerals forms three items, this reduces 68,358 translations to 40,401 and ensures each sentence has exactly one translation. The corpus holds 92,760 machine-translated rows in total.</w:t>
+      </w:r>
+    </w:p>
+    <w:p>
+      <w:pPr>
+        <w:pStyle w:val="676"/>
+        <w:pBdr/>
+        <w:spacing/>
+        <w:ind w:left="0" w:firstLine="288"/>
+        <w:jc w:val="both"/>
+        <w:rPr/>
+      </w:pPr>
+      <w:r>
+        <w:rPr>
+          <w:rFonts w:ascii="Times New Roman" w:hAnsi="Times New Roman" w:eastAsia="Times New Roman" w:cs="Times New Roman"/>
+          <w:sz w:val="24"/>
+          <w:szCs w:val="24"/>
+        </w:rPr>
+        <w:t xml:space="preserve">Task 1's annotations are character offsets into the source string, which cannot survive a change of length and script. We re-locate the annotated numeral in each translation by value rather than by digit string, so Bengali ২৪, ASCII 24 and a grouped 25,000 are all matched, and record per row whether the span was recovered. A numeral rewritten as an equivalent quantity (for example 100 million as 10 crore) is recorded separately from one that was lost.</w:t>
+      </w:r>
+    </w:p>
+    <w:p>
+      <w:pPr>
+        <w:pStyle w:val="681"/>
+        <w:numPr>
+          <w:ilvl w:val="0"/>
+          <w:numId w:val="7"/>
+        </w:numPr>
+        <w:pBdr/>
+        <w:spacing/>
+        <w:ind/>
+        <w:jc w:val="left"/>
+        <w:rPr/>
+      </w:pPr>
+      <w:r>
+        <w:rPr>
+          <w:rFonts w:ascii="Times New Roman" w:hAnsi="Times New Roman" w:eastAsia="Times New Roman" w:cs="Times New Roman"/>
+          <w:sz w:val="24"/>
+          <w:szCs w:val="24"/>
+        </w:rPr>
+        <w:t xml:space="preserve">Translation Quality Gates</w:t>
+      </w:r>
+    </w:p>
+    <w:p>
+      <w:pPr>
+        <w:pStyle w:val="676"/>
+        <w:pBdr/>
+        <w:spacing/>
+        <w:ind w:left="0" w:firstLine="288"/>
+        <w:jc w:val="both"/>
+        <w:rPr/>
+      </w:pPr>
+      <w:r>
+        <w:rPr>
+          <w:rFonts w:ascii="Times New Roman" w:hAnsi="Times New Roman" w:eastAsia="Times New Roman" w:cs="Times New Roman"/>
+          <w:sz w:val="24"/>
+          <w:szCs w:val="24"/>
+        </w:rPr>
+        <w:t xml:space="preserve">Three automated checks are applied to every translated row. Each detects failures the others cannot.</w:t>
+      </w:r>
+    </w:p>
+    <w:p>
+      <w:pPr>
+        <w:pStyle w:val="676"/>
+        <w:pBdr/>
+        <w:spacing/>
+        <w:ind w:left="0" w:firstLine="288"/>
+        <w:jc w:val="both"/>
+        <w:rPr/>
+      </w:pPr>
+      <w:r>
+        <w:rPr>
+          <w:rFonts w:ascii="Times New Roman" w:hAnsi="Times New Roman" w:eastAsia="Times New Roman" w:cs="Times New Roman"/>
+          <w:i/>
+          <w:sz w:val="24"/>
+          <w:szCs w:val="24"/>
+        </w:rPr>
+        <w:t xml:space="preserve">Numeral and entity preservation.</w:t>
+      </w:r>
+      <w:r>
+        <w:rPr>
+          <w:rFonts w:ascii="Times New Roman" w:hAnsi="Times New Roman" w:eastAsia="Times New Roman" w:cs="Times New Roman"/>
+          <w:sz w:val="24"/>
+          <w:szCs w:val="24"/>
+        </w:rPr>
+        <w:t xml:space="preserve"> Numerals, currency symbols, percentages and lakh/crore scale terms are compared by value across digit systems, after the scale word is applied on both sides, so that equivalent quantities compare equal. A comma is read as a thousands separator only when exactly three digits follow it. Rows already flagged as corrupted are excluded from the preservation rate, so that their loss is not attributed to numeral handling, and any direction below 95% preservation is flagged.</w:t>
+      </w:r>
+    </w:p>
+    <w:p>
+      <w:pPr>
+        <w:pStyle w:val="676"/>
+        <w:pBdr/>
+        <w:spacing/>
+        <w:ind w:left="0" w:firstLine="288"/>
+        <w:jc w:val="both"/>
+        <w:rPr/>
+      </w:pPr>
+      <w:r>
+        <w:rPr>
+          <w:rFonts w:ascii="Times New Roman" w:hAnsi="Times New Roman" w:eastAsia="Times New Roman" w:cs="Times New Roman"/>
+          <w:i/>
+          <w:sz w:val="24"/>
+          <w:szCs w:val="24"/>
+        </w:rPr>
+        <w:t xml:space="preserve">Structural integrity.</w:t>
+      </w:r>
+      <w:r>
+        <w:rPr>
+          <w:rFonts w:ascii="Times New Roman" w:hAnsi="Times New Roman" w:eastAsia="Times New Roman" w:cs="Times New Roman"/>
+          <w:sz w:val="24"/>
+          <w:szCs w:val="24"/>
+        </w:rPr>
+        <w:t xml:space="preserve"> Blocking checks require every block to join four ways on item identifier, every translated row to carry its source's label, and native text to be free of encoding damage; any failure stops the pipeline. Non-blocking checks flag script leakage (characters from another Indic script block, excluding the shared danda), two corruption modes we observed in IndicTrans2 output, namely unrestored entity placeholders and nukta characters emitted as literal Unicode escapes, and suspected truncation, judged at half of each direction's own median length ratio. A leak is counted only when the source text is clean.</w:t>
+      </w:r>
+    </w:p>
+    <w:p>
+      <w:pPr>
+        <w:pStyle w:val="676"/>
+        <w:pBdr/>
+        <w:spacing/>
+        <w:ind w:left="0" w:firstLine="288"/>
+        <w:jc w:val="both"/>
+        <w:rPr/>
+      </w:pPr>
+      <w:r>
+        <w:rPr>
+          <w:rFonts w:ascii="Times New Roman" w:hAnsi="Times New Roman" w:eastAsia="Times New Roman" w:cs="Times New Roman"/>
+          <w:i/>
+          <w:sz w:val="24"/>
+          <w:szCs w:val="24"/>
+        </w:rPr>
+        <w:t xml:space="preserve">Semantic similarity.</w:t>
+      </w:r>
+      <w:r>
+        <w:rPr>
+          <w:rFonts w:ascii="Times New Roman" w:hAnsi="Times New Roman" w:eastAsia="Times New Roman" w:cs="Times New Roman"/>
+          <w:sz w:val="24"/>
+          <w:szCs w:val="24"/>
+        </w:rPr>
+        <w:t xml:space="preserve"> Source and translation are embedded with LaBSE and compared by cosine similarity over all 92,760 pairs, with no sampling:</w:t>
+      </w:r>
+    </w:p>
+    <w:p>
+      <w:pPr>
+        <w:pStyle w:val="676"/>
+        <w:tabs>
+          <w:tab w:val="center" w:pos="4680"/>
+          <w:tab w:val="right" w:pos="9360"/>
+        </w:tabs>
+        <w:spacing w:before="60" w:after="60"/>
+        <w:ind w:left="0"/>
+      </w:pPr>
+      <w:r>
+        <w:tab/>
+      </w:r>
+      <m:oMath>
+        <m:r>
+          <m:rPr>
+            <m:sty m:val="p"/>
+          </m:rPr>
+          <w:rPr>
+            <w:rFonts w:ascii="Times New Roman" w:hAnsi="Times New Roman" w:eastAsia="Times New Roman" w:cs="Times New Roman"/>
+          </w:rPr>
+          <m:t xml:space="preserve">cos</m:t>
+        </m:r>
+        <m:r>
+          <w:rPr>
+            <w:rFonts w:ascii="Times New Roman" w:hAnsi="Times New Roman" w:eastAsia="Times New Roman" w:cs="Times New Roman"/>
+          </w:rPr>
+          <m:t xml:space="preserve">(</m:t>
+        </m:r>
+        <m:sSub>
+          <m:e>
+            <m:r>
+              <w:rPr>
+                <w:rFonts w:ascii="Times New Roman" w:hAnsi="Times New Roman" w:eastAsia="Times New Roman" w:cs="Times New Roman"/>
+              </w:rPr>
+              <m:t xml:space="preserve">x</m:t>
+            </m:r>
+          </m:e>
+          <m:sub>
+            <m:r>
+              <w:rPr>
+                <w:rFonts w:ascii="Times New Roman" w:hAnsi="Times New Roman" w:eastAsia="Times New Roman" w:cs="Times New Roman"/>
+              </w:rPr>
+              <m:t xml:space="preserve">s</m:t>
+            </m:r>
+          </m:sub>
+        </m:sSub>
+        <m:r>
+          <w:rPr>
+            <w:rFonts w:ascii="Times New Roman" w:hAnsi="Times New Roman" w:eastAsia="Times New Roman" w:cs="Times New Roman"/>
+          </w:rPr>
+          <m:t xml:space="preserve">, </m:t>
+        </m:r>
+        <m:sSub>
+          <m:e>
+            <m:r>
+              <w:rPr>
+                <w:rFonts w:ascii="Times New Roman" w:hAnsi="Times New Roman" w:eastAsia="Times New Roman" w:cs="Times New Roman"/>
+              </w:rPr>
+              <m:t xml:space="preserve">x</m:t>
+            </m:r>
+          </m:e>
+          <m:sub>
+            <m:r>
+              <w:rPr>
+                <w:rFonts w:ascii="Times New Roman" w:hAnsi="Times New Roman" w:eastAsia="Times New Roman" w:cs="Times New Roman"/>
+              </w:rPr>
+              <m:t xml:space="preserve">t</m:t>
+            </m:r>
+          </m:sub>
+        </m:sSub>
+        <m:r>
+          <w:rPr>
+            <w:rFonts w:ascii="Times New Roman" w:hAnsi="Times New Roman" w:eastAsia="Times New Roman" w:cs="Times New Roman"/>
+          </w:rPr>
+          <m:t xml:space="preserve">)</m:t>
+        </m:r>
+        <m:r>
+          <w:rPr>
+            <w:rFonts w:ascii="Times New Roman" w:hAnsi="Times New Roman" w:eastAsia="Times New Roman" w:cs="Times New Roman"/>
+          </w:rPr>
+          <m:t xml:space="preserve"> = </m:t>
+        </m:r>
+        <m:f>
+          <m:num>
+            <m:sSub>
+              <m:e>
+                <m:r>
+                  <w:rPr>
+                    <w:rFonts w:ascii="Times New Roman" w:hAnsi="Times New Roman" w:eastAsia="Times New Roman" w:cs="Times New Roman"/>
+                  </w:rPr>
+                  <m:t xml:space="preserve">e</m:t>
+                </m:r>
+              </m:e>
+              <m:sub>
+                <m:r>
+                  <w:rPr>
+                    <w:rFonts w:ascii="Times New Roman" w:hAnsi="Times New Roman" w:eastAsia="Times New Roman" w:cs="Times New Roman"/>
+                  </w:rPr>
+                  <m:t xml:space="preserve">s</m:t>
+                </m:r>
+              </m:sub>
+            </m:sSub>
+            <m:r>
+              <w:rPr>
+                <w:rFonts w:ascii="Times New Roman" w:hAnsi="Times New Roman" w:eastAsia="Times New Roman" w:cs="Times New Roman"/>
+              </w:rPr>
+              <m:t xml:space="preserve">⋅</m:t>
+            </m:r>
+            <m:sSub>
+              <m:e>
+                <m:r>
+                  <w:rPr>
+                    <w:rFonts w:ascii="Times New Roman" w:hAnsi="Times New Roman" w:eastAsia="Times New Roman" w:cs="Times New Roman"/>
+                  </w:rPr>
+                  <m:t xml:space="preserve">e</m:t>
+                </m:r>
+              </m:e>
+              <m:sub>
+                <m:r>
+                  <w:rPr>
+                    <w:rFonts w:ascii="Times New Roman" w:hAnsi="Times New Roman" w:eastAsia="Times New Roman" w:cs="Times New Roman"/>
+                  </w:rPr>
+                  <m:t xml:space="preserve">t</m:t>
+                </m:r>
+              </m:sub>
+            </m:sSub>
+          </m:num>
+          <m:den>
+            <m:d>
+              <m:dPr>
+                <m:begChr m:val="‖"/>
+                <m:endChr m:val="‖"/>
+              </m:dPr>
+              <m:e>
+                <m:sSub>
+                  <m:e>
+                    <m:r>
+                      <w:rPr>
+                        <w:rFonts w:ascii="Times New Roman" w:hAnsi="Times New Roman" w:eastAsia="Times New Roman" w:cs="Times New Roman"/>
+                      </w:rPr>
+                      <m:t xml:space="preserve">e</m:t>
+                    </m:r>
+                  </m:e>
+                  <m:sub>
+                    <m:r>
+                      <w:rPr>
+                        <w:rFonts w:ascii="Times New Roman" w:hAnsi="Times New Roman" w:eastAsia="Times New Roman" w:cs="Times New Roman"/>
+                      </w:rPr>
+                      <m:t xml:space="preserve">s</m:t>
+                    </m:r>
+                  </m:sub>
+                </m:sSub>
+              </m:e>
+            </m:d>
+            <m:d>
+              <m:dPr>
+                <m:begChr m:val="‖"/>
+                <m:endChr m:val="‖"/>
+              </m:dPr>
+              <m:e>
+                <m:sSub>
+                  <m:e>
+                    <m:r>
+                      <w:rPr>
+                        <w:rFonts w:ascii="Times New Roman" w:hAnsi="Times New Roman" w:eastAsia="Times New Roman" w:cs="Times New Roman"/>
+                      </w:rPr>
+                      <m:t xml:space="preserve">e</m:t>
+                    </m:r>
+                  </m:e>
+                  <m:sub>
+                    <m:r>
+                      <w:rPr>
+                        <w:rFonts w:ascii="Times New Roman" w:hAnsi="Times New Roman" w:eastAsia="Times New Roman" w:cs="Times New Roman"/>
+                      </w:rPr>
+                      <m:t xml:space="preserve">t</m:t>
+                    </m:r>
+                  </m:sub>
+                </m:sSub>
+              </m:e>
+            </m:d>
+          </m:den>
+        </m:f>
+      </m:oMath>
+      <w:r>
+        <w:rPr>
+          <w:rFonts w:ascii="Times New Roman" w:hAnsi="Times New Roman" w:eastAsia="Times New Roman" w:cs="Times New Roman"/>
+          <w:sz w:val="24"/>
+        </w:rPr>
+        <w:tab/>
+        <w:t>(1)</w:t>
+      </w:r>
+    </w:p>
+    <w:p>
+      <w:pPr>
+        <w:pStyle w:val="676"/>
+        <w:pBdr/>
+        <w:spacing/>
+        <w:ind w:left="0" w:firstLine="288"/>
+        <w:jc w:val="both"/>
+        <w:rPr/>
+      </w:pPr>
+      <w:r>
+        <w:rPr>
+          <w:rFonts w:ascii="Times New Roman" w:hAnsi="Times New Roman" w:eastAsia="Times New Roman" w:cs="Times New Roman"/>
+          <w:sz w:val="24"/>
+          <w:szCs w:val="24"/>
+        </w:rPr>
+        <w:t xml:space="preserve">where </w:t>
+      </w:r>
+      <w:r>
+        <w:rPr>
+          <w:rFonts w:ascii="Times New Roman" w:hAnsi="Times New Roman" w:eastAsia="Times New Roman" w:cs="Times New Roman"/>
+          <w:i/>
+          <w:sz w:val="24"/>
+          <w:szCs w:val="24"/>
+        </w:rPr>
+        <w:t xml:space="preserve">e</w:t>
+      </w:r>
+      <w:r>
+        <w:rPr>
+          <w:rFonts w:ascii="Times New Roman" w:hAnsi="Times New Roman" w:eastAsia="Times New Roman" w:cs="Times New Roman"/>
+          <w:sz w:val="24"/>
+          <w:szCs w:val="24"/>
+        </w:rPr>
+        <w:t xml:space="preserve"> is the LaBSE embedding of text </w:t>
+      </w:r>
+      <w:r>
+        <w:rPr>
+          <w:rFonts w:ascii="Times New Roman" w:hAnsi="Times New Roman" w:eastAsia="Times New Roman" w:cs="Times New Roman"/>
+          <w:i/>
+          <w:sz w:val="24"/>
+          <w:szCs w:val="24"/>
+        </w:rPr>
+        <w:t xml:space="preserve">x</w:t>
+      </w:r>
+      <w:r>
+        <w:rPr>
+          <w:rFonts w:ascii="Times New Roman" w:hAnsi="Times New Roman" w:eastAsia="Times New Roman" w:cs="Times New Roman"/>
+          <w:sz w:val="24"/>
+          <w:szCs w:val="24"/>
+        </w:rPr>
+        <w:t xml:space="preserve">. Rows whose similarity falls below τ are flagged </w:t>
+      </w:r>
+      <w:r>
+        <w:rPr>
+          <w:rFonts w:ascii="Times New Roman" w:hAnsi="Times New Roman" w:eastAsia="Times New Roman" w:cs="Times New Roman"/>
+          <w:i/>
+          <w:sz w:val="24"/>
+          <w:szCs w:val="24"/>
+        </w:rPr>
+        <w:t xml:space="preserve">translation_drift</w:t>
+      </w:r>
+      <w:r>
+        <w:rPr>
+          <w:rFonts w:ascii="Times New Roman" w:hAnsi="Times New Roman" w:eastAsia="Times New Roman" w:cs="Times New Roman"/>
+          <w:sz w:val="24"/>
+          <w:szCs w:val="24"/>
+        </w:rPr>
+        <w:t xml:space="preserve">. For tasks 2 and 3, the native split in the target language is a human translation of the same item. This allows τ to be calibrated: a human translation is a known-good pair, so τ should accept nearly all of them. τ = 0.82 accepts every human pair on task 2 but rejects 23.4% on task 3, whose headlines are short and score lower for that reason alone. τ is therefore set per task: 0.82 for task 2 (confirmed), 0.73 for task 3 (the value that accepts 95% of human pairs), and 0.82 for task 1, inherited rather than calibrated because no human reference exists for it. Malayalam targets have no reference either.</w:t>
+      </w:r>
+    </w:p>
+    <w:p>
+      <w:pPr>
+        <w:pStyle w:val="676"/>
+        <w:pBdr/>
+        <w:spacing/>
+        <w:ind w:left="0" w:firstLine="288"/>
+        <w:jc w:val="both"/>
+        <w:rPr/>
+      </w:pPr>
+      <w:r>
+        <w:rPr>
+          <w:rFonts w:ascii="Times New Roman" w:hAnsi="Times New Roman" w:eastAsia="Times New Roman" w:cs="Times New Roman"/>
+          <w:sz w:val="24"/>
+          <w:szCs w:val="24"/>
+        </w:rPr>
+        <w:t xml:space="preserve">Once a task passes its checks, its twelve splits are frozen into a read-only release with per-file SHA-256 hashes and a manifest recording the translation model, decoding configuration, similarity model and τ. The release datasheet is generated from these artefacts rather than written by hand.</w:t>
+      </w:r>
+    </w:p>
+    <w:p>
+      <w:pPr>
+        <w:pStyle w:val="681"/>
+        <w:numPr>
+          <w:ilvl w:val="0"/>
+          <w:numId w:val="7"/>
+        </w:numPr>
+        <w:pBdr/>
+        <w:spacing/>
+        <w:ind/>
+        <w:jc w:val="left"/>
+        <w:rPr/>
+      </w:pPr>
+      <w:r>
+        <w:rPr>
+          <w:rFonts w:ascii="Times New Roman" w:hAnsi="Times New Roman" w:eastAsia="Times New Roman" w:cs="Times New Roman"/>
+          <w:sz w:val="24"/>
+          <w:szCs w:val="24"/>
+        </w:rPr>
+        <w:t xml:space="preserve">Evaluation Conditions</w:t>
+      </w:r>
+    </w:p>
+    <w:p>
+      <w:pPr>
+        <w:pStyle w:val="676"/>
+        <w:pBdr/>
+        <w:spacing/>
+        <w:ind w:left="0" w:firstLine="288"/>
+        <w:jc w:val="both"/>
+        <w:rPr/>
+      </w:pPr>
+      <w:r>
+        <w:rPr>
+          <w:rFonts w:ascii="Times New Roman" w:hAnsi="Times New Roman" w:eastAsia="Times New Roman" w:cs="Times New Roman"/>
+          <w:sz w:val="24"/>
+          <w:szCs w:val="24"/>
+        </w:rPr>
+        <w:t xml:space="preserve">Transfer is evaluated on tasks 2 and 3, the two classification tasks. All conditions are fixed in advance in one condition matrix. Each task has 21: nine transfer cells, one per source and target language, evaluated on native target text where it exists; the same nine cells evaluated on machine-translated target text from the source's own block; and three translationese conditions that hold the language fixed and vary only provenance (for Hindi: native, translated from Bengali, and translated from Telugu). The transfer cells are grouped into four typological quadrants: Indo-Aryan→Indo-Aryan, Indo-Aryan→Dravidian, Dravidian→Indo-Aryan and Dravidian→Dravidian.</w:t>
+      </w:r>
+    </w:p>
+    <w:p>
+      <w:pPr>
+        <w:pStyle w:val="676"/>
+        <w:pBdr/>
+        <w:spacing/>
+        <w:ind w:left="0" w:firstLine="288"/>
+        <w:jc w:val="both"/>
+        <w:rPr/>
+      </w:pPr>
+      <w:r>
+        <w:rPr>
+          <w:rFonts w:ascii="Times New Roman" w:hAnsi="Times New Roman" w:eastAsia="Times New Roman" w:cs="Times New Roman"/>
+          <w:sz w:val="24"/>
+          <w:szCs w:val="24"/>
+        </w:rPr>
+        <w:t xml:space="preserve">Because tasks 2 and 3 hold the same items in every language, checking split names is not enough to prevent contamination: training on Hindi and evaluating on Bengali would test the model on its own training sentences in another script. Items are therefore partitioned into training and evaluation halves by a seeded hash of the item identifier, and a validator confirms two properties for every condition: no split is both a training source and an evaluation target, and the training and evaluation item sets are disjoint. Hashing makes the partition a property of the item, so every language agrees on it without coordination. Evaluation prefers native target text, so that a failure reflects transfer rather than translation. Malayalam evaluation must use machine translation; it is taken from a block other than the one trained on, and its provenance is recorded with each result.</w:t>
+      </w:r>
+    </w:p>
+    <w:p>
+      <w:pPr>
+        <w:pStyle w:val="681"/>
+        <w:numPr>
+          <w:ilvl w:val="0"/>
+          <w:numId w:val="7"/>
+        </w:numPr>
+        <w:pBdr/>
+        <w:spacing/>
+        <w:ind/>
+        <w:jc w:val="left"/>
+        <w:rPr/>
+      </w:pPr>
+      <w:r>
+        <w:rPr>
+          <w:rFonts w:ascii="Times New Roman" w:hAnsi="Times New Roman" w:eastAsia="Times New Roman" w:cs="Times New Roman"/>
+          <w:sz w:val="24"/>
+          <w:szCs w:val="24"/>
+        </w:rPr>
+        <w:t xml:space="preserve">Fine-Tuning and Zero-Shot Evaluation</w:t>
+      </w:r>
+    </w:p>
+    <w:p>
+      <w:pPr>
+        <w:pStyle w:val="676"/>
+        <w:pBdr/>
+        <w:spacing/>
+        <w:ind w:left="0" w:firstLine="288"/>
+        <w:jc w:val="both"/>
+        <w:rPr/>
+      </w:pPr>
+      <w:r>
+        <w:rPr>
+          <w:rFonts w:ascii="Times New Roman" w:hAnsi="Times New Roman" w:eastAsia="Times New Roman" w:cs="Times New Roman"/>
+          <w:sz w:val="24"/>
+          <w:szCs w:val="24"/>
+        </w:rPr>
+        <w:t xml:space="preserve">We compare two encoders: IndicBERT [7], the ALBERT-based model pretrained on twelve Indian languages, and multilingual BERT (mBERT, cased base) [12]. XLM-R base [13] was planned as a third, but its fixed memory cost under mixed-precision fine-tuning with AdamW (4.14 GiB of weights, gradients and optimiser state) exceeds the 3.68 GiB available on our 4 GB GPU at any batch size, so it was excluded rather than run under a different protocol. Each model is the pretrained encoder with a single linear classification head over the [CLS] representation, trained with cross-entropy loss (Table II). Training uses native, human-written text only, so no transfer measurement is contaminated by our own translations. Every configuration is run with three seeds and reported as mean ± standard deviation. The two encoders share every hyperparameter except one: mBERT on task 2 uses micro-batches of 8 with two-step gradient accumulation, forced by GPU memory, which keeps the effective batch at 16 and leaves the gradient unchanged.</w:t>
+      </w:r>
+    </w:p>
+    <w:p>
+      <w:pPr>
+        <w:pStyle w:val="676"/>
+        <w:keepNext/>
+        <w:spacing w:before="120" w:after="60"/>
+        <w:ind w:left="0"/>
+        <w:jc w:val="center"/>
+      </w:pPr>
+      <w:r>
+        <w:rPr>
+          <w:rFonts w:ascii="Times New Roman" w:hAnsi="Times New Roman" w:eastAsia="Times New Roman" w:cs="Times New Roman"/>
+          <w:sz w:val="20"/>
+          <w:szCs w:val="20"/>
+        </w:rPr>
+        <w:t xml:space="preserve">TABLE II. FINE-TUNING CONFIGURATION</w:t>
+      </w:r>
+    </w:p>
+    <w:tbl>
+      <w:tblPr>
+        <w:tblW w:w="9360" w:type="dxa"/>
+        <w:jc w:val="center"/>
+        <w:tblBorders>
+          <w:top w:val="single" w:sz="8" w:space="0" w:color="000000"/>
+          <w:bottom w:val="single" w:sz="8" w:space="0" w:color="000000"/>
+        </w:tblBorders>
+        <w:tblLayout w:type="fixed"/>
+        <w:tblCellMar>
+          <w:left w:w="80" w:type="dxa"/>
+          <w:right w:w="80" w:type="dxa"/>
+        </w:tblCellMar>
+        <w:tblLook w:val="0000"/>
+      </w:tblPr>
+      <w:tblGrid>
+        <w:gridCol w:w="3960"/>
+        <w:gridCol w:w="2700"/>
+        <w:gridCol w:w="2700"/>
+      </w:tblGrid>
+      <w:tr>
+        <w:trPr>
+          <w:tblHeader/>
+        </w:trPr>
+        <w:tc>
+          <w:tcPr>
+            <w:tcW w:w="3960" w:type="dxa"/>
+            <w:tcBorders>
+              <w:bottom w:val="single" w:sz="8" w:space="0" w:color="000000"/>
+            </w:tcBorders>
+          </w:tcPr>
+          <w:p>
+            <w:pPr>
+              <w:pStyle w:val="676"/>
+              <w:spacing w:before="20" w:after="20"/>
+              <w:ind w:left="0"/>
+              <w:jc w:val="left"/>
+            </w:pPr>
+            <w:r>
+              <w:rPr>
+                <w:rFonts w:ascii="Times New Roman" w:hAnsi="Times New Roman" w:eastAsia="Times New Roman" w:cs="Times New Roman"/>
+                <w:b/>
+                <w:sz w:val="20"/>
+                <w:szCs w:val="20"/>
+              </w:rPr>
+              <w:t xml:space="preserve">Setting</w:t>
+            </w:r>
+          </w:p>
+        </w:tc>
+        <w:tc>
+          <w:tcPr>
+            <w:tcW w:w="2700" w:type="dxa"/>
+            <w:tcBorders>
+              <w:bottom w:val="single" w:sz="8" w:space="0" w:color="000000"/>
+            </w:tcBorders>
+          </w:tcPr>
+          <w:p>
+            <w:pPr>
+              <w:pStyle w:val="676"/>
+              <w:spacing w:before="20" w:after="20"/>
+              <w:ind w:left="0"/>
+              <w:jc w:val="center"/>
+            </w:pPr>
+            <w:r>
+              <w:rPr>
+                <w:rFonts w:ascii="Times New Roman" w:hAnsi="Times New Roman" w:eastAsia="Times New Roman" w:cs="Times New Roman"/>
+                <w:b/>
+                <w:sz w:val="20"/>
+                <w:szCs w:val="20"/>
+              </w:rPr>
+              <w:t xml:space="preserve">Task 2</w:t>
+            </w:r>
+          </w:p>
+        </w:tc>
+        <w:tc>
+          <w:tcPr>
+            <w:tcW w:w="2700" w:type="dxa"/>
+            <w:tcBorders>
+              <w:bottom w:val="single" w:sz="8" w:space="0" w:color="000000"/>
+            </w:tcBorders>
+          </w:tcPr>
+          <w:p>
+            <w:pPr>
+              <w:pStyle w:val="676"/>
+              <w:spacing w:before="20" w:after="20"/>
+              <w:ind w:left="0"/>
+              <w:jc w:val="center"/>
+            </w:pPr>
+            <w:r>
+              <w:rPr>
+                <w:rFonts w:ascii="Times New Roman" w:hAnsi="Times New Roman" w:eastAsia="Times New Roman" w:cs="Times New Roman"/>
+                <w:b/>
+                <w:sz w:val="20"/>
+                <w:szCs w:val="20"/>
+              </w:rPr>
+              <w:t xml:space="preserve">Task 3</w:t>
+            </w:r>
+          </w:p>
+        </w:tc>
+      </w:tr>
+      <w:tr>
+        <w:tc>
+          <w:tcPr>
+            <w:tcW w:w="3960" w:type="dxa"/>
+          </w:tcPr>
+          <w:p>
+            <w:pPr>
+              <w:pStyle w:val="676"/>
+              <w:spacing w:before="20" w:after="20"/>
+              <w:ind w:left="0"/>
+              <w:jc w:val="left"/>
+            </w:pPr>
+            <w:r>
+              <w:rPr>
+                <w:rFonts w:ascii="Times New Roman" w:hAnsi="Times New Roman" w:eastAsia="Times New Roman" w:cs="Times New Roman"/>
+                <w:sz w:val="20"/>
+                <w:szCs w:val="20"/>
+              </w:rPr>
+              <w:t xml:space="preserve">Maximum sequence length</w:t>
+            </w:r>
+          </w:p>
+        </w:tc>
+        <w:tc>
+          <w:tcPr>
+            <w:tcW w:w="2700" w:type="dxa"/>
+          </w:tcPr>
+          <w:p>
+            <w:pPr>
+              <w:pStyle w:val="676"/>
+              <w:spacing w:before="20" w:after="20"/>
+              <w:ind w:left="0"/>
+              <w:jc w:val="center"/>
+            </w:pPr>
+            <w:r>
+              <w:rPr>
+                <w:rFonts w:ascii="Times New Roman" w:hAnsi="Times New Roman" w:eastAsia="Times New Roman" w:cs="Times New Roman"/>
+                <w:sz w:val="20"/>
+                <w:szCs w:val="20"/>
+              </w:rPr>
+              <w:t xml:space="preserve">192</w:t>
+            </w:r>
+          </w:p>
+        </w:tc>
+        <w:tc>
+          <w:tcPr>
+            <w:tcW w:w="2700" w:type="dxa"/>
+          </w:tcPr>
+          <w:p>
+            <w:pPr>
+              <w:pStyle w:val="676"/>
+              <w:spacing w:before="20" w:after="20"/>
+              <w:ind w:left="0"/>
+              <w:jc w:val="center"/>
+            </w:pPr>
+            <w:r>
+              <w:rPr>
+                <w:rFonts w:ascii="Times New Roman" w:hAnsi="Times New Roman" w:eastAsia="Times New Roman" w:cs="Times New Roman"/>
+                <w:sz w:val="20"/>
+                <w:szCs w:val="20"/>
+              </w:rPr>
+              <w:t xml:space="preserve">64</w:t>
+            </w:r>
+          </w:p>
+        </w:tc>
+      </w:tr>
+      <w:tr>
+        <w:tc>
+          <w:tcPr>
+            <w:tcW w:w="3960" w:type="dxa"/>
+          </w:tcPr>
+          <w:p>
+            <w:pPr>
+              <w:pStyle w:val="676"/>
+              <w:spacing w:before="20" w:after="20"/>
+              <w:ind w:left="0"/>
+              <w:jc w:val="left"/>
+            </w:pPr>
+            <w:r>
+              <w:rPr>
+                <w:rFonts w:ascii="Times New Roman" w:hAnsi="Times New Roman" w:eastAsia="Times New Roman" w:cs="Times New Roman"/>
+                <w:sz w:val="20"/>
+                <w:szCs w:val="20"/>
+              </w:rPr>
+              <w:t xml:space="preserve">Batch × accumulation</w:t>
+            </w:r>
+          </w:p>
+        </w:tc>
+        <w:tc>
+          <w:tcPr>
+            <w:tcW w:w="2700" w:type="dxa"/>
+          </w:tcPr>
+          <w:p>
+            <w:pPr>
+              <w:pStyle w:val="676"/>
+              <w:spacing w:before="20" w:after="20"/>
+              <w:ind w:left="0"/>
+              <w:jc w:val="center"/>
+            </w:pPr>
+            <w:r>
+              <w:rPr>
+                <w:rFonts w:ascii="Times New Roman" w:hAnsi="Times New Roman" w:eastAsia="Times New Roman" w:cs="Times New Roman"/>
+                <w:sz w:val="20"/>
+                <w:szCs w:val="20"/>
+              </w:rPr>
+              <w:t xml:space="preserve">16 × 1 (mBERT 8 × 2)</w:t>
+            </w:r>
+          </w:p>
+        </w:tc>
+        <w:tc>
+          <w:tcPr>
+            <w:tcW w:w="2700" w:type="dxa"/>
+          </w:tcPr>
+          <w:p>
+            <w:pPr>
+              <w:pStyle w:val="676"/>
+              <w:spacing w:before="20" w:after="20"/>
+              <w:ind w:left="0"/>
+              <w:jc w:val="center"/>
+            </w:pPr>
+            <w:r>
+              <w:rPr>
+                <w:rFonts w:ascii="Times New Roman" w:hAnsi="Times New Roman" w:eastAsia="Times New Roman" w:cs="Times New Roman"/>
+                <w:sz w:val="20"/>
+                <w:szCs w:val="20"/>
+              </w:rPr>
+              <w:t xml:space="preserve">16 × 1</w:t>
+            </w:r>
+          </w:p>
+        </w:tc>
+      </w:tr>
+      <w:tr>
+        <w:tc>
+          <w:tcPr>
+            <w:tcW w:w="3960" w:type="dxa"/>
+          </w:tcPr>
+          <w:p>
+            <w:pPr>
+              <w:pStyle w:val="676"/>
+              <w:spacing w:before="20" w:after="20"/>
+              <w:ind w:left="0"/>
+              <w:jc w:val="left"/>
+            </w:pPr>
+            <w:r>
+              <w:rPr>
+                <w:rFonts w:ascii="Times New Roman" w:hAnsi="Times New Roman" w:eastAsia="Times New Roman" w:cs="Times New Roman"/>
+                <w:sz w:val="20"/>
+                <w:szCs w:val="20"/>
+              </w:rPr>
+              <w:t xml:space="preserve">Optimiser</w:t>
+            </w:r>
+          </w:p>
+        </w:tc>
+        <w:tc>
+          <w:tcPr>
+            <w:tcW w:w="2700" w:type="dxa"/>
+          </w:tcPr>
+          <w:p>
+            <w:pPr>
+              <w:pStyle w:val="676"/>
+              <w:spacing w:before="20" w:after="20"/>
+              <w:ind w:left="0"/>
+              <w:jc w:val="center"/>
+            </w:pPr>
+            <w:r>
+              <w:rPr>
+                <w:rFonts w:ascii="Times New Roman" w:hAnsi="Times New Roman" w:eastAsia="Times New Roman" w:cs="Times New Roman"/>
+                <w:sz w:val="20"/>
+                <w:szCs w:val="20"/>
+              </w:rPr>
+              <w:t xml:space="preserve">AdamW</w:t>
+            </w:r>
+          </w:p>
+        </w:tc>
+        <w:tc>
+          <w:tcPr>
+            <w:tcW w:w="2700" w:type="dxa"/>
+          </w:tcPr>
+          <w:p>
+            <w:pPr>
+              <w:pStyle w:val="676"/>
+              <w:spacing w:before="20" w:after="20"/>
+              <w:ind w:left="0"/>
+              <w:jc w:val="center"/>
+            </w:pPr>
+            <w:r>
+              <w:rPr>
+                <w:rFonts w:ascii="Times New Roman" w:hAnsi="Times New Roman" w:eastAsia="Times New Roman" w:cs="Times New Roman"/>
+                <w:sz w:val="20"/>
+                <w:szCs w:val="20"/>
+              </w:rPr>
+              <w:t xml:space="preserve">AdamW</w:t>
+            </w:r>
+          </w:p>
+        </w:tc>
+      </w:tr>
+      <w:tr>
+        <w:tc>
+          <w:tcPr>
+            <w:tcW w:w="3960" w:type="dxa"/>
+          </w:tcPr>
+          <w:p>
+            <w:pPr>
+              <w:pStyle w:val="676"/>
+              <w:spacing w:before="20" w:after="20"/>
+              <w:ind w:left="0"/>
+              <w:jc w:val="left"/>
+            </w:pPr>
+            <w:r>
+              <w:rPr>
+                <w:rFonts w:ascii="Times New Roman" w:hAnsi="Times New Roman" w:eastAsia="Times New Roman" w:cs="Times New Roman"/>
+                <w:sz w:val="20"/>
+                <w:szCs w:val="20"/>
+              </w:rPr>
+              <w:t xml:space="preserve">Learning rate</w:t>
+            </w:r>
+          </w:p>
+        </w:tc>
+        <w:tc>
+          <w:tcPr>
+            <w:tcW w:w="2700" w:type="dxa"/>
+          </w:tcPr>
+          <w:p>
+            <w:pPr>
+              <w:pStyle w:val="676"/>
+              <w:spacing w:before="20" w:after="20"/>
+              <w:ind w:left="0"/>
+              <w:jc w:val="center"/>
+            </w:pPr>
+            <w:r>
+              <w:rPr>
+                <w:rFonts w:ascii="Times New Roman" w:hAnsi="Times New Roman" w:eastAsia="Times New Roman" w:cs="Times New Roman"/>
+                <w:sz w:val="20"/>
+                <w:szCs w:val="20"/>
+              </w:rPr>
+              <w:t xml:space="preserve">2 × 10⁻⁵</w:t>
+            </w:r>
+          </w:p>
+        </w:tc>
+        <w:tc>
+          <w:tcPr>
+            <w:tcW w:w="2700" w:type="dxa"/>
+          </w:tcPr>
+          <w:p>
+            <w:pPr>
+              <w:pStyle w:val="676"/>
+              <w:spacing w:before="20" w:after="20"/>
+              <w:ind w:left="0"/>
+              <w:jc w:val="center"/>
+            </w:pPr>
+            <w:r>
+              <w:rPr>
+                <w:rFonts w:ascii="Times New Roman" w:hAnsi="Times New Roman" w:eastAsia="Times New Roman" w:cs="Times New Roman"/>
+                <w:sz w:val="20"/>
+                <w:szCs w:val="20"/>
+              </w:rPr>
+              <w:t xml:space="preserve">3 × 10⁻⁵</w:t>
+            </w:r>
+          </w:p>
+        </w:tc>
+      </w:tr>
+      <w:tr>
+        <w:tc>
+          <w:tcPr>
+            <w:tcW w:w="3960" w:type="dxa"/>
+          </w:tcPr>
+          <w:p>
+            <w:pPr>
+              <w:pStyle w:val="676"/>
+              <w:spacing w:before="20" w:after="20"/>
+              <w:ind w:left="0"/>
+              <w:jc w:val="left"/>
+            </w:pPr>
+            <w:r>
+              <w:rPr>
+                <w:rFonts w:ascii="Times New Roman" w:hAnsi="Times New Roman" w:eastAsia="Times New Roman" w:cs="Times New Roman"/>
+                <w:sz w:val="20"/>
+                <w:szCs w:val="20"/>
+              </w:rPr>
+              <w:t xml:space="preserve">Weight decay</w:t>
+            </w:r>
+          </w:p>
+        </w:tc>
+        <w:tc>
+          <w:tcPr>
+            <w:tcW w:w="2700" w:type="dxa"/>
+          </w:tcPr>
+          <w:p>
+            <w:pPr>
+              <w:pStyle w:val="676"/>
+              <w:spacing w:before="20" w:after="20"/>
+              <w:ind w:left="0"/>
+              <w:jc w:val="center"/>
+            </w:pPr>
+            <w:r>
+              <w:rPr>
+                <w:rFonts w:ascii="Times New Roman" w:hAnsi="Times New Roman" w:eastAsia="Times New Roman" w:cs="Times New Roman"/>
+                <w:sz w:val="20"/>
+                <w:szCs w:val="20"/>
+              </w:rPr>
+              <w:t xml:space="preserve">0.01</w:t>
+            </w:r>
+          </w:p>
+        </w:tc>
+        <w:tc>
+          <w:tcPr>
+            <w:tcW w:w="2700" w:type="dxa"/>
+          </w:tcPr>
+          <w:p>
+            <w:pPr>
+              <w:pStyle w:val="676"/>
+              <w:spacing w:before="20" w:after="20"/>
+              <w:ind w:left="0"/>
+              <w:jc w:val="center"/>
+            </w:pPr>
+            <w:r>
+              <w:rPr>
+                <w:rFonts w:ascii="Times New Roman" w:hAnsi="Times New Roman" w:eastAsia="Times New Roman" w:cs="Times New Roman"/>
+                <w:sz w:val="20"/>
+                <w:szCs w:val="20"/>
+              </w:rPr>
+              <w:t xml:space="preserve">0.01</w:t>
+            </w:r>
+          </w:p>
+        </w:tc>
+      </w:tr>
+      <w:tr>
+        <w:tc>
+          <w:tcPr>
+            <w:tcW w:w="3960" w:type="dxa"/>
+          </w:tcPr>
+          <w:p>
+            <w:pPr>
+              <w:pStyle w:val="676"/>
+              <w:spacing w:before="20" w:after="20"/>
+              <w:ind w:left="0"/>
+              <w:jc w:val="left"/>
+            </w:pPr>
+            <w:r>
+              <w:rPr>
+                <w:rFonts w:ascii="Times New Roman" w:hAnsi="Times New Roman" w:eastAsia="Times New Roman" w:cs="Times New Roman"/>
+                <w:sz w:val="20"/>
+                <w:szCs w:val="20"/>
+              </w:rPr>
+              <w:t xml:space="preserve">Warm-up</w:t>
+            </w:r>
+          </w:p>
+        </w:tc>
+        <w:tc>
+          <w:tcPr>
+            <w:tcW w:w="2700" w:type="dxa"/>
+          </w:tcPr>
+          <w:p>
+            <w:pPr>
+              <w:pStyle w:val="676"/>
+              <w:spacing w:before="20" w:after="20"/>
+              <w:ind w:left="0"/>
+              <w:jc w:val="center"/>
+            </w:pPr>
+            <w:r>
+              <w:rPr>
+                <w:rFonts w:ascii="Times New Roman" w:hAnsi="Times New Roman" w:eastAsia="Times New Roman" w:cs="Times New Roman"/>
+                <w:sz w:val="20"/>
+                <w:szCs w:val="20"/>
+              </w:rPr>
+              <w:t xml:space="preserve">10% of steps</w:t>
+            </w:r>
+          </w:p>
+        </w:tc>
+        <w:tc>
+          <w:tcPr>
+            <w:tcW w:w="2700" w:type="dxa"/>
+          </w:tcPr>
+          <w:p>
+            <w:pPr>
+              <w:pStyle w:val="676"/>
+              <w:spacing w:before="20" w:after="20"/>
+              <w:ind w:left="0"/>
+              <w:jc w:val="center"/>
+            </w:pPr>
+            <w:r>
+              <w:rPr>
+                <w:rFonts w:ascii="Times New Roman" w:hAnsi="Times New Roman" w:eastAsia="Times New Roman" w:cs="Times New Roman"/>
+                <w:sz w:val="20"/>
+                <w:szCs w:val="20"/>
+              </w:rPr>
+              <w:t xml:space="preserve">10% of steps</w:t>
+            </w:r>
+          </w:p>
+        </w:tc>
+      </w:tr>
+      <w:tr>
+        <w:tc>
+          <w:tcPr>
+            <w:tcW w:w="3960" w:type="dxa"/>
+          </w:tcPr>
+          <w:p>
+            <w:pPr>
+              <w:pStyle w:val="676"/>
+              <w:spacing w:before="20" w:after="20"/>
+              <w:ind w:left="0"/>
+              <w:jc w:val="left"/>
+            </w:pPr>
+            <w:r>
+              <w:rPr>
+                <w:rFonts w:ascii="Times New Roman" w:hAnsi="Times New Roman" w:eastAsia="Times New Roman" w:cs="Times New Roman"/>
+                <w:sz w:val="20"/>
+                <w:szCs w:val="20"/>
+              </w:rPr>
+              <w:t xml:space="preserve">Max epochs / early-stopping patience</w:t>
+            </w:r>
+          </w:p>
+        </w:tc>
+        <w:tc>
+          <w:tcPr>
+            <w:tcW w:w="2700" w:type="dxa"/>
+          </w:tcPr>
+          <w:p>
+            <w:pPr>
+              <w:pStyle w:val="676"/>
+              <w:spacing w:before="20" w:after="20"/>
+              <w:ind w:left="0"/>
+              <w:jc w:val="center"/>
+            </w:pPr>
+            <w:r>
+              <w:rPr>
+                <w:rFonts w:ascii="Times New Roman" w:hAnsi="Times New Roman" w:eastAsia="Times New Roman" w:cs="Times New Roman"/>
+                <w:sz w:val="20"/>
+                <w:szCs w:val="20"/>
+              </w:rPr>
+              <w:t xml:space="preserve">20 / 5</w:t>
+            </w:r>
+          </w:p>
+        </w:tc>
+        <w:tc>
+          <w:tcPr>
+            <w:tcW w:w="2700" w:type="dxa"/>
+          </w:tcPr>
+          <w:p>
+            <w:pPr>
+              <w:pStyle w:val="676"/>
+              <w:spacing w:before="20" w:after="20"/>
+              <w:ind w:left="0"/>
+              <w:jc w:val="center"/>
+            </w:pPr>
+            <w:r>
+              <w:rPr>
+                <w:rFonts w:ascii="Times New Roman" w:hAnsi="Times New Roman" w:eastAsia="Times New Roman" w:cs="Times New Roman"/>
+                <w:sz w:val="20"/>
+                <w:szCs w:val="20"/>
+              </w:rPr>
+              <w:t xml:space="preserve">40 / 8</w:t>
+            </w:r>
+          </w:p>
+        </w:tc>
+      </w:tr>
+      <w:tr>
+        <w:tc>
+          <w:tcPr>
+            <w:tcW w:w="3960" w:type="dxa"/>
+          </w:tcPr>
+          <w:p>
+            <w:pPr>
+              <w:pStyle w:val="676"/>
+              <w:spacing w:before="20" w:after="20"/>
+              <w:ind w:left="0"/>
+              <w:jc w:val="left"/>
+            </w:pPr>
+            <w:r>
+              <w:rPr>
+                <w:rFonts w:ascii="Times New Roman" w:hAnsi="Times New Roman" w:eastAsia="Times New Roman" w:cs="Times New Roman"/>
+                <w:sz w:val="20"/>
+                <w:szCs w:val="20"/>
+              </w:rPr>
+              <w:t xml:space="preserve">Dev / test fraction</w:t>
+            </w:r>
+          </w:p>
+        </w:tc>
+        <w:tc>
+          <w:tcPr>
+            <w:tcW w:w="2700" w:type="dxa"/>
+          </w:tcPr>
+          <w:p>
+            <w:pPr>
+              <w:pStyle w:val="676"/>
+              <w:spacing w:before="20" w:after="20"/>
+              <w:ind w:left="0"/>
+              <w:jc w:val="center"/>
+            </w:pPr>
+            <w:r>
+              <w:rPr>
+                <w:rFonts w:ascii="Times New Roman" w:hAnsi="Times New Roman" w:eastAsia="Times New Roman" w:cs="Times New Roman"/>
+                <w:sz w:val="20"/>
+                <w:szCs w:val="20"/>
+              </w:rPr>
+              <w:t xml:space="preserve">0.10 / 0.10</w:t>
+            </w:r>
+          </w:p>
+        </w:tc>
+        <w:tc>
+          <w:tcPr>
+            <w:tcW w:w="2700" w:type="dxa"/>
+          </w:tcPr>
+          <w:p>
+            <w:pPr>
+              <w:pStyle w:val="676"/>
+              <w:spacing w:before="20" w:after="20"/>
+              <w:ind w:left="0"/>
+              <w:jc w:val="center"/>
+            </w:pPr>
+            <w:r>
+              <w:rPr>
+                <w:rFonts w:ascii="Times New Roman" w:hAnsi="Times New Roman" w:eastAsia="Times New Roman" w:cs="Times New Roman"/>
+                <w:sz w:val="20"/>
+                <w:szCs w:val="20"/>
+              </w:rPr>
+              <w:t xml:space="preserve">0.15 / 0.15</w:t>
+            </w:r>
+          </w:p>
+        </w:tc>
+      </w:tr>
+      <w:tr>
+        <w:tc>
+          <w:tcPr>
+            <w:tcW w:w="3960" w:type="dxa"/>
+          </w:tcPr>
+          <w:p>
+            <w:pPr>
+              <w:pStyle w:val="676"/>
+              <w:spacing w:before="20" w:after="20"/>
+              <w:ind w:left="0"/>
+              <w:jc w:val="left"/>
+            </w:pPr>
+            <w:r>
+              <w:rPr>
+                <w:rFonts w:ascii="Times New Roman" w:hAnsi="Times New Roman" w:eastAsia="Times New Roman" w:cs="Times New Roman"/>
+                <w:sz w:val="20"/>
+                <w:szCs w:val="20"/>
+              </w:rPr>
+              <w:t xml:space="preserve">Precision</w:t>
+            </w:r>
+          </w:p>
+        </w:tc>
+        <w:tc>
+          <w:tcPr>
+            <w:tcW w:w="2700" w:type="dxa"/>
+          </w:tcPr>
+          <w:p>
+            <w:pPr>
+              <w:pStyle w:val="676"/>
+              <w:spacing w:before="20" w:after="20"/>
+              <w:ind w:left="0"/>
+              <w:jc w:val="center"/>
+            </w:pPr>
+            <w:r>
+              <w:rPr>
+                <w:rFonts w:ascii="Times New Roman" w:hAnsi="Times New Roman" w:eastAsia="Times New Roman" w:cs="Times New Roman"/>
+                <w:sz w:val="20"/>
+                <w:szCs w:val="20"/>
+              </w:rPr>
+              <w:t xml:space="preserve">fp16 mixed</w:t>
+            </w:r>
+          </w:p>
+        </w:tc>
+        <w:tc>
+          <w:tcPr>
+            <w:tcW w:w="2700" w:type="dxa"/>
+          </w:tcPr>
+          <w:p>
+            <w:pPr>
+              <w:pStyle w:val="676"/>
+              <w:spacing w:before="20" w:after="20"/>
+              <w:ind w:left="0"/>
+              <w:jc w:val="center"/>
+            </w:pPr>
+            <w:r>
+              <w:rPr>
+                <w:rFonts w:ascii="Times New Roman" w:hAnsi="Times New Roman" w:eastAsia="Times New Roman" w:cs="Times New Roman"/>
+                <w:sz w:val="20"/>
+                <w:szCs w:val="20"/>
+              </w:rPr>
+              <w:t xml:space="preserve">fp16 mixed</w:t>
+            </w:r>
+          </w:p>
+        </w:tc>
+      </w:tr>
+      <w:tr>
+        <w:tc>
+          <w:tcPr>
+            <w:tcW w:w="3960" w:type="dxa"/>
+          </w:tcPr>
+          <w:p>
+            <w:pPr>
+              <w:pStyle w:val="676"/>
+              <w:spacing w:before="20" w:after="20"/>
+              <w:ind w:left="0"/>
+              <w:jc w:val="left"/>
+            </w:pPr>
+            <w:r>
+              <w:rPr>
+                <w:rFonts w:ascii="Times New Roman" w:hAnsi="Times New Roman" w:eastAsia="Times New Roman" w:cs="Times New Roman"/>
+                <w:sz w:val="20"/>
+                <w:szCs w:val="20"/>
+              </w:rPr>
+              <w:t xml:space="preserve">Seeds</w:t>
+            </w:r>
+          </w:p>
+        </w:tc>
+        <w:tc>
+          <w:tcPr>
+            <w:tcW w:w="2700" w:type="dxa"/>
+          </w:tcPr>
+          <w:p>
+            <w:pPr>
+              <w:pStyle w:val="676"/>
+              <w:spacing w:before="20" w:after="20"/>
+              <w:ind w:left="0"/>
+              <w:jc w:val="center"/>
+            </w:pPr>
+            <w:r>
+              <w:rPr>
+                <w:rFonts w:ascii="Times New Roman" w:hAnsi="Times New Roman" w:eastAsia="Times New Roman" w:cs="Times New Roman"/>
+                <w:sz w:val="20"/>
+                <w:szCs w:val="20"/>
+              </w:rPr>
+              <w:t xml:space="preserve">3</w:t>
+            </w:r>
+          </w:p>
+        </w:tc>
+        <w:tc>
+          <w:tcPr>
+            <w:tcW w:w="2700" w:type="dxa"/>
+          </w:tcPr>
+          <w:p>
+            <w:pPr>
+              <w:pStyle w:val="676"/>
+              <w:spacing w:before="20" w:after="20"/>
+              <w:ind w:left="0"/>
+              <w:jc w:val="center"/>
+            </w:pPr>
+            <w:r>
+              <w:rPr>
+                <w:rFonts w:ascii="Times New Roman" w:hAnsi="Times New Roman" w:eastAsia="Times New Roman" w:cs="Times New Roman"/>
+                <w:sz w:val="20"/>
+                <w:szCs w:val="20"/>
+              </w:rPr>
+              <w:t xml:space="preserve">3</w:t>
+            </w:r>
+          </w:p>
+        </w:tc>
+      </w:tr>
+    </w:tbl>
+    <w:p>
+      <w:pPr>
+        <w:pStyle w:val="676"/>
+        <w:spacing w:after="0"/>
+        <w:ind w:left="0"/>
+      </w:pPr>
+    </w:p>
+    <w:p>
+      <w:pPr>
+        <w:pStyle w:val="676"/>
+        <w:pBdr/>
+        <w:spacing/>
+        <w:ind w:left="0" w:firstLine="288"/>
+        <w:jc w:val="both"/>
+        <w:rPr/>
+      </w:pPr>
+      <w:r>
+        <w:rPr>
+          <w:rFonts w:ascii="Times New Roman" w:hAnsi="Times New Roman" w:eastAsia="Times New Roman" w:cs="Times New Roman"/>
+          <w:sz w:val="24"/>
+          <w:szCs w:val="24"/>
+        </w:rPr>
+        <w:t xml:space="preserve">Each source model is first checked against IndicFinNLP's published in-language macro-F1, with a tolerance of ±0.02, and any shortfall must be diagnosed before transfer results are read. This ensures that a transfer gap cannot be an artefact of a badly trained source model.</w:t>
+      </w:r>
+    </w:p>
+    <w:p>
+      <w:pPr>
+        <w:pStyle w:val="676"/>
+        <w:pBdr/>
+        <w:spacing/>
+        <w:ind w:left="0" w:firstLine="288"/>
+        <w:jc w:val="both"/>
+        <w:rPr/>
+      </w:pPr>
+      <w:r>
+        <w:rPr>
+          <w:rFonts w:ascii="Times New Roman" w:hAnsi="Times New Roman" w:eastAsia="Times New Roman" w:cs="Times New Roman"/>
+          <w:sz w:val="24"/>
+          <w:szCs w:val="24"/>
+        </w:rPr>
+        <w:t xml:space="preserve">Evaluation is strictly zero-shot. Checkpoints are loaded read-only, and the inference path asserts that no optimiser exists and no gradient step is taken. Every prediction is logged per instance: item, gold label, predicted label and class probabilities. Macro-F1 is the primary metric, with accuracy and per-class F1 alongside, and 95% confidence intervals come from a 1,000-sample bootstrap over items, computed per seed. Following XTREME [14], the transfer gap from source </w:t>
+      </w:r>
+      <w:r>
+        <w:rPr>
+          <w:rFonts w:ascii="Times New Roman" w:hAnsi="Times New Roman" w:eastAsia="Times New Roman" w:cs="Times New Roman"/>
+          <w:i/>
+          <w:sz w:val="24"/>
+          <w:szCs w:val="24"/>
+        </w:rPr>
+        <w:t xml:space="preserve">s</w:t>
+      </w:r>
+      <w:r>
+        <w:rPr>
+          <w:rFonts w:ascii="Times New Roman" w:hAnsi="Times New Roman" w:eastAsia="Times New Roman" w:cs="Times New Roman"/>
+          <w:sz w:val="24"/>
+          <w:szCs w:val="24"/>
+        </w:rPr>
+        <w:t xml:space="preserve"> to target </w:t>
+      </w:r>
+      <w:r>
+        <w:rPr>
+          <w:rFonts w:ascii="Times New Roman" w:hAnsi="Times New Roman" w:eastAsia="Times New Roman" w:cs="Times New Roman"/>
+          <w:i/>
+          <w:sz w:val="24"/>
+          <w:szCs w:val="24"/>
+        </w:rPr>
+        <w:t xml:space="preserve">t</w:t>
+      </w:r>
+      <w:r>
+        <w:rPr>
+          <w:rFonts w:ascii="Times New Roman" w:hAnsi="Times New Roman" w:eastAsia="Times New Roman" w:cs="Times New Roman"/>
+          <w:sz w:val="24"/>
+          <w:szCs w:val="24"/>
+        </w:rPr>
+        <w:t xml:space="preserve"> is the source's in-language score minus the target score,</w:t>
+      </w:r>
+    </w:p>
+    <w:p>
+      <w:pPr>
+        <w:pStyle w:val="676"/>
+        <w:tabs>
+          <w:tab w:val="center" w:pos="4680"/>
+          <w:tab w:val="right" w:pos="9360"/>
+        </w:tabs>
+        <w:spacing w:before="60" w:after="60"/>
+        <w:ind w:left="0"/>
+      </w:pPr>
+      <w:r>
+        <w:tab/>
+      </w:r>
+      <m:oMath>
+        <m:sSub>
+          <m:e>
+            <m:r>
+              <w:rPr>
+                <w:rFonts w:ascii="Times New Roman" w:hAnsi="Times New Roman" w:eastAsia="Times New Roman" w:cs="Times New Roman"/>
+              </w:rPr>
+              <m:t xml:space="preserve">Δ</m:t>
+            </m:r>
+          </m:e>
+          <m:sub>
+            <m:r>
+              <w:rPr>
+                <w:rFonts w:ascii="Times New Roman" w:hAnsi="Times New Roman" w:eastAsia="Times New Roman" w:cs="Times New Roman"/>
+              </w:rPr>
+              <m:t xml:space="preserve">s→t</m:t>
+            </m:r>
+          </m:sub>
+        </m:sSub>
+        <m:r>
+          <w:rPr>
+            <w:rFonts w:ascii="Times New Roman" w:hAnsi="Times New Roman" w:eastAsia="Times New Roman" w:cs="Times New Roman"/>
+          </w:rPr>
+          <m:t xml:space="preserve"> = </m:t>
+        </m:r>
+        <m:sSub>
+          <m:e>
+            <m:r>
+              <m:rPr>
+                <m:sty m:val="p"/>
+              </m:rPr>
+              <w:rPr>
+                <w:rFonts w:ascii="Times New Roman" w:hAnsi="Times New Roman" w:eastAsia="Times New Roman" w:cs="Times New Roman"/>
+              </w:rPr>
+              <m:t xml:space="preserve">F1</m:t>
+            </m:r>
+          </m:e>
+          <m:sub>
+            <m:r>
+              <w:rPr>
+                <w:rFonts w:ascii="Times New Roman" w:hAnsi="Times New Roman" w:eastAsia="Times New Roman" w:cs="Times New Roman"/>
+              </w:rPr>
+              <m:t xml:space="preserve">s</m:t>
+            </m:r>
+          </m:sub>
+        </m:sSub>
+        <m:r>
+          <w:rPr>
+            <w:rFonts w:ascii="Times New Roman" w:hAnsi="Times New Roman" w:eastAsia="Times New Roman" w:cs="Times New Roman"/>
+          </w:rPr>
+          <m:t xml:space="preserve"> − </m:t>
+        </m:r>
+        <m:sSub>
+          <m:e>
+            <m:r>
+              <m:rPr>
+                <m:sty m:val="p"/>
+              </m:rPr>
+              <w:rPr>
+                <w:rFonts w:ascii="Times New Roman" w:hAnsi="Times New Roman" w:eastAsia="Times New Roman" w:cs="Times New Roman"/>
+              </w:rPr>
+              <m:t xml:space="preserve">F1</m:t>
+            </m:r>
+          </m:e>
+          <m:sub>
+            <m:r>
+              <w:rPr>
+                <w:rFonts w:ascii="Times New Roman" w:hAnsi="Times New Roman" w:eastAsia="Times New Roman" w:cs="Times New Roman"/>
+              </w:rPr>
+              <m:t xml:space="preserve">t</m:t>
+            </m:r>
+          </m:sub>
+        </m:sSub>
+      </m:oMath>
+      <w:r>
+        <w:rPr>
+          <w:rFonts w:ascii="Times New Roman" w:hAnsi="Times New Roman" w:eastAsia="Times New Roman" w:cs="Times New Roman"/>
+          <w:sz w:val="24"/>
+        </w:rPr>
+        <w:tab/>
+        <w:t>(2)</w:t>
+      </w:r>
+    </w:p>
+    <w:p>
+      <w:pPr>
+        <w:pStyle w:val="676"/>
+        <w:pBdr/>
+        <w:spacing/>
+        <w:ind w:left="0" w:firstLine="288"/>
+        <w:jc w:val="both"/>
+        <w:rPr/>
+      </w:pPr>
+      <w:r>
+        <w:rPr>
+          <w:rFonts w:ascii="Times New Roman" w:hAnsi="Times New Roman" w:eastAsia="Times New Roman" w:cs="Times New Roman"/>
+          <w:sz w:val="24"/>
+          <w:szCs w:val="24"/>
+        </w:rPr>
+        <w:t xml:space="preserve">computed on the same underlying items wherever alignment allows, so each model is measured against its own ceiling on identical content. A gap smaller than its own seed standard deviation is not reported as a finding. Three source languages, 21 conditions and three seeds give 63 results per encoder and task, 126 per task. Comparisons between source languages leave out seeds whose source model never moved from its initialisation: such a model scores equally badly in every language, so its near-zero gap would rank it as the best source. These seeds are named in the results and remain in every other figure.</w:t>
+      </w:r>
+    </w:p>
+    <w:p>
+      <w:pPr>
+        <w:pStyle w:val="681"/>
+        <w:numPr>
+          <w:ilvl w:val="0"/>
+          <w:numId w:val="7"/>
+        </w:numPr>
+        <w:pBdr/>
+        <w:spacing/>
+        <w:ind/>
+        <w:jc w:val="left"/>
+        <w:rPr/>
+      </w:pPr>
+      <w:r>
+        <w:rPr>
+          <w:rFonts w:ascii="Times New Roman" w:hAnsi="Times New Roman" w:eastAsia="Times New Roman" w:cs="Times New Roman"/>
+          <w:sz w:val="24"/>
+          <w:szCs w:val="24"/>
+        </w:rPr>
+        <w:t xml:space="preserve">Transfer-Failure Diagnostics</w:t>
+      </w:r>
+    </w:p>
+    <w:p>
+      <w:pPr>
+        <w:pStyle w:val="676"/>
+        <w:pBdr/>
+        <w:spacing/>
+        <w:ind w:left="0" w:firstLine="288"/>
+        <w:jc w:val="both"/>
+        <w:rPr/>
+      </w:pPr>
+      <w:r>
+        <w:rPr>
+          <w:rFonts w:ascii="Times New Roman" w:hAnsi="Times New Roman" w:eastAsia="Times New Roman" w:cs="Times New Roman"/>
+          <w:sz w:val="24"/>
+          <w:szCs w:val="24"/>
+        </w:rPr>
+        <w:t xml:space="preserve">A transfer failure is an instance that the model classified correctly in the source language and incorrectly in the target:</w:t>
+      </w:r>
+    </w:p>
+    <w:p>
+      <w:pPr>
+        <w:pStyle w:val="676"/>
+        <w:tabs>
+          <w:tab w:val="center" w:pos="4680"/>
+          <w:tab w:val="right" w:pos="9360"/>
+        </w:tabs>
+        <w:spacing w:before="60" w:after="60"/>
+        <w:ind w:left="0"/>
+      </w:pPr>
+      <w:r>
+        <w:tab/>
+      </w:r>
+      <m:oMath>
+        <m:sSub>
+          <m:e>
+            <m:r>
+              <w:rPr>
+                <w:rFonts w:ascii="Times New Roman" w:hAnsi="Times New Roman" w:eastAsia="Times New Roman" w:cs="Times New Roman"/>
+              </w:rPr>
+              <m:t xml:space="preserve">ŷ</m:t>
+            </m:r>
+          </m:e>
+          <m:sub>
+            <m:r>
+              <w:rPr>
+                <w:rFonts w:ascii="Times New Roman" w:hAnsi="Times New Roman" w:eastAsia="Times New Roman" w:cs="Times New Roman"/>
+              </w:rPr>
+              <m:t xml:space="preserve">s</m:t>
+            </m:r>
+          </m:sub>
+        </m:sSub>
+        <m:r>
+          <w:rPr>
+            <w:rFonts w:ascii="Times New Roman" w:hAnsi="Times New Roman" w:eastAsia="Times New Roman" w:cs="Times New Roman"/>
+          </w:rPr>
+          <m:t xml:space="preserve"> = </m:t>
+        </m:r>
+        <m:r>
+          <w:rPr>
+            <w:rFonts w:ascii="Times New Roman" w:hAnsi="Times New Roman" w:eastAsia="Times New Roman" w:cs="Times New Roman"/>
+          </w:rPr>
+          <m:t xml:space="preserve">y</m:t>
+        </m:r>
+        <m:r>
+          <w:rPr>
+            <w:rFonts w:ascii="Times New Roman" w:hAnsi="Times New Roman" w:eastAsia="Times New Roman" w:cs="Times New Roman"/>
+          </w:rPr>
+          <m:t xml:space="preserve">  ∧  </m:t>
+        </m:r>
+        <m:sSub>
+          <m:e>
+            <m:r>
+              <w:rPr>
+                <w:rFonts w:ascii="Times New Roman" w:hAnsi="Times New Roman" w:eastAsia="Times New Roman" w:cs="Times New Roman"/>
+              </w:rPr>
+              <m:t xml:space="preserve">ŷ</m:t>
+            </m:r>
+          </m:e>
+          <m:sub>
+            <m:r>
+              <w:rPr>
+                <w:rFonts w:ascii="Times New Roman" w:hAnsi="Times New Roman" w:eastAsia="Times New Roman" w:cs="Times New Roman"/>
+              </w:rPr>
+              <m:t xml:space="preserve">t</m:t>
+            </m:r>
+          </m:sub>
+        </m:sSub>
+        <m:r>
+          <w:rPr>
+            <w:rFonts w:ascii="Times New Roman" w:hAnsi="Times New Roman" w:eastAsia="Times New Roman" w:cs="Times New Roman"/>
+          </w:rPr>
+          <m:t xml:space="preserve"> ≠ </m:t>
+        </m:r>
+        <m:r>
+          <w:rPr>
+            <w:rFonts w:ascii="Times New Roman" w:hAnsi="Times New Roman" w:eastAsia="Times New Roman" w:cs="Times New Roman"/>
+          </w:rPr>
+          <m:t xml:space="preserve">y</m:t>
+        </m:r>
+      </m:oMath>
+      <w:r>
+        <w:rPr>
+          <w:rFonts w:ascii="Times New Roman" w:hAnsi="Times New Roman" w:eastAsia="Times New Roman" w:cs="Times New Roman"/>
+          <w:sz w:val="24"/>
+        </w:rPr>
+        <w:tab/>
+        <w:t>(3)</w:t>
+      </w:r>
+    </w:p>
+    <w:p>
+      <w:pPr>
+        <w:pStyle w:val="676"/>
+        <w:pBdr/>
+        <w:spacing/>
+        <w:ind w:left="0" w:firstLine="288"/>
+        <w:jc w:val="both"/>
+        <w:rPr/>
+      </w:pPr>
+      <w:r>
+        <w:rPr>
+          <w:rFonts w:ascii="Times New Roman" w:hAnsi="Times New Roman" w:eastAsia="Times New Roman" w:cs="Times New Roman"/>
+          <w:sz w:val="24"/>
+          <w:szCs w:val="24"/>
+        </w:rPr>
+        <w:t xml:space="preserve">Predictions are joined on (item, seed), so a source prediction is never paired with a target prediction from a different seed. Because the model answered this exact item correctly in the source language, lack of task ability and item difficulty are ruled out by construction.</w:t>
+      </w:r>
+    </w:p>
+    <w:p>
+      <w:pPr>
+        <w:pStyle w:val="676"/>
+        <w:pBdr/>
+        <w:spacing/>
+        <w:ind w:left="0" w:firstLine="288"/>
+        <w:jc w:val="both"/>
+        <w:rPr/>
+      </w:pPr>
+      <w:r>
+        <w:rPr>
+          <w:rFonts w:ascii="Times New Roman" w:hAnsi="Times New Roman" w:eastAsia="Times New Roman" w:cs="Times New Roman"/>
+          <w:sz w:val="24"/>
+          <w:szCs w:val="24"/>
+        </w:rPr>
+        <w:t xml:space="preserve">Each failure receives exactly one cause label from an ordered router, together with an audit trail of every module that fired. </w:t>
+      </w:r>
+      <w:r>
+        <w:rPr>
+          <w:rFonts w:ascii="Times New Roman" w:hAnsi="Times New Roman" w:eastAsia="Times New Roman" w:cs="Times New Roman"/>
+          <w:i/>
+          <w:sz w:val="24"/>
+          <w:szCs w:val="24"/>
+        </w:rPr>
+        <w:t xml:space="preserve">Stage 1</w:t>
+      </w:r>
+      <w:r>
+        <w:rPr>
+          <w:rFonts w:ascii="Times New Roman" w:hAnsi="Times New Roman" w:eastAsia="Times New Roman" w:cs="Times New Roman"/>
+          <w:sz w:val="24"/>
+          <w:szCs w:val="24"/>
+        </w:rPr>
+        <w:t xml:space="preserve"> is a semantic gate: if the LaBSE similarity between the source and target texts is below τ, the failure is labelled </w:t>
+      </w:r>
+      <w:r>
+        <w:rPr>
+          <w:rFonts w:ascii="Times New Roman" w:hAnsi="Times New Roman" w:eastAsia="Times New Roman" w:cs="Times New Roman"/>
+          <w:i/>
+          <w:sz w:val="24"/>
+          <w:szCs w:val="24"/>
+        </w:rPr>
+        <w:t xml:space="preserve">translation_drift</w:t>
+      </w:r>
+      <w:r>
+        <w:rPr>
+          <w:rFonts w:ascii="Times New Roman" w:hAnsi="Times New Roman" w:eastAsia="Times New Roman" w:cs="Times New Roman"/>
+          <w:sz w:val="24"/>
+          <w:szCs w:val="24"/>
+        </w:rPr>
+        <w:t xml:space="preserve"> and goes no further. This ordering is central to the design. If the linguistic modules ran first, noise from our own translations would be attributed to tokenisation or morphology. The gate reuses the corpus similarity module unchanged.</w:t>
+      </w:r>
+    </w:p>
+    <w:p>
+      <w:pPr>
+        <w:pStyle w:val="676"/>
+        <w:pBdr/>
+        <w:spacing/>
+        <w:ind w:left="0" w:firstLine="288"/>
+        <w:jc w:val="both"/>
+        <w:rPr/>
+      </w:pPr>
+      <w:r>
+        <w:rPr>
+          <w:rFonts w:ascii="Times New Roman" w:hAnsi="Times New Roman" w:eastAsia="Times New Roman" w:cs="Times New Roman"/>
+          <w:i/>
+          <w:sz w:val="24"/>
+          <w:szCs w:val="24"/>
+        </w:rPr>
+        <w:t xml:space="preserve">Stage 2</w:t>
+      </w:r>
+      <w:r>
+        <w:rPr>
+          <w:rFonts w:ascii="Times New Roman" w:hAnsi="Times New Roman" w:eastAsia="Times New Roman" w:cs="Times New Roman"/>
+          <w:sz w:val="24"/>
+          <w:szCs w:val="24"/>
+        </w:rPr>
+        <w:t xml:space="preserve"> attributes the remaining failures to linguistic properties of the target text. Tokenizer fragmentation is measured with the encoder's own tokenizer,</w:t>
+      </w:r>
+    </w:p>
+    <w:p>
+      <w:pPr>
+        <w:pStyle w:val="676"/>
+        <w:tabs>
+          <w:tab w:val="center" w:pos="4680"/>
+          <w:tab w:val="right" w:pos="9360"/>
+        </w:tabs>
+        <w:spacing w:before="60" w:after="60"/>
+        <w:ind w:left="0"/>
+      </w:pPr>
+      <w:r>
+        <w:tab/>
+      </w:r>
+      <m:oMath>
+        <m:sSub>
+          <m:e>
+            <m:r>
+              <w:rPr>
+                <w:rFonts w:ascii="Times New Roman" w:hAnsi="Times New Roman" w:eastAsia="Times New Roman" w:cs="Times New Roman"/>
+              </w:rPr>
+              <m:t xml:space="preserve">R</m:t>
+            </m:r>
+          </m:e>
+          <m:sub>
+            <m:r>
+              <m:rPr>
+                <m:sty m:val="p"/>
+              </m:rPr>
+              <w:rPr>
+                <w:rFonts w:ascii="Times New Roman" w:hAnsi="Times New Roman" w:eastAsia="Times New Roman" w:cs="Times New Roman"/>
+              </w:rPr>
+              <m:t xml:space="preserve">frag</m:t>
+            </m:r>
+          </m:sub>
+        </m:sSub>
+        <m:r>
+          <w:rPr>
+            <w:rFonts w:ascii="Times New Roman" w:hAnsi="Times New Roman" w:eastAsia="Times New Roman" w:cs="Times New Roman"/>
+          </w:rPr>
+          <m:t xml:space="preserve"> = </m:t>
+        </m:r>
+        <m:f>
+          <m:num>
+            <m:d>
+              <m:dPr>
+                <m:begChr m:val="|"/>
+                <m:endChr m:val="|"/>
+              </m:dPr>
+              <m:e>
+                <m:r>
+                  <m:rPr>
+                    <m:sty m:val="p"/>
+                  </m:rPr>
+                  <w:rPr>
+                    <w:rFonts w:ascii="Times New Roman" w:hAnsi="Times New Roman" w:eastAsia="Times New Roman" w:cs="Times New Roman"/>
+                  </w:rPr>
+                  <m:t xml:space="preserve">tok</m:t>
+                </m:r>
+                <m:r>
+                  <w:rPr>
+                    <w:rFonts w:ascii="Times New Roman" w:hAnsi="Times New Roman" w:eastAsia="Times New Roman" w:cs="Times New Roman"/>
+                  </w:rPr>
+                  <m:t xml:space="preserve">(</m:t>
+                </m:r>
+                <m:sSub>
+                  <m:e>
+                    <m:r>
+                      <w:rPr>
+                        <w:rFonts w:ascii="Times New Roman" w:hAnsi="Times New Roman" w:eastAsia="Times New Roman" w:cs="Times New Roman"/>
+                      </w:rPr>
+                      <m:t xml:space="preserve">x</m:t>
+                    </m:r>
+                  </m:e>
+                  <m:sub>
+                    <m:r>
+                      <w:rPr>
+                        <w:rFonts w:ascii="Times New Roman" w:hAnsi="Times New Roman" w:eastAsia="Times New Roman" w:cs="Times New Roman"/>
+                      </w:rPr>
+                      <m:t xml:space="preserve">t</m:t>
+                    </m:r>
+                  </m:sub>
+                </m:sSub>
+                <m:r>
+                  <w:rPr>
+                    <w:rFonts w:ascii="Times New Roman" w:hAnsi="Times New Roman" w:eastAsia="Times New Roman" w:cs="Times New Roman"/>
+                  </w:rPr>
+                  <m:t xml:space="preserve">)</m:t>
+                </m:r>
+              </m:e>
+            </m:d>
+          </m:num>
+          <m:den>
+            <m:d>
+              <m:dPr>
+                <m:begChr m:val="|"/>
+                <m:endChr m:val="|"/>
+              </m:dPr>
+              <m:e>
+                <m:r>
+                  <m:rPr>
+                    <m:sty m:val="p"/>
+                  </m:rPr>
+                  <w:rPr>
+                    <w:rFonts w:ascii="Times New Roman" w:hAnsi="Times New Roman" w:eastAsia="Times New Roman" w:cs="Times New Roman"/>
+                  </w:rPr>
+                  <m:t xml:space="preserve">tok</m:t>
+                </m:r>
+                <m:r>
+                  <w:rPr>
+                    <w:rFonts w:ascii="Times New Roman" w:hAnsi="Times New Roman" w:eastAsia="Times New Roman" w:cs="Times New Roman"/>
+                  </w:rPr>
+                  <m:t xml:space="preserve">(</m:t>
+                </m:r>
+                <m:sSub>
+                  <m:e>
+                    <m:r>
+                      <w:rPr>
+                        <w:rFonts w:ascii="Times New Roman" w:hAnsi="Times New Roman" w:eastAsia="Times New Roman" w:cs="Times New Roman"/>
+                      </w:rPr>
+                      <m:t xml:space="preserve">x</m:t>
+                    </m:r>
+                  </m:e>
+                  <m:sub>
+                    <m:r>
+                      <w:rPr>
+                        <w:rFonts w:ascii="Times New Roman" w:hAnsi="Times New Roman" w:eastAsia="Times New Roman" w:cs="Times New Roman"/>
+                      </w:rPr>
+                      <m:t xml:space="preserve">s</m:t>
+                    </m:r>
+                  </m:sub>
+                </m:sSub>
+                <m:r>
+                  <w:rPr>
+                    <w:rFonts w:ascii="Times New Roman" w:hAnsi="Times New Roman" w:eastAsia="Times New Roman" w:cs="Times New Roman"/>
+                  </w:rPr>
+                  <m:t xml:space="preserve">)</m:t>
+                </m:r>
+              </m:e>
+            </m:d>
+          </m:den>
+        </m:f>
+      </m:oMath>
+      <w:r>
+        <w:rPr>
+          <w:rFonts w:ascii="Times New Roman" w:hAnsi="Times New Roman" w:eastAsia="Times New Roman" w:cs="Times New Roman"/>
+          <w:sz w:val="24"/>
+        </w:rPr>
+        <w:tab/>
+        <w:t>(4)</w:t>
+      </w:r>
+    </w:p>
+    <w:p>
+      <w:pPr>
+        <w:pStyle w:val="676"/>
+        <w:pBdr/>
+        <w:spacing/>
+        <w:ind w:left="0" w:firstLine="288"/>
+        <w:jc w:val="both"/>
+        <w:rPr/>
+      </w:pPr>
+      <w:r>
+        <w:rPr>
+          <w:rFonts w:ascii="Times New Roman" w:hAnsi="Times New Roman" w:eastAsia="Times New Roman" w:cs="Times New Roman"/>
+          <w:sz w:val="24"/>
+          <w:szCs w:val="24"/>
+        </w:rPr>
+        <w:t xml:space="preserve">and the module fires when </w:t>
+      </w:r>
+      <w:r>
+        <w:rPr>
+          <w:rFonts w:ascii="Times New Roman" w:hAnsi="Times New Roman" w:eastAsia="Times New Roman" w:cs="Times New Roman"/>
+          <w:i/>
+          <w:sz w:val="24"/>
+          <w:szCs w:val="24"/>
+        </w:rPr>
+        <w:t xml:space="preserve">R</w:t>
+      </w:r>
+      <w:r>
+        <w:rPr>
+          <w:rFonts w:ascii="Times New Roman" w:hAnsi="Times New Roman" w:eastAsia="Times New Roman" w:cs="Times New Roman"/>
+          <w:sz w:val="24"/>
+          <w:szCs w:val="24"/>
+          <w:vertAlign w:val="subscript"/>
+        </w:rPr>
+        <w:t xml:space="preserve">frag</w:t>
+      </w:r>
+      <w:r>
+        <w:rPr>
+          <w:rFonts w:ascii="Times New Roman" w:hAnsi="Times New Roman" w:eastAsia="Times New Roman" w:cs="Times New Roman"/>
+          <w:sz w:val="24"/>
+          <w:szCs w:val="24"/>
+        </w:rPr>
+        <w:t xml:space="preserve"> ≥ 2.0. Morphological masking fires when a financial term from an 18-concept ESG lexicon (curated in Hindi and translated with the corpus translation model) appears in the target only inside an inflected form, its root masked by bound morphology. Stems come from the Indic NLP Library's morphological analyser, falling back to rule-based suffix stripping where no analyser exists; Universal Dependencies has no Malayalam treebank. A stem matches only exactly, with its final codepoint dropped, or with one added vowel sign. Terminology gap fires when Integrated Gradients attributions, computed against a zero-embedding baseline, diverge between the source item and its target counterpart. Its threshold is set per task and encoder at the 95th percentile of divergence on pairs the model classified correctly in both languages, and an attribution whose completeness error exceeds 5% is marked unconverged and never fires. A planned orthographic and numeral-mismatch module was dropped after an audit showed that items whose digit system differs between native and machine-translated text fail at or below the base rate.</w:t>
+      </w:r>
+    </w:p>
+    <w:p>
+      <w:pPr>
+        <w:pStyle w:val="676"/>
+        <w:pBdr/>
+        <w:spacing/>
+        <w:ind w:left="0" w:firstLine="288"/>
+        <w:jc w:val="both"/>
+        <w:rPr/>
+      </w:pPr>
+      <w:r>
+        <w:rPr>
+          <w:rFonts w:ascii="Times New Roman" w:hAnsi="Times New Roman" w:eastAsia="Times New Roman" w:cs="Times New Roman"/>
+          <w:i/>
+          <w:sz w:val="24"/>
+          <w:szCs w:val="24"/>
+        </w:rPr>
+        <w:t xml:space="preserve">Stage 3</w:t>
+      </w:r>
+      <w:r>
+        <w:rPr>
+          <w:rFonts w:ascii="Times New Roman" w:hAnsi="Times New Roman" w:eastAsia="Times New Roman" w:cs="Times New Roman"/>
+          <w:sz w:val="24"/>
+          <w:szCs w:val="24"/>
+        </w:rPr>
+        <w:t xml:space="preserve"> claims only what Stages 1 and 2 leave unattributed. It describes a failure by the item or the model rather than by the target sentence: </w:t>
+      </w:r>
+      <w:r>
+        <w:rPr>
+          <w:rFonts w:ascii="Times New Roman" w:hAnsi="Times New Roman" w:eastAsia="Times New Roman" w:cs="Times New Roman"/>
+          <w:i/>
+          <w:sz w:val="24"/>
+          <w:szCs w:val="24"/>
+        </w:rPr>
+        <w:t xml:space="preserve">provenance_specific</w:t>
+      </w:r>
+      <w:r>
+        <w:rPr>
+          <w:rFonts w:ascii="Times New Roman" w:hAnsi="Times New Roman" w:eastAsia="Times New Roman" w:cs="Times New Roman"/>
+          <w:sz w:val="24"/>
+          <w:szCs w:val="24"/>
+        </w:rPr>
+        <w:t xml:space="preserve"> (the same item and seed is correct on the twin target of the other provenance), </w:t>
+      </w:r>
+      <w:r>
+        <w:rPr>
+          <w:rFonts w:ascii="Times New Roman" w:hAnsi="Times New Roman" w:eastAsia="Times New Roman" w:cs="Times New Roman"/>
+          <w:i/>
+          <w:sz w:val="24"/>
+          <w:szCs w:val="24"/>
+        </w:rPr>
+        <w:t xml:space="preserve">cross_lingual_hard</w:t>
+      </w:r>
+      <w:r>
+        <w:rPr>
+          <w:rFonts w:ascii="Times New Roman" w:hAnsi="Times New Roman" w:eastAsia="Times New Roman" w:cs="Times New Roman"/>
+          <w:sz w:val="24"/>
+          <w:szCs w:val="24"/>
+        </w:rPr>
+        <w:t xml:space="preserve"> (the item fails in all three targets of the same source), </w:t>
+      </w:r>
+      <w:r>
+        <w:rPr>
+          <w:rFonts w:ascii="Times New Roman" w:hAnsi="Times New Roman" w:eastAsia="Times New Roman" w:cs="Times New Roman"/>
+          <w:i/>
+          <w:sz w:val="24"/>
+          <w:szCs w:val="24"/>
+        </w:rPr>
+        <w:t xml:space="preserve">class_collapse</w:t>
+      </w:r>
+      <w:r>
+        <w:rPr>
+          <w:rFonts w:ascii="Times New Roman" w:hAnsi="Times New Roman" w:eastAsia="Times New Roman" w:cs="Times New Roman"/>
+          <w:sz w:val="24"/>
+          <w:szCs w:val="24"/>
+        </w:rPr>
+        <w:t xml:space="preserve"> (the run predicts one class for at least 75% of the condition's rows, and the failure is that class) and </w:t>
+      </w:r>
+      <w:r>
+        <w:rPr>
+          <w:rFonts w:ascii="Times New Roman" w:hAnsi="Times New Roman" w:eastAsia="Times New Roman" w:cs="Times New Roman"/>
+          <w:i/>
+          <w:sz w:val="24"/>
+          <w:szCs w:val="24"/>
+        </w:rPr>
+        <w:t xml:space="preserve">seed_unstable</w:t>
+      </w:r>
+      <w:r>
+        <w:rPr>
+          <w:rFonts w:ascii="Times New Roman" w:hAnsi="Times New Roman" w:eastAsia="Times New Roman" w:cs="Times New Roman"/>
+          <w:sz w:val="24"/>
+          <w:szCs w:val="24"/>
+        </w:rPr>
+        <w:t xml:space="preserve"> (another seed classified the item correctly). Precedence is fixed as </w:t>
+      </w:r>
+      <w:r>
+        <w:rPr>
+          <w:rFonts w:ascii="Times New Roman" w:hAnsi="Times New Roman" w:eastAsia="Times New Roman" w:cs="Times New Roman"/>
+          <w:i/>
+          <w:sz w:val="24"/>
+          <w:szCs w:val="24"/>
+        </w:rPr>
+        <w:t xml:space="preserve">translation_drift</w:t>
+      </w:r>
+      <w:r>
+        <w:rPr>
+          <w:rFonts w:ascii="Times New Roman" w:hAnsi="Times New Roman" w:eastAsia="Times New Roman" w:cs="Times New Roman"/>
+          <w:sz w:val="24"/>
+          <w:szCs w:val="24"/>
+        </w:rPr>
+        <w:t xml:space="preserve">, </w:t>
+      </w:r>
+      <w:r>
+        <w:rPr>
+          <w:rFonts w:ascii="Times New Roman" w:hAnsi="Times New Roman" w:eastAsia="Times New Roman" w:cs="Times New Roman"/>
+          <w:i/>
+          <w:sz w:val="24"/>
+          <w:szCs w:val="24"/>
+        </w:rPr>
+        <w:t xml:space="preserve">tokenizer_fragmentation</w:t>
+      </w:r>
+      <w:r>
+        <w:rPr>
+          <w:rFonts w:ascii="Times New Roman" w:hAnsi="Times New Roman" w:eastAsia="Times New Roman" w:cs="Times New Roman"/>
+          <w:sz w:val="24"/>
+          <w:szCs w:val="24"/>
+        </w:rPr>
+        <w:t xml:space="preserve">, </w:t>
+      </w:r>
+      <w:r>
+        <w:rPr>
+          <w:rFonts w:ascii="Times New Roman" w:hAnsi="Times New Roman" w:eastAsia="Times New Roman" w:cs="Times New Roman"/>
+          <w:i/>
+          <w:sz w:val="24"/>
+          <w:szCs w:val="24"/>
+        </w:rPr>
+        <w:t xml:space="preserve">morphological_masking</w:t>
+      </w:r>
+      <w:r>
+        <w:rPr>
+          <w:rFonts w:ascii="Times New Roman" w:hAnsi="Times New Roman" w:eastAsia="Times New Roman" w:cs="Times New Roman"/>
+          <w:sz w:val="24"/>
+          <w:szCs w:val="24"/>
+        </w:rPr>
+        <w:t xml:space="preserve">, </w:t>
+      </w:r>
+      <w:r>
+        <w:rPr>
+          <w:rFonts w:ascii="Times New Roman" w:hAnsi="Times New Roman" w:eastAsia="Times New Roman" w:cs="Times New Roman"/>
+          <w:i/>
+          <w:sz w:val="24"/>
+          <w:szCs w:val="24"/>
+        </w:rPr>
+        <w:t xml:space="preserve">terminology_gap</w:t>
+      </w:r>
+      <w:r>
+        <w:rPr>
+          <w:rFonts w:ascii="Times New Roman" w:hAnsi="Times New Roman" w:eastAsia="Times New Roman" w:cs="Times New Roman"/>
+          <w:sz w:val="24"/>
+          <w:szCs w:val="24"/>
+        </w:rPr>
+        <w:t xml:space="preserve">, </w:t>
+      </w:r>
+      <w:r>
+        <w:rPr>
+          <w:rFonts w:ascii="Times New Roman" w:hAnsi="Times New Roman" w:eastAsia="Times New Roman" w:cs="Times New Roman"/>
+          <w:i/>
+          <w:sz w:val="24"/>
+          <w:szCs w:val="24"/>
+        </w:rPr>
+        <w:t xml:space="preserve">provenance_specific</w:t>
+      </w:r>
+      <w:r>
+        <w:rPr>
+          <w:rFonts w:ascii="Times New Roman" w:hAnsi="Times New Roman" w:eastAsia="Times New Roman" w:cs="Times New Roman"/>
+          <w:sz w:val="24"/>
+          <w:szCs w:val="24"/>
+        </w:rPr>
+        <w:t xml:space="preserve">, </w:t>
+      </w:r>
+      <w:r>
+        <w:rPr>
+          <w:rFonts w:ascii="Times New Roman" w:hAnsi="Times New Roman" w:eastAsia="Times New Roman" w:cs="Times New Roman"/>
+          <w:i/>
+          <w:sz w:val="24"/>
+          <w:szCs w:val="24"/>
+        </w:rPr>
+        <w:t xml:space="preserve">cross_lingual_hard</w:t>
+      </w:r>
+      <w:r>
+        <w:rPr>
+          <w:rFonts w:ascii="Times New Roman" w:hAnsi="Times New Roman" w:eastAsia="Times New Roman" w:cs="Times New Roman"/>
+          <w:sz w:val="24"/>
+          <w:szCs w:val="24"/>
+        </w:rPr>
+        <w:t xml:space="preserve">, </w:t>
+      </w:r>
+      <w:r>
+        <w:rPr>
+          <w:rFonts w:ascii="Times New Roman" w:hAnsi="Times New Roman" w:eastAsia="Times New Roman" w:cs="Times New Roman"/>
+          <w:i/>
+          <w:sz w:val="24"/>
+          <w:szCs w:val="24"/>
+        </w:rPr>
+        <w:t xml:space="preserve">class_collapse</w:t>
+      </w:r>
+      <w:r>
+        <w:rPr>
+          <w:rFonts w:ascii="Times New Roman" w:hAnsi="Times New Roman" w:eastAsia="Times New Roman" w:cs="Times New Roman"/>
+          <w:sz w:val="24"/>
+          <w:szCs w:val="24"/>
+        </w:rPr>
+        <w:t xml:space="preserve">, </w:t>
+      </w:r>
+      <w:r>
+        <w:rPr>
+          <w:rFonts w:ascii="Times New Roman" w:hAnsi="Times New Roman" w:eastAsia="Times New Roman" w:cs="Times New Roman"/>
+          <w:i/>
+          <w:sz w:val="24"/>
+          <w:szCs w:val="24"/>
+        </w:rPr>
+        <w:t xml:space="preserve">seed_unstable</w:t>
+      </w:r>
+      <w:r>
+        <w:rPr>
+          <w:rFonts w:ascii="Times New Roman" w:hAnsi="Times New Roman" w:eastAsia="Times New Roman" w:cs="Times New Roman"/>
+          <w:sz w:val="24"/>
+          <w:szCs w:val="24"/>
+        </w:rPr>
+        <w:t xml:space="preserve"> and </w:t>
+      </w:r>
+      <w:r>
+        <w:rPr>
+          <w:rFonts w:ascii="Times New Roman" w:hAnsi="Times New Roman" w:eastAsia="Times New Roman" w:cs="Times New Roman"/>
+          <w:i/>
+          <w:sz w:val="24"/>
+          <w:szCs w:val="24"/>
+        </w:rPr>
+        <w:t xml:space="preserve">unattributed</w:t>
+      </w:r>
+      <w:r>
+        <w:rPr>
+          <w:rFonts w:ascii="Times New Roman" w:hAnsi="Times New Roman" w:eastAsia="Times New Roman" w:cs="Times New Roman"/>
+          <w:sz w:val="24"/>
+          <w:szCs w:val="24"/>
+        </w:rPr>
+        <w:t xml:space="preserve">. Each label belongs to one of four groups: linguistic, data, model or unattributed. The </w:t>
+      </w:r>
+      <w:r>
+        <w:rPr>
+          <w:rFonts w:ascii="Times New Roman" w:hAnsi="Times New Roman" w:eastAsia="Times New Roman" w:cs="Times New Roman"/>
+          <w:i/>
+          <w:sz w:val="24"/>
+          <w:szCs w:val="24"/>
+        </w:rPr>
+        <w:t xml:space="preserve">unattributed</w:t>
+      </w:r>
+      <w:r>
+        <w:rPr>
+          <w:rFonts w:ascii="Times New Roman" w:hAnsi="Times New Roman" w:eastAsia="Times New Roman" w:cs="Times New Roman"/>
+          <w:sz w:val="24"/>
+          <w:szCs w:val="24"/>
+        </w:rPr>
+        <w:t xml:space="preserve"> share is reported as an outcome, not hidden. Labels were spot-checked by hand on 200 failures, 50 per target language.</w:t>
+      </w:r>
+    </w:p>
+    <w:p>
+      <w:pPr>
+        <w:pStyle w:val="681"/>
+        <w:numPr>
+          <w:ilvl w:val="0"/>
+          <w:numId w:val="7"/>
+        </w:numPr>
+        <w:pBdr/>
+        <w:spacing/>
+        <w:ind/>
+        <w:jc w:val="left"/>
+        <w:rPr/>
+      </w:pPr>
+      <w:r>
+        <w:rPr>
+          <w:rFonts w:ascii="Times New Roman" w:hAnsi="Times New Roman" w:eastAsia="Times New Roman" w:cs="Times New Roman"/>
+          <w:sz w:val="24"/>
+          <w:szCs w:val="24"/>
+        </w:rPr>
+        <w:t xml:space="preserve">Aggregation and Finding Rule</w:t>
+      </w:r>
+    </w:p>
+    <w:p>
+      <w:pPr>
+        <w:pStyle w:val="676"/>
+        <w:pBdr/>
+        <w:spacing/>
+        <w:ind w:left="0" w:firstLine="288"/>
+        <w:jc w:val="both"/>
+        <w:rPr/>
+      </w:pPr>
+      <w:r>
+        <w:rPr>
+          <w:rFonts w:ascii="Times New Roman" w:hAnsi="Times New Roman" w:eastAsia="Times New Roman" w:cs="Times New Roman"/>
+          <w:sz w:val="24"/>
+          <w:szCs w:val="24"/>
+        </w:rPr>
+        <w:t xml:space="preserve">The unit of analysis is a failed (item, seed) row, and a group's share of a label is the fraction of its failures that carry it. Shares therefore describe what failures consist of. Labels are not compared against correct predictions, so a share does not show that a property makes failure more likely. Each share carries a 95% bootstrap interval that resamples (condition, item) clusters, so an item failing on all three seeds counts once. Groups are compared by target direction, source language, encoder and text provenance. A difference counts as a finding only if the two intervals do not overlap and the difference points the same way on both encoders (on both tasks, for the encoder comparison). This rule was fixed before any table was read. Every comparison is repeated without the source runs that never trained. A difference that a known measurement limit could produce on its own is reported with that caveat attached; for example, Hindi targets can never receive the morphological label, because Hindi writes postpositions as separate words.</w:t>
+      </w:r>
+    </w:p>
+    <w:p>
+      <w:pPr>
+        <w:pStyle w:val="681"/>
+        <w:numPr>
+          <w:ilvl w:val="0"/>
+          <w:numId w:val="7"/>
+        </w:numPr>
+        <w:pBdr/>
+        <w:spacing/>
+        <w:ind/>
+        <w:jc w:val="left"/>
+        <w:rPr/>
+      </w:pPr>
+      <w:r>
+        <w:rPr>
+          <w:rFonts w:ascii="Times New Roman" w:hAnsi="Times New Roman" w:eastAsia="Times New Roman" w:cs="Times New Roman"/>
+          <w:sz w:val="24"/>
+          <w:szCs w:val="24"/>
+        </w:rPr>
+        <w:t xml:space="preserve">Reproducibility</w:t>
+      </w:r>
+    </w:p>
+    <w:p>
+      <w:pPr>
+        <w:pStyle w:val="676"/>
+        <w:pBdr/>
+        <w:spacing/>
+        <w:ind w:left="0" w:firstLine="288"/>
+        <w:jc w:val="both"/>
+        <w:rPr/>
+      </w:pPr>
+      <w:r>
+        <w:rPr>
+          <w:rFonts w:ascii="Times New Roman" w:hAnsi="Times New Roman" w:eastAsia="Times New Roman" w:cs="Times New Roman"/>
+          <w:sz w:val="24"/>
+          <w:szCs w:val="24"/>
+        </w:rPr>
+        <w:t xml:space="preserve">All corpus data is stored as Parquet. Two runs of one configuration produce byte-identical output, and every artefact records its configuration hash. All experiments ran on a single 4 GB laptop GPU (RTX 3050), which shaped three further choices: every GPU job checkpoints after each batch and resumes; batches are halved and retried on out-of-memory errors; and jobs refuse to fall back silently to the CPU, whose float32 arithmetic produces different translations from the GPU's float16.</w:t>
+      </w:r>
     </w:p>
     <w:p>
       <w:pPr>
@@ -3062,6 +6194,82 @@
           <w:lang w:val="en-US"/>
         </w:rPr>
         <w:t xml:space="preserve">, "Multilingual Sentiment Analysis for Under-Resourced Languages: A Systematic Review of the Landscape," IEEE Access, vol. 11, 2023, pp. 15996–16020.</w:t>
+      </w:r>
+      <w:r>
+        <w:rPr>
+          <w:lang w:val="en-US"/>
+        </w:rPr>
+      </w:r>
+    </w:p>
+    <w:p>
+      <w:pPr>
+        <w:pStyle w:val="681"/>
+        <w:numPr>
+          <w:ilvl w:val="0"/>
+          <w:numId w:val="3"/>
+        </w:numPr>
+        <w:pBdr/>
+        <w:spacing w:after="240" w:afterAutospacing="0" w:before="240" w:beforeAutospacing="0"/>
+        <w:ind/>
+        <w:rPr>
+          <w:lang w:val="en-US"/>
+        </w:rPr>
+      </w:pPr>
+      <w:r>
+        <w:rPr>
+          <w:lang w:val="en-US"/>
+        </w:rPr>
+        <w:t xml:space="preserve">Gala et al., "IndicTrans2: Towards High-Quality and Accessible Machine Translation Models for all 22 Scheduled Indian Languages," Transactions on Machine Learning Research (TMLR), 2023.</w:t>
+      </w:r>
+      <w:r>
+        <w:rPr>
+          <w:lang w:val="en-US"/>
+        </w:rPr>
+        <w:t xml:space="preserve"/>
+      </w:r>
+      <w:r>
+        <w:rPr>
+          <w:lang w:val="en-US"/>
+        </w:rPr>
+        <w:t xml:space="preserve"/>
+      </w:r>
+      <w:r>
+        <w:rPr>
+          <w:lang w:val="en-US"/>
+        </w:rPr>
+      </w:r>
+    </w:p>
+    <w:p>
+      <w:pPr>
+        <w:pStyle w:val="681"/>
+        <w:numPr>
+          <w:ilvl w:val="0"/>
+          <w:numId w:val="3"/>
+        </w:numPr>
+        <w:pBdr/>
+        <w:spacing w:after="240" w:afterAutospacing="0" w:before="240" w:beforeAutospacing="0"/>
+        <w:ind/>
+        <w:rPr>
+          <w:lang w:val="en-US"/>
+        </w:rPr>
+      </w:pPr>
+      <w:r>
+        <w:rPr>
+          <w:lang w:val="en-US"/>
+        </w:rPr>
+        <w:t xml:space="preserve">Feng, Yang, Cer, Arivazhagan &amp; Wang, "Language-agnostic BERT Sentence Embedding (LaBSE)," ACL, 2022, pp. 878–891.</w:t>
+      </w:r>
+      <w:r>
+        <w:rPr>
+          <w:lang w:val="en-US"/>
+        </w:rPr>
+        <w:t xml:space="preserve"/>
+      </w:r>
+      <w:r>
+        <w:rPr>
+          <w:lang w:val="en-US"/>
+        </w:rPr>
+        <w:t xml:space="preserve"/>
       </w:r>
       <w:r>
         <w:rPr>
@@ -3996,6 +7204,12 @@
   </w:num>
   <w:num w:numId="6">
     <w:abstractNumId w:val="5"/>
+  </w:num>
+  <w:num w:numId="7">
+    <w:abstractNumId w:val="3"/>
+    <w:lvlOverride w:ilvl="0">
+      <w:startOverride w:val="1"/>
+    </w:lvlOverride>
   </w:num>
 </w:numbering>
 </file>

</xml_diff>

<commit_message>
Paper: write the Conclusion and Future Enhancement section
Conclusion summarises the corpus, the numeral, transfer, encoder and
source-language results, and the diagnostic outcome, and states the
limits. Future Enhancement covers encoders, human verification,
diagnostics, evaluation design and language coverage.
</commit_message>
<xml_diff>
--- a/docs/Cross-Linguistic Transfer Diagnostics for Low-Resource Financial NLP in Indic Languages.docx
+++ b/docs/Cross-Linguistic Transfer Diagnostics for Low-Resource Financial NLP in Indic Languages.docx
@@ -11402,6 +11402,257 @@
     </w:p>
     <w:p>
       <w:pPr>
+        <w:pStyle w:val="681"/>
+        <w:numPr>
+          <w:ilvl w:val="0"/>
+          <w:numId w:val="9"/>
+        </w:numPr>
+        <w:pBdr/>
+        <w:spacing/>
+        <w:ind/>
+        <w:jc w:val="left"/>
+        <w:rPr/>
+      </w:pPr>
+      <w:r>
+        <w:rPr>
+          <w:rFonts w:ascii="Times New Roman" w:hAnsi="Times New Roman" w:eastAsia="Times New Roman" w:cs="Times New Roman"/>
+          <w:sz w:val="24"/>
+          <w:szCs w:val="24"/>
+        </w:rPr>
+        <w:t xml:space="preserve">Conclusion</w:t>
+      </w:r>
+    </w:p>
+    <w:p>
+      <w:pPr>
+        <w:pStyle w:val="676"/>
+        <w:pBdr/>
+        <w:spacing/>
+        <w:ind w:left="0" w:firstLine="288"/>
+        <w:jc w:val="both"/>
+        <w:rPr/>
+      </w:pPr>
+      <w:r>
+        <w:rPr>
+          <w:rFonts w:ascii="Times New Roman" w:hAnsi="Times New Roman" w:eastAsia="Times New Roman" w:cs="Times New Roman"/>
+          <w:sz w:val="24"/>
+          <w:szCs w:val="24"/>
+        </w:rPr>
+        <w:t xml:space="preserve">We asked whether multilingual language models keep financial meaning intact when knowledge moves between Indic languages. To answer it we built a four-way parallel financial corpus in Hindi, Bengali, Telugu and Malayalam from IndicFinNLP. It contains 92,760 machine-translated rows, each kept and flagged rather than filtered, and every row is checked for numeral preservation, structural integrity and semantic similarity against a threshold calibrated on human translations. The independence audit that preceded it changed the design: the sustainability and ESG-theme splits turned out to be the same items in every language, while the numeral split is independently sourced.</w:t>
+      </w:r>
+    </w:p>
+    <w:p>
+      <w:pPr>
+        <w:pStyle w:val="676"/>
+        <w:pBdr/>
+        <w:spacing/>
+        <w:ind w:left="0" w:firstLine="288"/>
+        <w:jc w:val="both"/>
+        <w:rPr/>
+      </w:pPr>
+      <w:r>
+        <w:rPr>
+          <w:rFonts w:ascii="Times New Roman" w:hAnsi="Times New Roman" w:eastAsia="Times New Roman" w:cs="Times New Roman"/>
+          <w:sz w:val="24"/>
+          <w:szCs w:val="24"/>
+        </w:rPr>
+        <w:t xml:space="preserve">Financial numerals are fragile under translation. Roughly one annotated numeral in six does not survive Indic-to-Indic translation intact. No direction of the numeral task reaches 95% preservation of the numerals, currency symbols and percentages in a sentence. Cross-lingual transfer is costly as well. With content held fixed, IndicBERT loses 0.26–0.45 macro-F1 on sustainability classification and mBERT 0.11–0.24, and evaluating on our own translations instead of native text changes the gap by only a few points, so the loss is not an artefact of the corpus. mBERT outperforms IndicBERT in all twelve Hindi-source cells, and the evidence does not support attributing that to tokenisation. On sustainability classification, Hindi, the default choice, is the worst source language on both encoders. There the cost sits mainly in the target language, and moving into a Dravidian language costs more than moving into an Indo-Aryan one. The same direction appears in translation quality on all three tasks, measured by an unrelated method. The ESG-theme task, at 532 headlines over ten classes, is too small to support any comparison of sources.</w:t>
+      </w:r>
+    </w:p>
+    <w:p>
+      <w:pPr>
+        <w:pStyle w:val="676"/>
+        <w:pBdr/>
+        <w:spacing/>
+        <w:ind w:left="0" w:firstLine="288"/>
+        <w:jc w:val="both"/>
+        <w:rPr/>
+      </w:pPr>
+      <w:r>
+        <w:rPr>
+          <w:rFonts w:ascii="Times New Roman" w:hAnsi="Times New Roman" w:eastAsia="Times New Roman" w:cs="Times New Roman"/>
+          <w:sz w:val="24"/>
+          <w:szCs w:val="24"/>
+        </w:rPr>
+        <w:t xml:space="preserve">The diagnostic framework labelled every failure in all 72 (task, encoder, condition) cells, and the labels describe failures rather than explain them. Linguistic labels cover 8.8–12.0% of failures. Most of the rest are described by where they occur: in every target language, on only some seeds, or under a collapsed classifier. Two linguistic modules, morphological masking and terminology gap, did not predict failure better than chance. We therefore report the size and shape of the transfer gap with confidence and its causes as open.</w:t>
+      </w:r>
+    </w:p>
+    <w:p>
+      <w:pPr>
+        <w:pStyle w:val="676"/>
+        <w:pBdr/>
+        <w:spacing/>
+        <w:ind w:left="0" w:firstLine="288"/>
+        <w:jc w:val="both"/>
+        <w:rPr/>
+      </w:pPr>
+      <w:r>
+        <w:rPr>
+          <w:rFonts w:ascii="Times New Roman" w:hAnsi="Times New Roman" w:eastAsia="Times New Roman" w:cs="Times New Roman"/>
+          <w:sz w:val="24"/>
+          <w:szCs w:val="24"/>
+        </w:rPr>
+        <w:t xml:space="preserve">Several limits bound these conclusions. Malayalam has no native text, so Malayalam results combine transfer difficulty with translation quality. Human verification covers a sample of 180 translated rows per task, not the corpus. LaBSE similarity ranks directions reliably but rewards literal translation, so it is not an absolute quality score. Training and evaluation share content across languages by design, so the gaps measure the cost of changing language and not generalisation to unseen sentences. And a single 4 GB GPU ruled out XLM-R, the comparison that would separate model capacity from multilingual breadth.</w:t>
+      </w:r>
+    </w:p>
+    <w:p>
+      <w:pPr>
+        <w:pStyle w:val="681"/>
+        <w:numPr>
+          <w:ilvl w:val="0"/>
+          <w:numId w:val="9"/>
+        </w:numPr>
+        <w:pBdr/>
+        <w:spacing/>
+        <w:ind/>
+        <w:jc w:val="left"/>
+        <w:rPr/>
+      </w:pPr>
+      <w:r>
+        <w:rPr>
+          <w:rFonts w:ascii="Times New Roman" w:hAnsi="Times New Roman" w:eastAsia="Times New Roman" w:cs="Times New Roman"/>
+          <w:sz w:val="24"/>
+          <w:szCs w:val="24"/>
+        </w:rPr>
+        <w:t xml:space="preserve">Future Enhancement</w:t>
+      </w:r>
+    </w:p>
+    <w:p>
+      <w:pPr>
+        <w:pStyle w:val="676"/>
+        <w:pBdr/>
+        <w:spacing/>
+        <w:ind w:left="0" w:firstLine="288"/>
+        <w:jc w:val="both"/>
+        <w:rPr/>
+      </w:pPr>
+      <w:r>
+        <w:rPr>
+          <w:rFonts w:ascii="Times New Roman" w:hAnsi="Times New Roman" w:eastAsia="Times New Roman" w:cs="Times New Roman"/>
+          <w:i/>
+          <w:sz w:val="24"/>
+          <w:szCs w:val="24"/>
+        </w:rPr>
+        <w:t xml:space="preserve">Encoders.</w:t>
+      </w:r>
+      <w:r>
+        <w:rPr>
+          <w:rFonts w:ascii="Times New Roman" w:hAnsi="Times New Roman" w:eastAsia="Times New Roman" w:cs="Times New Roman"/>
+          <w:sz w:val="24"/>
+          <w:szCs w:val="24"/>
+        </w:rPr>
+        <w:t xml:space="preserve"> Running XLM-R [13] against mBERT on larger hardware would isolate the effect of multilingual breadth at fixed capacity and settle whether mBERT's advantage comes from capacity. The BERT-based IndicBERT-v2 [8] would test the same question for an Indic-specific model with a full-size transformer body.</w:t>
+      </w:r>
+    </w:p>
+    <w:p>
+      <w:pPr>
+        <w:pStyle w:val="676"/>
+        <w:pBdr/>
+        <w:spacing/>
+        <w:ind w:left="0" w:firstLine="288"/>
+        <w:jc w:val="both"/>
+        <w:rPr/>
+      </w:pPr>
+      <w:r>
+        <w:rPr>
+          <w:rFonts w:ascii="Times New Roman" w:hAnsi="Times New Roman" w:eastAsia="Times New Roman" w:cs="Times New Roman"/>
+          <w:i/>
+          <w:sz w:val="24"/>
+          <w:szCs w:val="24"/>
+        </w:rPr>
+        <w:t xml:space="preserve">Human verification.</w:t>
+      </w:r>
+      <w:r>
+        <w:rPr>
+          <w:rFonts w:ascii="Times New Roman" w:hAnsi="Times New Roman" w:eastAsia="Times New Roman" w:cs="Times New Roman"/>
+          <w:sz w:val="24"/>
+          <w:szCs w:val="24"/>
+        </w:rPr>
+        <w:t xml:space="preserve"> A native-speaker review of each target language, beyond the current maintainer sample, would establish adequacy where the automated checks can establish only that numerals, labels and script survived. A small native Malayalam test set would separate Malayalam transfer from Malayalam translation.</w:t>
+      </w:r>
+    </w:p>
+    <w:p>
+      <w:pPr>
+        <w:pStyle w:val="676"/>
+        <w:pBdr/>
+        <w:spacing/>
+        <w:ind w:left="0" w:firstLine="288"/>
+        <w:jc w:val="both"/>
+        <w:rPr/>
+      </w:pPr>
+      <w:r>
+        <w:rPr>
+          <w:rFonts w:ascii="Times New Roman" w:hAnsi="Times New Roman" w:eastAsia="Times New Roman" w:cs="Times New Roman"/>
+          <w:i/>
+          <w:sz w:val="24"/>
+          <w:szCs w:val="24"/>
+        </w:rPr>
+        <w:t xml:space="preserve">Diagnostics.</w:t>
+      </w:r>
+      <w:r>
+        <w:rPr>
+          <w:rFonts w:ascii="Times New Roman" w:hAnsi="Times New Roman" w:eastAsia="Times New Roman" w:cs="Times New Roman"/>
+          <w:sz w:val="24"/>
+          <w:szCs w:val="24"/>
+        </w:rPr>
+        <w:t xml:space="preserve"> Comparing each label's rate on failures with its rate on correct predictions would show whether a property makes failure more likely, which shares of failures alone cannot. The morphology and terminology modules need either redesign or an intervention test, such as restoring a masked term and measuring the change in prediction. The numeral module excluded from this build could be rebuilt on task 1's span annotations.</w:t>
+      </w:r>
+    </w:p>
+    <w:p>
+      <w:pPr>
+        <w:pStyle w:val="676"/>
+        <w:pBdr/>
+        <w:spacing/>
+        <w:ind w:left="0" w:firstLine="288"/>
+        <w:jc w:val="both"/>
+        <w:rPr/>
+      </w:pPr>
+      <w:r>
+        <w:rPr>
+          <w:rFonts w:ascii="Times New Roman" w:hAnsi="Times New Roman" w:eastAsia="Times New Roman" w:cs="Times New Roman"/>
+          <w:i/>
+          <w:sz w:val="24"/>
+          <w:szCs w:val="24"/>
+        </w:rPr>
+        <w:t xml:space="preserve">Evaluation.</w:t>
+      </w:r>
+      <w:r>
+        <w:rPr>
+          <w:rFonts w:ascii="Times New Roman" w:hAnsi="Times New Roman" w:eastAsia="Times New Roman" w:cs="Times New Roman"/>
+          <w:sz w:val="24"/>
+          <w:szCs w:val="24"/>
+        </w:rPr>
+        <w:t xml:space="preserve"> Task 1 is the one independently sourced task, so treating numeral detection as a transfer task would give a measurement free of shared content. Training on one item partition and evaluating on the other would add a held-out estimate beside the fixed-content gap reported here. Few-shot target-language training [11], [15] and translate-train [9], [18] would show how much of the gap a small amount of target data or translated training data recovers. For the ESG-theme task, paraphrase augmentation, as used by IndicFinNLP [1], would lift it off its data ceiling.</w:t>
+      </w:r>
+    </w:p>
+    <w:p>
+      <w:pPr>
+        <w:pStyle w:val="676"/>
+        <w:pBdr/>
+        <w:spacing/>
+        <w:ind w:left="0" w:firstLine="288"/>
+        <w:jc w:val="both"/>
+        <w:rPr/>
+      </w:pPr>
+      <w:r>
+        <w:rPr>
+          <w:rFonts w:ascii="Times New Roman" w:hAnsi="Times New Roman" w:eastAsia="Times New Roman" w:cs="Times New Roman"/>
+          <w:i/>
+          <w:sz w:val="24"/>
+          <w:szCs w:val="24"/>
+        </w:rPr>
+        <w:t xml:space="preserve">Coverage.</w:t>
+      </w:r>
+      <w:r>
+        <w:rPr>
+          <w:rFonts w:ascii="Times New Roman" w:hAnsi="Times New Roman" w:eastAsia="Times New Roman" w:cs="Times New Roman"/>
+          <w:sz w:val="24"/>
+          <w:szCs w:val="24"/>
+        </w:rPr>
+        <w:t xml:space="preserve"> IndicTrans2 covers all 22 scheduled Indian languages [21], so the pipeline extends to further Dravidian and Indo-Aryan languages with configuration changes only. That would test whether the into-Dravidian penalty holds beyond Telugu and Malayalam.</w:t>
+      </w:r>
+    </w:p>
+    <w:p>
+      <w:pPr>
         <w:pStyle w:val="676"/>
         <w:pBdr/>
         <w:spacing/>
@@ -12988,6 +13239,12 @@
     </w:lvlOverride>
   </w:num>
   <w:num w:numId="8">
+    <w:abstractNumId w:val="3"/>
+    <w:lvlOverride w:ilvl="0">
+      <w:startOverride w:val="1"/>
+    </w:lvlOverride>
+  </w:num>
+  <w:num w:numId="9">
     <w:abstractNumId w:val="3"/>
     <w:lvlOverride w:ilvl="0">
       <w:startOverride w:val="1"/>

</xml_diff>

<commit_message>
Paper: rewrite the abstract and introduction
Restores the words and hyphens lost from both, and brings them in line
with the written sections: IndicBERT (the ALBERT checkpoint actually
used) instead of IndicBERT-v2, a three-stage router run over all 72
conditions instead of one, and current headline figures. Adds a
section roadmap and sets the introduction in the paper's body font.
</commit_message>
<xml_diff>
--- a/docs/Cross-Linguistic Transfer Diagnostics for Low-Resource Financial NLP in Indic Languages.docx
+++ b/docs/Cross-Linguistic Transfer Diagnostics for Low-Resource Financial NLP in Indic Languages.docx
@@ -71,18 +71,22 @@
     </w:p>
     <w:p>
       <w:pPr>
-        <w:pBdr/>
-        <w:spacing/>
-        <w:ind/>
+        <w:pStyle w:val="676"/>
+        <w:pBdr/>
+        <w:spacing/>
+        <w:ind w:left="0"/>
+        <w:jc w:val="both"/>
         <w:rPr/>
       </w:pPr>
       <w:r>
         <w:rPr>
           <w:rFonts w:ascii="Times New Roman" w:hAnsi="Times New Roman" w:eastAsia="Times New Roman" w:cs="Times New Roman"/>
+          <w:b/>
+          <w:i/>
           <w:sz w:val="24"/>
           <w:szCs w:val="24"/>
         </w:rPr>
-        <w:t xml:space="preserve">Abstract— </w:t>
+        <w:t xml:space="preserve">Abstract—</w:t>
       </w:r>
       <w:r>
         <w:rPr>
@@ -90,289 +94,8 @@
           <w:sz w:val="24"/>
           <w:szCs w:val="24"/>
         </w:rPr>
-        <w:t xml:space="preserve">Multilingual language models work well on </w:t>
+        <w:t xml:space="preserve">Multilingual language models transfer well on general language-understanding benchmarks, but it is not known whether they preserve financial meaning across Indic languages. IndicFinNLP was built for single-language baselines, and its language splits differ in topic, entity and difficulty, which confounds any comparison across languages. We build a controlled parallel corpus from IndicFinNLP in Hindi, Bengali, Telugu and Malayalam, translating each native split directly between Indic languages with IndicTrans2 into 92,760 machine-translated rows with labels unchanged. Every row is checked for numeral preservation, structural integrity and LaBSE similarity against a threshold calibrated on human translations, and is flagged rather than dropped. An independence audit shows that the sustainability and ESG-theme splits are already parallel, while the numeral split is independently sourced. About one annotated financial numeral in six does not survive translation intact. We fine-tune IndicBERT and mBERT on one language and test zero-shot on the others with content held fixed. On sustainability classification this costs 0.26–0.45 macro-F1 with IndicBERT and 0.11–0.24 with mBERT, and Hindi is the worst source language for both. mBERT outperforms IndicBERT in all twelve Hindi-source cells. Moving into a Dravidian language costs more than moving into an Indo-Aryan one, both in sustainability transfer and in translation quality. A three-stage diagnostic router assigns each failure in 72 conditions a single cause. Linguistic causes account for only 8.8–12.0% of failures, and two linguistic modules predict failure no better than chance. We therefore report the size and shape of the transfer gap and leave its causes open.</w:t>
       </w:r>
-      <w:r>
-        <w:rPr>
-          <w:rFonts w:ascii="Times New Roman" w:hAnsi="Times New Roman" w:eastAsia="Times New Roman" w:cs="Times New Roman"/>
-          <w:sz w:val="24"/>
-          <w:szCs w:val="24"/>
-        </w:rPr>
-        <w:t xml:space="preserve">tasks.</w:t>
-      </w:r>
-      <w:r>
-        <w:rPr>
-          <w:rFonts w:ascii="Times New Roman" w:hAnsi="Times New Roman" w:eastAsia="Times New Roman" w:cs="Times New Roman"/>
-          <w:sz w:val="24"/>
-          <w:szCs w:val="24"/>
-        </w:rPr>
-        <w:t xml:space="preserve"> We still </w:t>
-      </w:r>
-      <w:r>
-        <w:rPr>
-          <w:rFonts w:ascii="Times New Roman" w:hAnsi="Times New Roman" w:eastAsia="Times New Roman" w:cs="Times New Roman"/>
-          <w:sz w:val="24"/>
-          <w:szCs w:val="24"/>
-        </w:rPr>
-        <w:t xml:space="preserve">don't</w:t>
-      </w:r>
-      <w:r>
-        <w:rPr>
-          <w:rFonts w:ascii="Times New Roman" w:hAnsi="Times New Roman" w:eastAsia="Times New Roman" w:cs="Times New Roman"/>
-          <w:sz w:val="24"/>
-          <w:szCs w:val="24"/>
-        </w:rPr>
-        <w:t xml:space="preserve"> know if they keep financial meaning the same across Indic languages. Current benchmarks like </w:t>
-      </w:r>
-      <w:r>
-        <w:rPr>
-          <w:rFonts w:ascii="Times New Roman" w:hAnsi="Times New Roman" w:eastAsia="Times New Roman" w:cs="Times New Roman"/>
-          <w:sz w:val="24"/>
-          <w:szCs w:val="24"/>
-        </w:rPr>
-        <w:t xml:space="preserve">IndicFinNLP</w:t>
-      </w:r>
-      <w:r>
-        <w:rPr>
-          <w:rFonts w:ascii="Times New Roman" w:hAnsi="Times New Roman" w:eastAsia="Times New Roman" w:cs="Times New Roman"/>
-          <w:sz w:val="24"/>
-          <w:szCs w:val="24"/>
-        </w:rPr>
-        <w:t xml:space="preserve"> mix language effects with differences in topic, </w:t>
-      </w:r>
-      <w:r>
-        <w:rPr>
-          <w:rFonts w:ascii="Times New Roman" w:hAnsi="Times New Roman" w:eastAsia="Times New Roman" w:cs="Times New Roman"/>
-          <w:sz w:val="24"/>
-          <w:szCs w:val="24"/>
-        </w:rPr>
-        <w:t xml:space="preserve">entity</w:t>
-      </w:r>
-      <w:r>
-        <w:rPr>
-          <w:rFonts w:ascii="Times New Roman" w:hAnsi="Times New Roman" w:eastAsia="Times New Roman" w:cs="Times New Roman"/>
-          <w:sz w:val="24"/>
-          <w:szCs w:val="24"/>
-        </w:rPr>
-        <w:t xml:space="preserve"> and difficulty. That makes it hard to understand transfer gaps. We create a controlled evaluation corpus based on </w:t>
-      </w:r>
-      <w:r>
-        <w:rPr>
-          <w:rFonts w:ascii="Times New Roman" w:hAnsi="Times New Roman" w:eastAsia="Times New Roman" w:cs="Times New Roman"/>
-          <w:sz w:val="24"/>
-          <w:szCs w:val="24"/>
-        </w:rPr>
-        <w:t xml:space="preserve">IndicFinNLP</w:t>
-      </w:r>
-      <w:r>
-        <w:rPr>
-          <w:rFonts w:ascii="Times New Roman" w:hAnsi="Times New Roman" w:eastAsia="Times New Roman" w:cs="Times New Roman"/>
-          <w:sz w:val="24"/>
-          <w:szCs w:val="24"/>
-        </w:rPr>
-        <w:t xml:space="preserve"> using Hindi, Bengali, </w:t>
-      </w:r>
-      <w:r>
-        <w:rPr>
-          <w:rFonts w:ascii="Times New Roman" w:hAnsi="Times New Roman" w:eastAsia="Times New Roman" w:cs="Times New Roman"/>
-          <w:sz w:val="24"/>
-          <w:szCs w:val="24"/>
-        </w:rPr>
-        <w:t xml:space="preserve">Telugu</w:t>
-      </w:r>
-      <w:r>
-        <w:rPr>
-          <w:rFonts w:ascii="Times New Roman" w:hAnsi="Times New Roman" w:eastAsia="Times New Roman" w:cs="Times New Roman"/>
-          <w:sz w:val="24"/>
-          <w:szCs w:val="24"/>
-        </w:rPr>
-        <w:t xml:space="preserve"> and Malayalam. The task labels stay the same. We use machine translation with IndicTrans2 </w:t>
-      </w:r>
-      <w:r>
-        <w:rPr>
-          <w:rFonts w:ascii="Times New Roman" w:hAnsi="Times New Roman" w:eastAsia="Times New Roman" w:cs="Times New Roman"/>
-          <w:sz w:val="24"/>
-          <w:szCs w:val="24"/>
-        </w:rPr>
-        <w:t xml:space="preserve">on</w:t>
-      </w:r>
-      <w:r>
-        <w:rPr>
-          <w:rFonts w:ascii="Times New Roman" w:hAnsi="Times New Roman" w:eastAsia="Times New Roman" w:cs="Times New Roman"/>
-          <w:sz w:val="24"/>
-          <w:szCs w:val="24"/>
-        </w:rPr>
-        <w:t xml:space="preserve"> 92,760 rows. Then we check them using entity rules, structural integrity </w:t>
-      </w:r>
-      <w:r>
-        <w:rPr>
-          <w:rFonts w:ascii="Times New Roman" w:hAnsi="Times New Roman" w:eastAsia="Times New Roman" w:cs="Times New Roman"/>
-          <w:sz w:val="24"/>
-          <w:szCs w:val="24"/>
-        </w:rPr>
-        <w:t xml:space="preserve">checks</w:t>
-      </w:r>
-      <w:r>
-        <w:rPr>
-          <w:rFonts w:ascii="Times New Roman" w:hAnsi="Times New Roman" w:eastAsia="Times New Roman" w:cs="Times New Roman"/>
-          <w:sz w:val="24"/>
-          <w:szCs w:val="24"/>
-        </w:rPr>
-        <w:t xml:space="preserve"> and calibrated </w:t>
-      </w:r>
-      <w:r>
-        <w:rPr>
-          <w:rFonts w:ascii="Times New Roman" w:hAnsi="Times New Roman" w:eastAsia="Times New Roman" w:cs="Times New Roman"/>
-          <w:sz w:val="24"/>
-          <w:szCs w:val="24"/>
-        </w:rPr>
-        <w:t xml:space="preserve">LaBSE</w:t>
-      </w:r>
-      <w:r>
-        <w:rPr>
-          <w:rFonts w:ascii="Times New Roman" w:hAnsi="Times New Roman" w:eastAsia="Times New Roman" w:cs="Times New Roman"/>
-          <w:sz w:val="24"/>
-          <w:szCs w:val="24"/>
-        </w:rPr>
-        <w:t xml:space="preserve"> similarity gates. An </w:t>
-      </w:r>
-      <w:r>
-        <w:rPr>
-          <w:rFonts w:ascii="Times New Roman" w:hAnsi="Times New Roman" w:eastAsia="Times New Roman" w:cs="Times New Roman"/>
-          <w:sz w:val="24"/>
-          <w:szCs w:val="24"/>
-        </w:rPr>
-        <w:t xml:space="preserve">independence</w:t>
-      </w:r>
-      <w:r>
-        <w:rPr>
-          <w:rFonts w:ascii="Times New Roman" w:hAnsi="Times New Roman" w:eastAsia="Times New Roman" w:cs="Times New Roman"/>
-          <w:sz w:val="24"/>
-          <w:szCs w:val="24"/>
-        </w:rPr>
-        <w:t xml:space="preserve"> audit shows that the sustainability and ESG-theme splits are parallel. The numeral split comes from a source. Using this corpus we fine-tune IndicBERT-v2 and </w:t>
-      </w:r>
-      <w:r>
-        <w:rPr>
-          <w:rFonts w:ascii="Times New Roman" w:hAnsi="Times New Roman" w:eastAsia="Times New Roman" w:cs="Times New Roman"/>
-          <w:sz w:val="24"/>
-          <w:szCs w:val="24"/>
-        </w:rPr>
-        <w:t xml:space="preserve">mBERT</w:t>
-      </w:r>
-      <w:r>
-        <w:rPr>
-          <w:rFonts w:ascii="Times New Roman" w:hAnsi="Times New Roman" w:eastAsia="Times New Roman" w:cs="Times New Roman"/>
-          <w:sz w:val="24"/>
-          <w:szCs w:val="24"/>
-        </w:rPr>
-        <w:t xml:space="preserve"> on one language and then test zero-shot on the others. When starting from </w:t>
-      </w:r>
-      <w:r>
-        <w:rPr>
-          <w:rFonts w:ascii="Times New Roman" w:hAnsi="Times New Roman" w:eastAsia="Times New Roman" w:cs="Times New Roman"/>
-          <w:sz w:val="24"/>
-          <w:szCs w:val="24"/>
-        </w:rPr>
-        <w:t xml:space="preserve">Hindi</w:t>
-      </w:r>
-      <w:r>
-        <w:rPr>
-          <w:rFonts w:ascii="Times New Roman" w:hAnsi="Times New Roman" w:eastAsia="Times New Roman" w:cs="Times New Roman"/>
-          <w:sz w:val="24"/>
-          <w:szCs w:val="24"/>
-        </w:rPr>
-        <w:t xml:space="preserve"> we lose about 0.39 to 0.45 in macro-F1 for sustainability classification. For ESG </w:t>
-      </w:r>
-      <w:r>
-        <w:rPr>
-          <w:rFonts w:ascii="Times New Roman" w:hAnsi="Times New Roman" w:eastAsia="Times New Roman" w:cs="Times New Roman"/>
-          <w:sz w:val="24"/>
-          <w:szCs w:val="24"/>
-        </w:rPr>
-        <w:t xml:space="preserve">themes</w:t>
-      </w:r>
-      <w:r>
-        <w:rPr>
-          <w:rFonts w:ascii="Times New Roman" w:hAnsi="Times New Roman" w:eastAsia="Times New Roman" w:cs="Times New Roman"/>
-          <w:sz w:val="24"/>
-          <w:szCs w:val="24"/>
-        </w:rPr>
-        <w:t xml:space="preserve"> the drop is 0.50 to 0.51. MBERT performs better than IndicBERT-v2 in all twelve matching cases. Hindi is the source language for both models. Moving into a language costs mo</w:t>
-      </w:r>
-      <w:r>
-        <w:rPr>
-          <w:rFonts w:ascii="Times New Roman" w:hAnsi="Times New Roman" w:eastAsia="Times New Roman" w:cs="Times New Roman"/>
-          <w:sz w:val="24"/>
-          <w:szCs w:val="24"/>
-        </w:rPr>
-        <w:t xml:space="preserve">re than moving into an Indo-Aryan one. This pattern also shows up in translation quality—drops of 2.6 to 4.8 points across all three tasks. We also introduce a two-stage framework. It assigns each failure to one cause. The framework is. Tested at the unit </w:t>
-      </w:r>
-      <w:r>
-        <w:rPr>
-          <w:rFonts w:ascii="Times New Roman" w:hAnsi="Times New Roman" w:eastAsia="Times New Roman" w:cs="Times New Roman"/>
-          <w:sz w:val="24"/>
-          <w:szCs w:val="24"/>
-        </w:rPr>
-        <w:t xml:space="preserve">level..</w:t>
-      </w:r>
-      <w:r>
-        <w:rPr>
-          <w:rFonts w:ascii="Times New Roman" w:hAnsi="Times New Roman" w:eastAsia="Times New Roman" w:cs="Times New Roman"/>
-          <w:sz w:val="24"/>
-          <w:szCs w:val="24"/>
-        </w:rPr>
-        <w:t xml:space="preserve"> So </w:t>
-      </w:r>
-      <w:r>
-        <w:rPr>
-          <w:rFonts w:ascii="Times New Roman" w:hAnsi="Times New Roman" w:eastAsia="Times New Roman" w:cs="Times New Roman"/>
-          <w:sz w:val="24"/>
-          <w:szCs w:val="24"/>
-        </w:rPr>
-        <w:t xml:space="preserve">far</w:t>
-      </w:r>
-      <w:r>
-        <w:rPr>
-          <w:rFonts w:ascii="Times New Roman" w:hAnsi="Times New Roman" w:eastAsia="Times New Roman" w:cs="Times New Roman"/>
-          <w:sz w:val="24"/>
-          <w:szCs w:val="24"/>
-        </w:rPr>
-        <w:t xml:space="preserve"> it has only been run end to end under one condition. </w:t>
-      </w:r>
-      <w:r>
-        <w:rPr>
-          <w:rFonts w:ascii="Times New Roman" w:hAnsi="Times New Roman" w:eastAsia="Times New Roman" w:cs="Times New Roman"/>
-          <w:sz w:val="24"/>
-          <w:szCs w:val="24"/>
-        </w:rPr>
-        <w:t xml:space="preserve">So</w:t>
-      </w:r>
-      <w:r>
-        <w:rPr>
-          <w:rFonts w:ascii="Times New Roman" w:hAnsi="Times New Roman" w:eastAsia="Times New Roman" w:cs="Times New Roman"/>
-          <w:sz w:val="24"/>
-          <w:szCs w:val="24"/>
-        </w:rPr>
-        <w:t xml:space="preserve"> we report the size and shape of the transfer gap. We leave the causal </w:t>
-      </w:r>
-      <w:r>
-        <w:rPr>
-          <w:rFonts w:ascii="Times New Roman" w:hAnsi="Times New Roman" w:eastAsia="Times New Roman" w:cs="Times New Roman"/>
-          <w:sz w:val="24"/>
-          <w:szCs w:val="24"/>
-        </w:rPr>
-        <w:t xml:space="preserve">explanation,</w:t>
-      </w:r>
-      <w:r>
-        <w:rPr>
-          <w:rFonts w:ascii="Times New Roman" w:hAnsi="Times New Roman" w:eastAsia="Times New Roman" w:cs="Times New Roman"/>
-          <w:sz w:val="24"/>
-          <w:szCs w:val="24"/>
-        </w:rPr>
-        <w:t xml:space="preserve"> for future research.</w:t>
-      </w:r>
-      <w:r/>
     </w:p>
     <w:p>
       <w:pPr>
@@ -466,8 +189,8 @@
         <w:pStyle w:val="676"/>
         <w:pBdr/>
         <w:spacing/>
-        <w:ind w:left="0"/>
-        <w:jc w:val="left"/>
+        <w:ind w:left="0" w:firstLine="288"/>
+        <w:jc w:val="both"/>
         <w:rPr/>
       </w:pPr>
       <w:r>
@@ -476,7 +199,106 @@
           <w:sz w:val="24"/>
           <w:szCs w:val="24"/>
         </w:rPr>
-        <w:t xml:space="preserve">Finan</w:t>
+        <w:t xml:space="preserve">Financial text in Indic languages is growing quickly, but annotated resources remain scarce. Multilingual pre-trained encoders make it possible to reuse labelled data from one language in another, and they transfer well on general language-understanding benchmarks [13], [14]. Transfer degrades sharply, however, in low-resource settings and between distant languages [15]. Finance adds demands of its own: domain terminology, numerals written in scale conventions such as lakh and crore, and named entities that must survive a change of language.</w:t>
+      </w:r>
+    </w:p>
+    <w:p>
+      <w:pPr>
+        <w:pStyle w:val="676"/>
+        <w:pBdr/>
+        <w:spacing/>
+        <w:ind w:left="0" w:firstLine="288"/>
+        <w:jc w:val="both"/>
+        <w:rPr/>
+      </w:pPr>
+      <w:r>
+        <w:rPr>
+          <w:rFonts w:ascii="Times New Roman" w:hAnsi="Times New Roman" w:eastAsia="Times New Roman" w:cs="Times New Roman"/>
+          <w:sz w:val="24"/>
+          <w:szCs w:val="24"/>
+        </w:rPr>
+        <w:t xml:space="preserve">IndicFinNLP [1] brings financial NLP to Hindi, Bengali and Telugu with three tasks: numeral detection, sustainability classification and ESG-theme classification. It was built to provide single-language baselines, not to measure transfer. When the language splits contain sentences about different topics and entities, a performance difference between languages mixes the effect of language with changes in topic, entity and difficulty. Parallel test sets exist for Indic natural language understanding [8], [9], but none covers financial or ESG text, and no multilingual ESG shared task has included an Indic language [5].</w:t>
+      </w:r>
+    </w:p>
+    <w:p>
+      <w:pPr>
+        <w:pStyle w:val="676"/>
+        <w:pBdr/>
+        <w:spacing/>
+        <w:ind w:left="0" w:firstLine="288"/>
+        <w:jc w:val="both"/>
+        <w:rPr/>
+      </w:pPr>
+      <w:r>
+        <w:rPr>
+          <w:rFonts w:ascii="Times New Roman" w:hAnsi="Times New Roman" w:eastAsia="Times New Roman" w:cs="Times New Roman"/>
+          <w:sz w:val="24"/>
+          <w:szCs w:val="24"/>
+        </w:rPr>
+        <w:t xml:space="preserve">This leads to our research question: do multilingual language models preserve financial meaning when knowledge transfers between Indic languages? Answering it needs two things. The first is a test set in which language is the only thing that changes. The second is an analysis of why transfer fails, in terms of the language and the financial content (terminology, numerals, morphology and tokenisation), rather than overall accuracy alone.</w:t>
+      </w:r>
+    </w:p>
+    <w:p>
+      <w:pPr>
+        <w:pStyle w:val="676"/>
+        <w:pBdr/>
+        <w:spacing/>
+        <w:ind w:left="0" w:firstLine="288"/>
+        <w:jc w:val="both"/>
+        <w:rPr/>
+      </w:pPr>
+      <w:r>
+        <w:rPr>
+          <w:rFonts w:ascii="Times New Roman" w:hAnsi="Times New Roman" w:eastAsia="Times New Roman" w:cs="Times New Roman"/>
+          <w:sz w:val="24"/>
+          <w:szCs w:val="24"/>
+        </w:rPr>
+        <w:t xml:space="preserve">A second concern shapes the design. Machine-translated parallel benchmarks can silently measure translation quality instead of transfer, and low-resource languages suffer most [18], [19]. We therefore treat label validity and translation quality as quantities to measure, and we report every flagged row instead of discarding it.</w:t>
+      </w:r>
+    </w:p>
+    <w:p>
+      <w:pPr>
+        <w:pStyle w:val="676"/>
+        <w:pBdr/>
+        <w:spacing/>
+        <w:ind w:left="0" w:firstLine="288"/>
+        <w:jc w:val="both"/>
+        <w:rPr/>
+      </w:pPr>
+      <w:r>
+        <w:rPr>
+          <w:rFonts w:ascii="Times New Roman" w:hAnsi="Times New Roman" w:eastAsia="Times New Roman" w:cs="Times New Roman"/>
+          <w:sz w:val="24"/>
+          <w:szCs w:val="24"/>
+        </w:rPr>
+        <w:t xml:space="preserve">This paper makes the following contributions:</w:t>
+      </w:r>
+    </w:p>
+    <w:p>
+      <w:pPr>
+        <w:pStyle w:val="681"/>
+        <w:numPr>
+          <w:ilvl w:val="0"/>
+          <w:numId w:val="5"/>
+        </w:numPr>
+        <w:pBdr/>
+        <w:spacing/>
+        <w:ind/>
+        <w:jc w:val="both"/>
+        <w:rPr>
+          <w:rFonts w:ascii="Times New Roman" w:hAnsi="Times New Roman" w:eastAsia="Times New Roman" w:cs="Times New Roman"/>
+          <w:sz w:val="24"/>
+          <w:szCs w:val="24"/>
+        </w:rPr>
+      </w:pPr>
+      <w:r>
+        <w:rPr>
+          <w:rFonts w:ascii="Times New Roman" w:hAnsi="Times New Roman" w:eastAsia="Times New Roman" w:cs="Times New Roman"/>
+          <w:i/>
+          <w:sz w:val="24"/>
+          <w:szCs w:val="24"/>
+        </w:rPr>
+        <w:t xml:space="preserve">A controlled parallel benchmark.</w:t>
       </w:r>
       <w:r>
         <w:rPr>
@@ -484,7 +306,34 @@
           <w:sz w:val="24"/>
           <w:szCs w:val="24"/>
         </w:rPr>
-        <w:t xml:space="preserve">cial text in languages grows quickly. However annotated resources are still scarce. Multilingual pre-trained encoders allow reuse of labelled data from one language to another. Multilingual pre-trained encoders transfer well on general understanding benchm</w:t>
+        <w:t xml:space="preserve"> We derive a four-way parallel financial corpus in Hindi, Bengali, Telugu and Malayalam from IndicFinNLP with every label intact. We audit which native splits are already parallel, translate directly between Indic languages with IndicTrans2 [21], and apply layered quality gates to all 92,760 translated rows. These gates show that about one financial numeral in six does not survive translation intact.</w:t>
+      </w:r>
+    </w:p>
+    <w:p>
+      <w:pPr>
+        <w:pStyle w:val="681"/>
+        <w:numPr>
+          <w:ilvl w:val="0"/>
+          <w:numId w:val="5"/>
+        </w:numPr>
+        <w:pBdr/>
+        <w:spacing/>
+        <w:ind/>
+        <w:jc w:val="both"/>
+        <w:rPr>
+          <w:rFonts w:ascii="Times New Roman" w:hAnsi="Times New Roman" w:eastAsia="Times New Roman" w:cs="Times New Roman"/>
+          <w:sz w:val="24"/>
+          <w:szCs w:val="24"/>
+        </w:rPr>
+      </w:pPr>
+      <w:r>
+        <w:rPr>
+          <w:rFonts w:ascii="Times New Roman" w:hAnsi="Times New Roman" w:eastAsia="Times New Roman" w:cs="Times New Roman"/>
+          <w:i/>
+          <w:sz w:val="24"/>
+          <w:szCs w:val="24"/>
+        </w:rPr>
+        <w:t xml:space="preserve">A systematic zero-shot transfer study.</w:t>
       </w:r>
       <w:r>
         <w:rPr>
@@ -492,26 +341,34 @@
           <w:sz w:val="24"/>
           <w:szCs w:val="24"/>
         </w:rPr>
-        <w:t xml:space="preserve">arks [13] [14]. Transfer degrades sharply in resource- settings and between distant languages [15]. Finance demands domain terminology, numerals written in scale conventions such, as lakh and crore and named entities that must survive a change of language.</w:t>
+        <w:t xml:space="preserve"> We compare three source languages (Hindi, Bengali and Telugu) and two encoders (IndicBERT [7] and mBERT [12]) across the full grid of 126 planned results per task, after validating the in-language baselines against published figures.</w:t>
       </w:r>
-      <w:r/>
     </w:p>
     <w:p>
       <w:pPr>
-        <w:pStyle w:val="676"/>
-        <w:pBdr/>
-        <w:spacing/>
-        <w:ind w:left="0"/>
-        <w:jc w:val="left"/>
-        <w:rPr/>
-      </w:pPr>
-      <w:r>
+        <w:pStyle w:val="681"/>
+        <w:numPr>
+          <w:ilvl w:val="0"/>
+          <w:numId w:val="5"/>
+        </w:numPr>
+        <w:pBdr/>
+        <w:spacing/>
+        <w:ind/>
+        <w:jc w:val="both"/>
         <w:rPr>
           <w:rFonts w:ascii="Times New Roman" w:hAnsi="Times New Roman" w:eastAsia="Times New Roman" w:cs="Times New Roman"/>
           <w:sz w:val="24"/>
           <w:szCs w:val="24"/>
         </w:rPr>
-        <w:t xml:space="preserve">IndicFinNLP [1] is the test to include financial NLP in Hindi, Bengali and Telugu. It off</w:t>
+      </w:pPr>
+      <w:r>
+        <w:rPr>
+          <w:rFonts w:ascii="Times New Roman" w:hAnsi="Times New Roman" w:eastAsia="Times New Roman" w:cs="Times New Roman"/>
+          <w:i/>
+          <w:sz w:val="24"/>
+          <w:szCs w:val="24"/>
+        </w:rPr>
+        <w:t xml:space="preserve">A transfer-diagnostic framework.</w:t>
       </w:r>
       <w:r>
         <w:rPr>
@@ -519,379 +376,25 @@
           <w:sz w:val="24"/>
           <w:szCs w:val="24"/>
         </w:rPr>
-        <w:t xml:space="preserve">ers three tasks: detecting numbers, classifying sustainability and determining ESG themes. It was created to provide single language baselines not to check transfer. When language splits have sentences about different things and events a difference in perf</w:t>
+        <w:t xml:space="preserve"> We present a three-stage router. It first filters out translation noise with a semantic gate, then assigns each failure a single linguistic, data or model-behaviour cause, keeping an audit trail of every module that fired. Run over all 72 conditions, it shows that most failures are described by where they occur rather than by a linguistic property of the target text.</w:t>
       </w:r>
+    </w:p>
+    <w:p>
+      <w:pPr>
+        <w:pStyle w:val="676"/>
+        <w:pBdr/>
+        <w:spacing/>
+        <w:ind w:left="0" w:firstLine="288"/>
+        <w:jc w:val="both"/>
+        <w:rPr/>
+      </w:pPr>
       <w:r>
         <w:rPr>
           <w:rFonts w:ascii="Times New Roman" w:hAnsi="Times New Roman" w:eastAsia="Times New Roman" w:cs="Times New Roman"/>
           <w:sz w:val="24"/>
           <w:szCs w:val="24"/>
         </w:rPr>
-        <w:t xml:space="preserve">ormance, across languages mixes language effects with topic, thing and difficulty changes. Parallel test sets have been made for Indic NLU [8] [9] but nothing includes finance or ESG text and no multilingual ESG shared tasks have had an Indic language [5].</w:t>
-      </w:r>
-      <w:r/>
-    </w:p>
-    <w:p>
-      <w:pPr>
-        <w:pStyle w:val="676"/>
-        <w:pBdr/>
-        <w:spacing/>
-        <w:ind w:left="0"/>
-        <w:jc w:val="left"/>
-        <w:rPr/>
-      </w:pPr>
-      <w:r>
-        <w:rPr>
-          <w:rFonts w:ascii="Times New Roman" w:hAnsi="Times New Roman" w:eastAsia="Times New Roman" w:cs="Times New Roman"/>
-          <w:sz w:val="24"/>
-          <w:szCs w:val="24"/>
-        </w:rPr>
-        <w:t xml:space="preserve">These gaps lead to one research question: can multilingual language models accurately keep meanings when knowledge moves, between Indic languages? To answer this two things are needed. </w:t>
-      </w:r>
-      <w:r>
-        <w:rPr>
-          <w:rFonts w:ascii="Times New Roman" w:hAnsi="Times New Roman" w:eastAsia="Times New Roman" w:cs="Times New Roman"/>
-          <w:sz w:val="24"/>
-          <w:szCs w:val="24"/>
-        </w:rPr>
-        <w:t xml:space="preserve">First, a test set where the language is the thing that changes. Second, an analysis that looks at why things go wrong in terms of language and money like words, numbers how words are. How they are split into parts and doesn't just look at overall accuracy.</w:t>
-      </w:r>
-      <w:r/>
-    </w:p>
-    <w:p>
-      <w:pPr>
-        <w:pStyle w:val="676"/>
-        <w:pBdr/>
-        <w:spacing/>
-        <w:ind w:left="0"/>
-        <w:jc w:val="left"/>
-        <w:rPr/>
-      </w:pPr>
-      <w:r>
-        <w:rPr>
-          <w:rFonts w:ascii="Times New Roman" w:hAnsi="Times New Roman" w:eastAsia="Times New Roman" w:cs="Times New Roman"/>
-          <w:sz w:val="24"/>
-          <w:szCs w:val="24"/>
-        </w:rPr>
-        <w:t xml:space="preserve">A second concern shapes our design. Machine-translated paralle</w:t>
-      </w:r>
-      <w:r>
-        <w:rPr>
-          <w:rFonts w:ascii="Times New Roman" w:hAnsi="Times New Roman" w:eastAsia="Times New Roman" w:cs="Times New Roman"/>
-          <w:sz w:val="24"/>
-          <w:szCs w:val="24"/>
-        </w:rPr>
-        <w:t xml:space="preserve">l benchmarks can silently measure translation quality of transfer and low-resource languages suffer the hardest [18] [19]. We therefore treat label validity and translation quality as measured quantities. We report every flagged row without discarding any.</w:t>
-      </w:r>
-      <w:r/>
-    </w:p>
-    <w:p>
-      <w:pPr>
-        <w:pStyle w:val="676"/>
-        <w:pBdr/>
-        <w:spacing/>
-        <w:ind w:left="0"/>
-        <w:jc w:val="left"/>
-        <w:rPr/>
-      </w:pPr>
-      <w:r>
-        <w:rPr>
-          <w:rFonts w:ascii="system-ui" w:hAnsi="system-ui" w:eastAsia="system-ui" w:cs="system-ui"/>
-          <w:b w:val="0"/>
-          <w:bCs w:val="0"/>
-          <w:i w:val="0"/>
-          <w:iCs w:val="0"/>
-          <w:caps w:val="0"/>
-          <w:smallCaps w:val="0"/>
-          <w:color w:val="2b2d38"/>
-          <w:sz w:val="22"/>
-          <w:szCs w:val="22"/>
-          <w:lang w:val="en-US"/>
-        </w:rPr>
-        <w:t xml:space="preserve">This paper makes the following contributions:</w:t>
-      </w:r>
-      <w:r/>
-    </w:p>
-    <w:p>
-      <w:pPr>
-        <w:pStyle w:val="681"/>
-        <w:numPr>
-          <w:ilvl w:val="0"/>
-          <w:numId w:val="5"/>
-        </w:numPr>
-        <w:pBdr/>
-        <w:spacing/>
-        <w:ind/>
-        <w:jc w:val="left"/>
-        <w:rPr>
-          <w:rFonts w:ascii="system-ui" w:hAnsi="system-ui" w:eastAsia="system-ui" w:cs="system-ui"/>
-          <w:b w:val="0"/>
-          <w:bCs w:val="0"/>
-          <w:i w:val="0"/>
-          <w:iCs w:val="0"/>
-          <w:caps w:val="0"/>
-          <w:smallCaps w:val="0"/>
-          <w:color w:val="2b2d38"/>
-          <w:sz w:val="22"/>
-          <w:szCs w:val="22"/>
-          <w:lang w:val="en-US"/>
-        </w:rPr>
-      </w:pPr>
-      <w:r>
-        <w:rPr>
-          <w:rFonts w:ascii="system-ui" w:hAnsi="system-ui" w:eastAsia="system-ui" w:cs="system-ui"/>
-          <w:b w:val="0"/>
-          <w:bCs w:val="0"/>
-          <w:i w:val="0"/>
-          <w:iCs w:val="0"/>
-          <w:caps w:val="0"/>
-          <w:smallCaps w:val="0"/>
-          <w:color w:val="2b2d38"/>
-          <w:sz w:val="22"/>
-          <w:szCs w:val="22"/>
-          <w:lang w:val="en-US"/>
-        </w:rPr>
-        <w:t xml:space="preserve">A controlled parallel benchmark. The paper derives an aligned financial corpus in H</w:t>
-      </w:r>
-      <w:r>
-        <w:rPr>
-          <w:rFonts w:ascii="system-ui" w:hAnsi="system-ui" w:eastAsia="system-ui" w:cs="system-ui"/>
-          <w:b w:val="0"/>
-          <w:bCs w:val="0"/>
-          <w:i w:val="0"/>
-          <w:iCs w:val="0"/>
-          <w:caps w:val="0"/>
-          <w:smallCaps w:val="0"/>
-          <w:color w:val="2b2d38"/>
-          <w:sz w:val="22"/>
-          <w:szCs w:val="22"/>
-          <w:lang w:val="en-US"/>
-        </w:rPr>
-        <w:t xml:space="preserve">indi, Bengali, Telugu and Malayalam from IndicFinNLP keeping all labels intact. The paper audits which native splits are already parallel translates Indic-to-Indic using IndicTrans2. Applies layered quality gates to every one of the 92,760 translated rows.</w:t>
-      </w:r>
-      <w:r>
-        <w:rPr>
-          <w:rFonts w:ascii="system-ui" w:hAnsi="system-ui" w:eastAsia="system-ui" w:cs="system-ui"/>
-          <w:b w:val="0"/>
-          <w:bCs w:val="0"/>
-          <w:i w:val="0"/>
-          <w:iCs w:val="0"/>
-          <w:caps w:val="0"/>
-          <w:smallCaps w:val="0"/>
-          <w:color w:val="2b2d38"/>
-          <w:sz w:val="22"/>
-          <w:szCs w:val="22"/>
-          <w:lang w:val="en-US"/>
-        </w:rPr>
-      </w:r>
-    </w:p>
-    <w:p>
-      <w:pPr>
-        <w:pStyle w:val="681"/>
-        <w:numPr>
-          <w:ilvl w:val="0"/>
-          <w:numId w:val="5"/>
-        </w:numPr>
-        <w:pBdr/>
-        <w:spacing/>
-        <w:ind/>
-        <w:jc w:val="left"/>
-        <w:rPr>
-          <w:rFonts w:ascii="system-ui" w:hAnsi="system-ui" w:eastAsia="system-ui" w:cs="system-ui"/>
-          <w:b w:val="0"/>
-          <w:bCs w:val="0"/>
-          <w:i w:val="0"/>
-          <w:iCs w:val="0"/>
-          <w:caps w:val="0"/>
-          <w:smallCaps w:val="0"/>
-          <w:color w:val="2b2d38"/>
-          <w:sz w:val="22"/>
-          <w:szCs w:val="22"/>
-          <w:lang w:val="en-US"/>
-        </w:rPr>
-      </w:pPr>
-      <w:r>
-        <w:rPr>
-          <w:rFonts w:ascii="system-ui" w:hAnsi="system-ui" w:eastAsia="system-ui" w:cs="system-ui"/>
-          <w:b w:val="0"/>
-          <w:bCs w:val="0"/>
-          <w:i w:val="0"/>
-          <w:iCs w:val="0"/>
-          <w:caps w:val="0"/>
-          <w:smallCaps w:val="0"/>
-          <w:color w:val="2b2d38"/>
-          <w:sz w:val="22"/>
-          <w:szCs w:val="22"/>
-          <w:lang w:val="en-US"/>
-        </w:rPr>
-        <w:t xml:space="preserve">A systematic zero</w:t>
-      </w:r>
-      <w:r>
-        <w:noBreakHyphen/>
-      </w:r>
-      <w:r>
-        <w:rPr>
-          <w:rFonts w:ascii="system-ui" w:hAnsi="system-ui" w:eastAsia="system-ui" w:cs="system-ui"/>
-          <w:b w:val="0"/>
-          <w:bCs w:val="0"/>
-          <w:i w:val="0"/>
-          <w:iCs w:val="0"/>
-          <w:caps w:val="0"/>
-          <w:smallCaps w:val="0"/>
-          <w:color w:val="2b2d38"/>
-          <w:sz w:val="22"/>
-          <w:szCs w:val="22"/>
-          <w:lang w:val="en-US"/>
-        </w:rPr>
-        <w:t xml:space="preserve">shot transfer study. The paper compares source languages Hindi, Bengali, Telugu and encoders IndicBERT</w:t>
-      </w:r>
-      <w:r>
-        <w:noBreakHyphen/>
-      </w:r>
-      <w:r>
-        <w:rPr>
-          <w:rFonts w:ascii="system-ui" w:hAnsi="system-ui" w:eastAsia="system-ui" w:cs="system-ui"/>
-          <w:b w:val="0"/>
-          <w:bCs w:val="0"/>
-          <w:i w:val="0"/>
-          <w:iCs w:val="0"/>
-          <w:caps w:val="0"/>
-          <w:smallCaps w:val="0"/>
-          <w:color w:val="2b2d38"/>
-          <w:sz w:val="22"/>
-          <w:szCs w:val="22"/>
-          <w:lang w:val="en-US"/>
-        </w:rPr>
-        <w:t xml:space="preserve">v2. Mbert across the full grid of 126 planned results for each task after validating baselines against published figures.</w:t>
-      </w:r>
-      <w:r>
-        <w:rPr>
-          <w:rFonts w:ascii="system-ui" w:hAnsi="system-ui" w:eastAsia="system-ui" w:cs="system-ui"/>
-          <w:b w:val="0"/>
-          <w:bCs w:val="0"/>
-          <w:i w:val="0"/>
-          <w:iCs w:val="0"/>
-          <w:caps w:val="0"/>
-          <w:smallCaps w:val="0"/>
-          <w:color w:val="2b2d38"/>
-          <w:sz w:val="22"/>
-          <w:szCs w:val="22"/>
-          <w:lang w:val="en-US"/>
-        </w:rPr>
-      </w:r>
-    </w:p>
-    <w:p>
-      <w:pPr>
-        <w:pStyle w:val="681"/>
-        <w:numPr>
-          <w:ilvl w:val="0"/>
-          <w:numId w:val="5"/>
-        </w:numPr>
-        <w:pBdr/>
-        <w:spacing/>
-        <w:ind/>
-        <w:jc w:val="left"/>
-        <w:rPr>
-          <w:rFonts w:ascii="system-ui" w:hAnsi="system-ui" w:eastAsia="system-ui" w:cs="system-ui"/>
-          <w:b w:val="0"/>
-          <w:bCs w:val="0"/>
-          <w:i w:val="0"/>
-          <w:iCs w:val="0"/>
-          <w:caps w:val="0"/>
-          <w:smallCaps w:val="0"/>
-          <w:color w:val="2b2d38"/>
-          <w:sz w:val="22"/>
-          <w:szCs w:val="22"/>
-          <w:lang w:val="en-US"/>
-        </w:rPr>
-      </w:pPr>
-      <w:r>
-        <w:rPr>
-          <w:rFonts w:ascii="system-ui" w:hAnsi="system-ui" w:eastAsia="system-ui" w:cs="system-ui"/>
-          <w:b w:val="0"/>
-          <w:bCs w:val="0"/>
-          <w:i w:val="0"/>
-          <w:iCs w:val="0"/>
-          <w:caps w:val="0"/>
-          <w:smallCaps w:val="0"/>
-          <w:color w:val="2b2d38"/>
-          <w:sz w:val="22"/>
-          <w:szCs w:val="22"/>
-          <w:lang w:val="en-US"/>
-        </w:rPr>
-        <w:t xml:space="preserve">A transfer</w:t>
-      </w:r>
-      <w:r>
-        <w:noBreakHyphen/>
-      </w:r>
-      <w:r>
-        <w:rPr>
-          <w:rFonts w:ascii="system-ui" w:hAnsi="system-ui" w:eastAsia="system-ui" w:cs="system-ui"/>
-          <w:b w:val="0"/>
-          <w:bCs w:val="0"/>
-          <w:i w:val="0"/>
-          <w:iCs w:val="0"/>
-          <w:caps w:val="0"/>
-          <w:smallCaps w:val="0"/>
-          <w:color w:val="2b2d38"/>
-          <w:sz w:val="22"/>
-          <w:szCs w:val="22"/>
-          <w:lang w:val="en-US"/>
-        </w:rPr>
-        <w:t xml:space="preserve">diagnostic framework. The paper presents a two</w:t>
-      </w:r>
-      <w:r>
-        <w:noBreakHyphen/>
-      </w:r>
-      <w:r>
-        <w:rPr>
-          <w:rFonts w:ascii="system-ui" w:hAnsi="system-ui" w:eastAsia="system-ui" w:cs="system-ui"/>
-          <w:b w:val="0"/>
-          <w:bCs w:val="0"/>
-          <w:i w:val="0"/>
-          <w:iCs w:val="0"/>
-          <w:caps w:val="0"/>
-          <w:smallCaps w:val="0"/>
-          <w:color w:val="2b2d38"/>
-          <w:sz w:val="22"/>
-          <w:szCs w:val="22"/>
-          <w:lang w:val="en-US"/>
-        </w:rPr>
-        <w:t xml:space="preserve">stage router that first filters out translation noise, with a gate then assigns each failure a single linguistic cause keeping an audit trail of every module that fired. The framework is implemented and tested on one condition; the full</w:t>
-      </w:r>
-      <w:r>
-        <w:noBreakHyphen/>
-      </w:r>
-      <w:r>
-        <w:rPr>
-          <w:rFonts w:ascii="system-ui" w:hAnsi="system-ui" w:eastAsia="system-ui" w:cs="system-ui"/>
-          <w:b w:val="0"/>
-          <w:bCs w:val="0"/>
-          <w:i w:val="0"/>
-          <w:iCs w:val="0"/>
-          <w:caps w:val="0"/>
-          <w:smallCaps w:val="0"/>
-          <w:color w:val="2b2d38"/>
-          <w:sz w:val="22"/>
-          <w:szCs w:val="22"/>
-          <w:lang w:val="en-US"/>
-        </w:rPr>
-        <w:t xml:space="preserve">scale run remains work.</w:t>
-      </w:r>
-      <w:r>
-        <w:rPr>
-          <w:rFonts w:ascii="system-ui" w:hAnsi="system-ui" w:eastAsia="system-ui" w:cs="system-ui"/>
-          <w:b w:val="0"/>
-          <w:bCs w:val="0"/>
-          <w:i w:val="0"/>
-          <w:iCs w:val="0"/>
-          <w:caps w:val="0"/>
-          <w:smallCaps w:val="0"/>
-          <w:color w:val="2b2d38"/>
-          <w:sz w:val="22"/>
-          <w:szCs w:val="22"/>
-          <w:lang w:val="en-US"/>
-        </w:rPr>
+        <w:t xml:space="preserve">Section II reviews related work, Section III describes the method, Section IV reports the results and Section V concludes.</w:t>
       </w:r>
     </w:p>
     <w:p>

</xml_diff>

<commit_message>
added figures and citations
</commit_message>
<xml_diff>
--- a/docs/Cross-Linguistic Transfer Diagnostics for Low-Resource Financial NLP in Indic Languages.docx
+++ b/docs/Cross-Linguistic Transfer Diagnostics for Low-Resource Financial NLP in Indic Languages.docx
@@ -4126,7 +4126,7 @@
           <w:sz w:val="24"/>
           <w:szCs w:val="24"/>
         </w:rPr>
-        <w:t xml:space="preserve"> Source and translation are embedded with LaBSE. Compared by cosine similarity over all 92,760 pairs with no sampling:</w:t>
+        <w:t xml:space="preserve"> Source and translation are embedded with LaBSE. Compared by cosine similarity (Eq. 1) over all 92,760 pairs with no sampling:</w:t>
       </w:r>
       <w:r>
         <w:rPr>
@@ -5832,7 +5832,7 @@
           <w:sz w:val="24"/>
           <w:szCs w:val="24"/>
         </w:rPr>
-        <w:t xml:space="preserve">t score</w:t>
+        <w:t xml:space="preserve">t score (Eq. 2)</w:t>
       </w:r>
       <w:r>
         <w:rPr>
@@ -6022,7 +6022,80 @@
         </w:rPr>
         <w:t xml:space="preserve">These seeds are named in the results and remain in every other figure.</w:t>
       </w:r>
+      <w:r>
+        <w:rPr>
+          <w:rFonts w:ascii="Times New Roman" w:hAnsi="Times New Roman" w:eastAsia="Times New Roman" w:cs="Times New Roman"/>
+          <w:sz w:val="24"/>
+          <w:szCs w:val="24"/>
+        </w:rPr>
+        <w:t xml:space="preserve"> Fig. 1 shows the evaluation protocol.</w:t>
+      </w:r>
       <w:r/>
+    </w:p>
+    <w:p>
+      <w:pPr>
+        <w:pStyle w:val="900"/>
+        <w:keepNext w:val="true"/>
+        <w:pBdr/>
+        <w:spacing w:after="60" w:before="120"/>
+        <w:ind w:left="0"/>
+        <w:jc w:val="center"/>
+        <w:rPr/>
+      </w:pPr>
+      <w:r>
+        <w:drawing>
+          <wp:inline distT="0" distB="0" distL="0" distR="0">
+            <wp:extent cx="4028695" cy="4937760"/>
+            <wp:docPr id="901" name="Figure 1" descr="Flow diagram of zero-shot evaluation and isolation of prediction mismatches"/>
+            <wp:cNvGraphicFramePr>
+              <a:graphicFrameLocks noChangeAspect="1"/>
+            </wp:cNvGraphicFramePr>
+            <a:graphic>
+              <a:graphicData uri="http://schemas.openxmlformats.org/drawingml/2006/picture">
+                <pic:pic xmlns:pic="http://schemas.openxmlformats.org/drawingml/2006/picture">
+                  <pic:nvPicPr>
+                    <pic:cNvPr id="901" name="fig1.png"/>
+                    <pic:cNvPicPr/>
+                  </pic:nvPicPr>
+                  <pic:blipFill>
+                    <a:blip r:embed="rIdFig1"/>
+                    <a:stretch>
+                      <a:fillRect/>
+                    </a:stretch>
+                  </pic:blipFill>
+                  <pic:spPr>
+                    <a:xfrm>
+                      <a:off x="0" y="0"/>
+                      <a:ext cx="4028695" cy="4937760"/>
+                    </a:xfrm>
+                    <a:prstGeom prst="rect">
+                      <a:avLst/>
+                    </a:prstGeom>
+                  </pic:spPr>
+                </pic:pic>
+              </a:graphicData>
+            </a:graphic>
+          </wp:inline>
+        </w:drawing>
+      </w:r>
+    </w:p>
+    <w:p>
+      <w:pPr>
+        <w:pStyle w:val="900"/>
+        <w:pBdr/>
+        <w:spacing w:after="120" w:before="60"/>
+        <w:ind w:left="0"/>
+        <w:jc w:val="center"/>
+        <w:rPr/>
+      </w:pPr>
+      <w:r>
+        <w:rPr>
+          <w:rFonts w:ascii="Times New Roman" w:hAnsi="Times New Roman" w:eastAsia="Times New Roman" w:cs="Times New Roman"/>
+          <w:sz w:val="20"/>
+          <w:szCs w:val="20"/>
+        </w:rPr>
+        <w:t xml:space="preserve">Fig. 1. Zero-shot evaluation protocol. A classifier fine-tuned on one source language (Hindi shown as the example) is run on the parallel test sets; instances correct in the source and wrong in a target pass to the diagnostic workflow.</w:t>
+      </w:r>
     </w:p>
     <w:p>
       <w:pPr>
@@ -6062,7 +6135,7 @@
           <w:sz w:val="24"/>
           <w:szCs w:val="24"/>
         </w:rPr>
-        <w:t xml:space="preserve">A transfer failure is an instance that the model classified correctly in the source language and incorrectly in the target:</w:t>
+        <w:t xml:space="preserve">A transfer failure is an instance that the model classified correctly in the source language and incorrectly in the target (Eq. 3):</w:t>
       </w:r>
       <w:r/>
     </w:p>
@@ -6286,7 +6359,7 @@
           <w:sz w:val="24"/>
           <w:szCs w:val="24"/>
         </w:rPr>
-        <w:t xml:space="preserve">Quality of the tokenizer is said to influence performance in that language [28]; hence, the tokenization process is carried out using the tokenizer of the encoder,</w:t>
+        <w:t xml:space="preserve">Quality of the tokenizer is said to influence performance in that language [28]; hence, the tokenization process is carried out using the tokenizer of the encoder (Eq. 4),</w:t>
       </w:r>
       <w:r>
         <w:rPr>
@@ -6669,7 +6742,80 @@
           <w:szCs w:val="24"/>
         </w:rPr>
       </w:r>
+      <w:r>
+        <w:rPr>
+          <w:rFonts w:ascii="Times New Roman" w:hAnsi="Times New Roman" w:eastAsia="Times New Roman" w:cs="Times New Roman"/>
+          <w:sz w:val="24"/>
+          <w:szCs w:val="24"/>
+        </w:rPr>
+        <w:t xml:space="preserve"> Fig. 2 shows the router and its ordering.</w:t>
+      </w:r>
       <w:r/>
+    </w:p>
+    <w:p>
+      <w:pPr>
+        <w:pStyle w:val="900"/>
+        <w:keepNext w:val="true"/>
+        <w:pBdr/>
+        <w:spacing w:after="60" w:before="120"/>
+        <w:ind w:left="0"/>
+        <w:jc w:val="center"/>
+        <w:rPr/>
+      </w:pPr>
+      <w:r>
+        <w:drawing>
+          <wp:inline distT="0" distB="0" distL="0" distR="0">
+            <wp:extent cx="2194560" cy="5737917"/>
+            <wp:docPr id="902" name="Figure 2" descr="Flow diagram of the three-stage diagnostic router"/>
+            <wp:cNvGraphicFramePr>
+              <a:graphicFrameLocks noChangeAspect="1"/>
+            </wp:cNvGraphicFramePr>
+            <a:graphic>
+              <a:graphicData uri="http://schemas.openxmlformats.org/drawingml/2006/picture">
+                <pic:pic xmlns:pic="http://schemas.openxmlformats.org/drawingml/2006/picture">
+                  <pic:nvPicPr>
+                    <pic:cNvPr id="902" name="fig2.png"/>
+                    <pic:cNvPicPr/>
+                  </pic:nvPicPr>
+                  <pic:blipFill>
+                    <a:blip r:embed="rIdFig2"/>
+                    <a:stretch>
+                      <a:fillRect/>
+                    </a:stretch>
+                  </pic:blipFill>
+                  <pic:spPr>
+                    <a:xfrm>
+                      <a:off x="0" y="0"/>
+                      <a:ext cx="2194560" cy="5737917"/>
+                    </a:xfrm>
+                    <a:prstGeom prst="rect">
+                      <a:avLst/>
+                    </a:prstGeom>
+                  </pic:spPr>
+                </pic:pic>
+              </a:graphicData>
+            </a:graphic>
+          </wp:inline>
+        </w:drawing>
+      </w:r>
+    </w:p>
+    <w:p>
+      <w:pPr>
+        <w:pStyle w:val="900"/>
+        <w:pBdr/>
+        <w:spacing w:after="120" w:before="60"/>
+        <w:ind w:left="0"/>
+        <w:jc w:val="center"/>
+        <w:rPr/>
+      </w:pPr>
+      <w:r>
+        <w:rPr>
+          <w:rFonts w:ascii="Times New Roman" w:hAnsi="Times New Roman" w:eastAsia="Times New Roman" w:cs="Times New Roman"/>
+          <w:sz w:val="20"/>
+          <w:szCs w:val="20"/>
+        </w:rPr>
+        <w:t xml:space="preserve">Fig. 2. Ordered diagnostic router. Each failure takes the label of the first module that fires, grouped into Linguistic, Data and Model stages; failures that no module explains stay unattributed.</w:t>
+      </w:r>
     </w:p>
     <w:p>
       <w:pPr>
@@ -11776,7 +11922,80 @@
           <w:szCs w:val="24"/>
         </w:rPr>
       </w:r>
+      <w:r>
+        <w:rPr>
+          <w:rFonts w:ascii="Times New Roman" w:hAnsi="Times New Roman" w:eastAsia="Times New Roman" w:cs="Times New Roman"/>
+          <w:sz w:val="24"/>
+          <w:szCs w:val="24"/>
+        </w:rPr>
+        <w:t xml:space="preserve">Fig. 3 shows the task 2 gaps for every source–target pair.</w:t>
+      </w:r>
       <w:r/>
+    </w:p>
+    <w:p>
+      <w:pPr>
+        <w:pStyle w:val="900"/>
+        <w:keepNext w:val="true"/>
+        <w:pBdr/>
+        <w:spacing w:after="60" w:before="120"/>
+        <w:ind w:left="0"/>
+        <w:jc w:val="center"/>
+        <w:rPr/>
+      </w:pPr>
+      <w:r>
+        <w:drawing>
+          <wp:inline distT="0" distB="0" distL="0" distR="0">
+            <wp:extent cx="5943600" cy="2000678"/>
+            <wp:docPr id="903" name="Figure 3" descr="Heatmaps of task 2 transfer gap for IndicBERT and mBERT"/>
+            <wp:cNvGraphicFramePr>
+              <a:graphicFrameLocks noChangeAspect="1"/>
+            </wp:cNvGraphicFramePr>
+            <a:graphic>
+              <a:graphicData uri="http://schemas.openxmlformats.org/drawingml/2006/picture">
+                <pic:pic xmlns:pic="http://schemas.openxmlformats.org/drawingml/2006/picture">
+                  <pic:nvPicPr>
+                    <pic:cNvPr id="903" name="fig3.png"/>
+                    <pic:cNvPicPr/>
+                  </pic:nvPicPr>
+                  <pic:blipFill>
+                    <a:blip r:embed="rIdFig3"/>
+                    <a:stretch>
+                      <a:fillRect/>
+                    </a:stretch>
+                  </pic:blipFill>
+                  <pic:spPr>
+                    <a:xfrm>
+                      <a:off x="0" y="0"/>
+                      <a:ext cx="5943600" cy="2000678"/>
+                    </a:xfrm>
+                    <a:prstGeom prst="rect">
+                      <a:avLst/>
+                    </a:prstGeom>
+                  </pic:spPr>
+                </pic:pic>
+              </a:graphicData>
+            </a:graphic>
+          </wp:inline>
+        </w:drawing>
+      </w:r>
+    </w:p>
+    <w:p>
+      <w:pPr>
+        <w:pStyle w:val="900"/>
+        <w:pBdr/>
+        <w:spacing w:after="120" w:before="60"/>
+        <w:ind w:left="0"/>
+        <w:jc w:val="center"/>
+        <w:rPr/>
+      </w:pPr>
+      <w:r>
+        <w:rPr>
+          <w:rFonts w:ascii="Times New Roman" w:hAnsi="Times New Roman" w:eastAsia="Times New Roman" w:cs="Times New Roman"/>
+          <w:sz w:val="20"/>
+          <w:szCs w:val="20"/>
+        </w:rPr>
+        <w:t xml:space="preserve">Fig. 3. Task 2 transfer gap (source minus target macro-F1) by source language (rows) and target language (columns) for IndicBERT (left) and mBERT (right).</w:t>
+      </w:r>
     </w:p>
     <w:p>
       <w:pPr>
@@ -13348,6 +13567,14 @@
           <w:sz w:val="24"/>
           <w:szCs w:val="24"/>
         </w:rPr>
+      </w:r>
+      <w:r>
+        <w:rPr>
+          <w:rFonts w:ascii="Times New Roman" w:hAnsi="Times New Roman" w:eastAsia="Times New Roman" w:cs="Times New Roman"/>
+          <w:sz w:val="24"/>
+          <w:szCs w:val="24"/>
+        </w:rPr>
+        <w:t xml:space="preserve"> Fig. 4 breaks these shares down by individual label.</w:t>
       </w:r>
       <w:r/>
     </w:p>
@@ -14194,6 +14421,71 @@
     <w:p>
       <w:pPr>
         <w:pStyle w:val="900"/>
+        <w:keepNext w:val="true"/>
+        <w:pBdr/>
+        <w:spacing w:after="60" w:before="120"/>
+        <w:ind w:left="0"/>
+        <w:jc w:val="center"/>
+        <w:rPr/>
+      </w:pPr>
+      <w:r>
+        <w:drawing>
+          <wp:inline distT="0" distB="0" distL="0" distR="0">
+            <wp:extent cx="5943600" cy="2780330"/>
+            <wp:docPr id="904" name="Figure 4" descr="Stacked bars of diagnostic label shares by task and encoder"/>
+            <wp:cNvGraphicFramePr>
+              <a:graphicFrameLocks noChangeAspect="1"/>
+            </wp:cNvGraphicFramePr>
+            <a:graphic>
+              <a:graphicData uri="http://schemas.openxmlformats.org/drawingml/2006/picture">
+                <pic:pic xmlns:pic="http://schemas.openxmlformats.org/drawingml/2006/picture">
+                  <pic:nvPicPr>
+                    <pic:cNvPr id="904" name="fig4.png"/>
+                    <pic:cNvPicPr/>
+                  </pic:nvPicPr>
+                  <pic:blipFill>
+                    <a:blip r:embed="rIdFig4"/>
+                    <a:stretch>
+                      <a:fillRect/>
+                    </a:stretch>
+                  </pic:blipFill>
+                  <pic:spPr>
+                    <a:xfrm>
+                      <a:off x="0" y="0"/>
+                      <a:ext cx="5943600" cy="2780330"/>
+                    </a:xfrm>
+                    <a:prstGeom prst="rect">
+                      <a:avLst/>
+                    </a:prstGeom>
+                  </pic:spPr>
+                </pic:pic>
+              </a:graphicData>
+            </a:graphic>
+          </wp:inline>
+        </w:drawing>
+      </w:r>
+    </w:p>
+    <w:p>
+      <w:pPr>
+        <w:pStyle w:val="900"/>
+        <w:pBdr/>
+        <w:spacing w:after="120" w:before="60"/>
+        <w:ind w:left="0"/>
+        <w:jc w:val="center"/>
+        <w:rPr/>
+      </w:pPr>
+      <w:r>
+        <w:rPr>
+          <w:rFonts w:ascii="Times New Roman" w:hAnsi="Times New Roman" w:eastAsia="Times New Roman" w:cs="Times New Roman"/>
+          <w:sz w:val="20"/>
+          <w:szCs w:val="20"/>
+        </w:rPr>
+        <w:t xml:space="preserve">Fig. 4. Share of transfer failures assigned to each diagnostic label, by task and encoder.</w:t>
+      </w:r>
+    </w:p>
+    <w:p>
+      <w:pPr>
+        <w:pStyle w:val="900"/>
         <w:pBdr/>
         <w:spacing/>
         <w:ind w:firstLine="288" w:left="0"/>
@@ -14254,11 +14546,84 @@
           <w:szCs w:val="24"/>
         </w:rPr>
       </w:r>
+      <w:r>
+        <w:rPr>
+          <w:rFonts w:ascii="Times New Roman" w:hAnsi="Times New Roman" w:eastAsia="Times New Roman" w:cs="Times New Roman"/>
+          <w:sz w:val="24"/>
+          <w:szCs w:val="24"/>
+        </w:rPr>
+        <w:t xml:space="preserve"> Fig. 5 shows why: the failure and both-correct distributions largely overlap, with only 3.7–8.3% of failures above the null threshold.</w:t>
+      </w:r>
       <w:r/>
     </w:p>
     <w:p>
       <w:pPr>
         <w:pStyle w:val="900"/>
+        <w:keepNext w:val="true"/>
+        <w:pBdr/>
+        <w:spacing w:after="60" w:before="120"/>
+        <w:ind w:left="0"/>
+        <w:jc w:val="center"/>
+        <w:rPr/>
+      </w:pPr>
+      <w:r>
+        <w:drawing>
+          <wp:inline distT="0" distB="0" distL="0" distR="0">
+            <wp:extent cx="5486400" cy="3405351"/>
+            <wp:docPr id="905" name="Figure 5" descr="Histograms of salience shift for failures and the both-correct null"/>
+            <wp:cNvGraphicFramePr>
+              <a:graphicFrameLocks noChangeAspect="1"/>
+            </wp:cNvGraphicFramePr>
+            <a:graphic>
+              <a:graphicData uri="http://schemas.openxmlformats.org/drawingml/2006/picture">
+                <pic:pic xmlns:pic="http://schemas.openxmlformats.org/drawingml/2006/picture">
+                  <pic:nvPicPr>
+                    <pic:cNvPr id="905" name="fig5.png"/>
+                    <pic:cNvPicPr/>
+                  </pic:nvPicPr>
+                  <pic:blipFill>
+                    <a:blip r:embed="rIdFig5"/>
+                    <a:stretch>
+                      <a:fillRect/>
+                    </a:stretch>
+                  </pic:blipFill>
+                  <pic:spPr>
+                    <a:xfrm>
+                      <a:off x="0" y="0"/>
+                      <a:ext cx="5486400" cy="3405351"/>
+                    </a:xfrm>
+                    <a:prstGeom prst="rect">
+                      <a:avLst/>
+                    </a:prstGeom>
+                  </pic:spPr>
+                </pic:pic>
+              </a:graphicData>
+            </a:graphic>
+          </wp:inline>
+        </w:drawing>
+      </w:r>
+    </w:p>
+    <w:p>
+      <w:pPr>
+        <w:pStyle w:val="900"/>
+        <w:pBdr/>
+        <w:spacing w:after="120" w:before="60"/>
+        <w:ind w:left="0"/>
+        <w:jc w:val="center"/>
+        <w:rPr/>
+      </w:pPr>
+      <w:r>
+        <w:rPr>
+          <w:rFonts w:ascii="Times New Roman" w:hAnsi="Times New Roman" w:eastAsia="Times New Roman" w:cs="Times New Roman"/>
+          <w:sz w:val="20"/>
+          <w:szCs w:val="20"/>
+        </w:rPr>
+        <w:t xml:space="preserve">Fig. 5. Terminology gap: integrated-gradients salience shift on failures against the both-correct null. The dashed line is the null 95th percentile.</w:t>
+      </w:r>
+    </w:p>
+    <w:p>
+      <w:pPr>
+        <w:pStyle w:val="900"/>
         <w:pBdr/>
         <w:spacing/>
         <w:ind w:firstLine="288" w:left="0"/>
@@ -14351,7 +14716,80 @@
           <w:szCs w:val="24"/>
         </w:rPr>
       </w:r>
+      <w:r>
+        <w:rPr>
+          <w:rFonts w:ascii="Times New Roman" w:hAnsi="Times New Roman" w:eastAsia="Times New Roman" w:cs="Times New Roman"/>
+          <w:sz w:val="24"/>
+          <w:szCs w:val="24"/>
+        </w:rPr>
+        <w:t xml:space="preserve"> Fig. 6 shows the group shares for each direction.</w:t>
+      </w:r>
       <w:r/>
+    </w:p>
+    <w:p>
+      <w:pPr>
+        <w:pStyle w:val="900"/>
+        <w:keepNext w:val="true"/>
+        <w:pBdr/>
+        <w:spacing w:after="60" w:before="120"/>
+        <w:ind w:left="0"/>
+        <w:jc w:val="center"/>
+        <w:rPr/>
+      </w:pPr>
+      <w:r>
+        <w:drawing>
+          <wp:inline distT="0" distB="0" distL="0" distR="0">
+            <wp:extent cx="5943600" cy="2194132"/>
+            <wp:docPr id="906" name="Figure 6" descr="Heatmaps of label group share by transfer direction"/>
+            <wp:cNvGraphicFramePr>
+              <a:graphicFrameLocks noChangeAspect="1"/>
+            </wp:cNvGraphicFramePr>
+            <a:graphic>
+              <a:graphicData uri="http://schemas.openxmlformats.org/drawingml/2006/picture">
+                <pic:pic xmlns:pic="http://schemas.openxmlformats.org/drawingml/2006/picture">
+                  <pic:nvPicPr>
+                    <pic:cNvPr id="906" name="fig6.png"/>
+                    <pic:cNvPicPr/>
+                  </pic:nvPicPr>
+                  <pic:blipFill>
+                    <a:blip r:embed="rIdFig6"/>
+                    <a:stretch>
+                      <a:fillRect/>
+                    </a:stretch>
+                  </pic:blipFill>
+                  <pic:spPr>
+                    <a:xfrm>
+                      <a:off x="0" y="0"/>
+                      <a:ext cx="5943600" cy="2194132"/>
+                    </a:xfrm>
+                    <a:prstGeom prst="rect">
+                      <a:avLst/>
+                    </a:prstGeom>
+                  </pic:spPr>
+                </pic:pic>
+              </a:graphicData>
+            </a:graphic>
+          </wp:inline>
+        </w:drawing>
+      </w:r>
+    </w:p>
+    <w:p>
+      <w:pPr>
+        <w:pStyle w:val="900"/>
+        <w:pBdr/>
+        <w:spacing w:after="120" w:before="60"/>
+        <w:ind w:left="0"/>
+        <w:jc w:val="center"/>
+        <w:rPr/>
+      </w:pPr>
+      <w:r>
+        <w:rPr>
+          <w:rFonts w:ascii="Times New Roman" w:hAnsi="Times New Roman" w:eastAsia="Times New Roman" w:cs="Times New Roman"/>
+          <w:sz w:val="20"/>
+          <w:szCs w:val="20"/>
+        </w:rPr>
+        <w:t xml:space="preserve">Fig. 6. Share of failures in each label group by transfer direction (%); native and MT targets pooled.</w:t>
+      </w:r>
     </w:p>
     <w:p>
       <w:pPr>

</xml_diff>